<commit_message>
Fix supabase sync and RLS policies
</commit_message>
<xml_diff>
--- a/Projet Application Papeterie walikale to world.docx
+++ b/Projet Application Papeterie walikale to world.docx
@@ -4,15 +4,7 @@
   <w:body>
     <w:p>
       <w:r>
-        <w:t xml:space="preserve">Projet Papeterie </w:t>
-      </w:r>
-      <w:proofErr w:type="spellStart"/>
-      <w:r>
-        <w:t>walikale</w:t>
-      </w:r>
-      <w:proofErr w:type="spellEnd"/>
-      <w:r>
-        <w:t xml:space="preserve"> to world</w:t>
+        <w:t>Projet Papeterie walikale to world</w:t>
       </w:r>
     </w:p>
     <w:p>
@@ -29,13 +21,8 @@
         </w:numPr>
       </w:pPr>
       <w:r>
-        <w:t xml:space="preserve">Gestion vente papeterie y compris les </w:t>
-      </w:r>
-      <w:proofErr w:type="spellStart"/>
-      <w:r>
-        <w:t>depenses</w:t>
-      </w:r>
-      <w:proofErr w:type="spellEnd"/>
+        <w:t>Gestion vente papeterie y compris les depenses</w:t>
+      </w:r>
     </w:p>
     <w:p>
       <w:pPr>
@@ -46,13 +33,8 @@
         </w:numPr>
       </w:pPr>
       <w:r>
-        <w:t>Gestion du personnel (les salaires, primes</w:t>
-      </w:r>
-      <w:proofErr w:type="gramStart"/>
-      <w:r>
-        <w:t>)..</w:t>
-      </w:r>
-      <w:proofErr w:type="gramEnd"/>
+        <w:t>Gestion du personnel (les salaires, primes)..</w:t>
+      </w:r>
     </w:p>
     <w:p>
       <w:pPr>
@@ -62,15 +44,7 @@
         <w:t xml:space="preserve">L’application doit être en ligne pour permettre le suivi à distance, </w:t>
       </w:r>
       <w:r>
-        <w:t xml:space="preserve">mais aussi fonctionne en hors ligne aussi et synchronise une fois </w:t>
-      </w:r>
-      <w:proofErr w:type="gramStart"/>
-      <w:r>
-        <w:t>connecté</w:t>
-      </w:r>
-      <w:proofErr w:type="gramEnd"/>
-      <w:r>
-        <w:t xml:space="preserve"> à internet. </w:t>
+        <w:t xml:space="preserve">mais aussi fonctionne en hors ligne aussi et synchronise une fois connecté à internet. </w:t>
       </w:r>
     </w:p>
     <w:p>
@@ -112,41 +86,13 @@
         <w:rPr>
           <w:highlight w:val="yellow"/>
         </w:rPr>
-        <w:t xml:space="preserve">Ceux qui modifie en local puisse avoir la possibilité de travailler </w:t>
-      </w:r>
-      <w:proofErr w:type="spellStart"/>
-      <w:r>
-        <w:rPr>
-          <w:highlight w:val="yellow"/>
-        </w:rPr>
-        <w:t>meme</w:t>
-      </w:r>
-      <w:proofErr w:type="spellEnd"/>
-      <w:r>
-        <w:rPr>
-          <w:highlight w:val="yellow"/>
-        </w:rPr>
-        <w:t xml:space="preserve"> sans internet et synchroniser en cliquant sur le bouton synchroniser a</w:t>
-      </w:r>
-      <w:r>
-        <w:rPr>
-          <w:highlight w:val="yellow"/>
-        </w:rPr>
-        <w:t xml:space="preserve">fin que cela puisse pusher vers </w:t>
-      </w:r>
-      <w:proofErr w:type="spellStart"/>
-      <w:r>
-        <w:rPr>
-          <w:highlight w:val="yellow"/>
-        </w:rPr>
-        <w:t>supabase</w:t>
-      </w:r>
-      <w:proofErr w:type="spellEnd"/>
-      <w:r>
-        <w:rPr>
-          <w:highlight w:val="yellow"/>
-        </w:rPr>
-        <w:t>.</w:t>
+        <w:t>Ceux qui modifie en local puisse avoir la possibilité de travailler meme sans internet et synchroniser en cliquant sur le bouton synchroniser a</w:t>
+      </w:r>
+      <w:r>
+        <w:rPr>
+          <w:highlight w:val="yellow"/>
+        </w:rPr>
+        <w:t>fin que cela puisse pusher vers supabase.</w:t>
       </w:r>
       <w:r>
         <w:t xml:space="preserve"> </w:t>
@@ -197,21 +143,7 @@
         <w:rPr>
           <w:highlight w:val="yellow"/>
         </w:rPr>
-        <w:t xml:space="preserve">a </w:t>
-      </w:r>
-      <w:proofErr w:type="spellStart"/>
-      <w:r>
-        <w:rPr>
-          <w:highlight w:val="yellow"/>
-        </w:rPr>
-        <w:t>fenetre</w:t>
-      </w:r>
-      <w:proofErr w:type="spellEnd"/>
-      <w:r>
-        <w:rPr>
-          <w:highlight w:val="yellow"/>
-        </w:rPr>
-        <w:t xml:space="preserve"> d’approvisionnement</w:t>
+        <w:t>a fenetre d’approvisionnement</w:t>
       </w:r>
       <w:r>
         <w:rPr>
@@ -247,21 +179,7 @@
         <w:rPr>
           <w:highlight w:val="yellow"/>
         </w:rPr>
-        <w:t xml:space="preserve">Historique d’approvisionnement (pour avoir une trace de </w:t>
-      </w:r>
-      <w:proofErr w:type="gramStart"/>
-      <w:r>
-        <w:rPr>
-          <w:highlight w:val="yellow"/>
-        </w:rPr>
-        <w:t>tous les approvisionnement</w:t>
-      </w:r>
-      <w:proofErr w:type="gramEnd"/>
-      <w:r>
-        <w:rPr>
-          <w:highlight w:val="yellow"/>
-        </w:rPr>
-        <w:t xml:space="preserve"> fait)</w:t>
+        <w:t>Historique d’approvisionnement (pour avoir une trace de tous les approvisionnement fait)</w:t>
       </w:r>
     </w:p>
     <w:p>
@@ -279,64 +197,20 @@
         <w:rPr>
           <w:highlight w:val="yellow"/>
         </w:rPr>
-        <w:t xml:space="preserve">Enlever les 00 </w:t>
-      </w:r>
-      <w:proofErr w:type="spellStart"/>
-      <w:r>
-        <w:rPr>
-          <w:highlight w:val="yellow"/>
-        </w:rPr>
-        <w:t>apres</w:t>
-      </w:r>
-      <w:proofErr w:type="spellEnd"/>
-      <w:r>
-        <w:rPr>
-          <w:highlight w:val="yellow"/>
-        </w:rPr>
-        <w:t xml:space="preserve"> le chiffre, par exemple pour </w:t>
-      </w:r>
-      <w:proofErr w:type="gramStart"/>
-      <w:r>
-        <w:rPr>
-          <w:highlight w:val="yellow"/>
-        </w:rPr>
-        <w:t>une produit vendu</w:t>
-      </w:r>
-      <w:proofErr w:type="gramEnd"/>
-      <w:r>
-        <w:rPr>
-          <w:highlight w:val="yellow"/>
-        </w:rPr>
-        <w:t xml:space="preserve"> à 500fc, mettez seulement 500FC et 500.00FC. </w:t>
-      </w:r>
-      <w:proofErr w:type="gramStart"/>
-      <w:r>
-        <w:rPr>
-          <w:highlight w:val="yellow"/>
-        </w:rPr>
-        <w:t>aussi</w:t>
-      </w:r>
-      <w:proofErr w:type="gramEnd"/>
-      <w:r>
-        <w:rPr>
-          <w:highlight w:val="yellow"/>
-        </w:rPr>
-        <w:t xml:space="preserve"> la quantité d’approvisionnement, laissez la case vide et ne mettez pas 0 </w:t>
-      </w:r>
-      <w:r>
-        <w:rPr>
-          <w:highlight w:val="yellow"/>
-        </w:rPr>
-        <w:t xml:space="preserve">au </w:t>
-      </w:r>
-      <w:proofErr w:type="spellStart"/>
-      <w:r>
-        <w:rPr>
-          <w:highlight w:val="yellow"/>
-        </w:rPr>
-        <w:t>prealable</w:t>
-      </w:r>
-      <w:proofErr w:type="spellEnd"/>
+        <w:t>Enlever les 00 apres le chiffre, par exemple pour une produit vendu</w:t>
+      </w:r>
+      <w:r>
+        <w:rPr>
+          <w:highlight w:val="yellow"/>
+        </w:rPr>
+        <w:t xml:space="preserve"> à 500fc, mettez seulement 500FC et 500.00FC. aussi la quantité d’approvisionnement, laissez la case vide et ne mettez pas 0 </w:t>
+      </w:r>
+      <w:r>
+        <w:rPr>
+          <w:highlight w:val="yellow"/>
+        </w:rPr>
+        <w:t>au prealable</w:t>
+      </w:r>
       <w:r>
         <w:rPr>
           <w:highlight w:val="yellow"/>
@@ -395,21 +269,7 @@
         <w:rPr>
           <w:highlight w:val="yellow"/>
         </w:rPr>
-        <w:t xml:space="preserve">Dans la table produit, mettre cette </w:t>
-      </w:r>
-      <w:proofErr w:type="spellStart"/>
-      <w:r>
-        <w:rPr>
-          <w:highlight w:val="yellow"/>
-        </w:rPr>
-        <w:t>fenetre</w:t>
-      </w:r>
-      <w:proofErr w:type="spellEnd"/>
-      <w:r>
-        <w:rPr>
-          <w:highlight w:val="yellow"/>
-        </w:rPr>
-        <w:t xml:space="preserve"> comme le formulaire d’approvisionnement, </w:t>
+        <w:t xml:space="preserve">Dans la table produit, mettre cette fenetre comme le formulaire d’approvisionnement, </w:t>
       </w:r>
     </w:p>
     <w:p>
@@ -427,123 +287,25 @@
         <w:rPr>
           <w:highlight w:val="yellow"/>
         </w:rPr>
-        <w:t xml:space="preserve">La </w:t>
-      </w:r>
-      <w:proofErr w:type="spellStart"/>
-      <w:r>
-        <w:rPr>
-          <w:highlight w:val="yellow"/>
-        </w:rPr>
-        <w:t>fenetre</w:t>
-      </w:r>
-      <w:proofErr w:type="spellEnd"/>
-      <w:r>
-        <w:rPr>
-          <w:highlight w:val="yellow"/>
-        </w:rPr>
-        <w:t xml:space="preserve"> de </w:t>
-      </w:r>
-      <w:proofErr w:type="spellStart"/>
-      <w:r>
-        <w:rPr>
-          <w:highlight w:val="yellow"/>
-        </w:rPr>
-        <w:t>depenses</w:t>
-      </w:r>
-      <w:proofErr w:type="spellEnd"/>
-      <w:r>
-        <w:rPr>
-          <w:highlight w:val="yellow"/>
-        </w:rPr>
-        <w:t xml:space="preserve"> engagées</w:t>
-      </w:r>
-      <w:r>
-        <w:rPr>
-          <w:highlight w:val="yellow"/>
-        </w:rPr>
-        <w:t xml:space="preserve"> (elle doit avoir le </w:t>
-      </w:r>
-      <w:proofErr w:type="spellStart"/>
-      <w:r>
-        <w:rPr>
-          <w:highlight w:val="yellow"/>
-        </w:rPr>
-        <w:t>detail</w:t>
-      </w:r>
-      <w:proofErr w:type="spellEnd"/>
-      <w:r>
-        <w:rPr>
-          <w:highlight w:val="yellow"/>
-        </w:rPr>
-        <w:t xml:space="preserve">, nature de la </w:t>
-      </w:r>
-      <w:proofErr w:type="spellStart"/>
-      <w:r>
-        <w:rPr>
-          <w:highlight w:val="yellow"/>
-        </w:rPr>
-        <w:t>depense</w:t>
-      </w:r>
-      <w:proofErr w:type="spellEnd"/>
-      <w:r>
-        <w:rPr>
-          <w:highlight w:val="yellow"/>
-        </w:rPr>
-        <w:t>, montant, date,</w:t>
-      </w:r>
-      <w:r>
-        <w:rPr>
-          <w:highlight w:val="yellow"/>
-        </w:rPr>
-        <w:t xml:space="preserve"> </w:t>
-      </w:r>
-      <w:proofErr w:type="gramStart"/>
-      <w:r>
-        <w:rPr>
-          <w:highlight w:val="yellow"/>
-        </w:rPr>
-        <w:t>quelle utilisateur</w:t>
-      </w:r>
-      <w:proofErr w:type="gramEnd"/>
-      <w:r>
-        <w:rPr>
-          <w:highlight w:val="yellow"/>
-        </w:rPr>
-        <w:t xml:space="preserve">, qui a approuvé le </w:t>
-      </w:r>
-      <w:proofErr w:type="spellStart"/>
-      <w:r>
-        <w:rPr>
-          <w:highlight w:val="yellow"/>
-        </w:rPr>
-        <w:t>decaissement</w:t>
-      </w:r>
-      <w:proofErr w:type="spellEnd"/>
-      <w:r>
-        <w:rPr>
-          <w:highlight w:val="yellow"/>
-        </w:rPr>
-        <w:t xml:space="preserve"> de l’argent</w:t>
-      </w:r>
-      <w:r>
-        <w:rPr>
-          <w:highlight w:val="yellow"/>
-        </w:rPr>
-        <w:t xml:space="preserve">, la </w:t>
-      </w:r>
-      <w:proofErr w:type="spellStart"/>
-      <w:r>
-        <w:rPr>
-          <w:highlight w:val="yellow"/>
-        </w:rPr>
-        <w:t>depense</w:t>
-      </w:r>
-      <w:proofErr w:type="spellEnd"/>
-      <w:r>
-        <w:rPr>
-          <w:highlight w:val="yellow"/>
-        </w:rPr>
-        <w:t xml:space="preserve"> va servir à quoi</w:t>
+        <w:t>La fenetre de depenses engagées</w:t>
+      </w:r>
+      <w:r>
+        <w:rPr>
+          <w:highlight w:val="yellow"/>
+        </w:rPr>
+        <w:t xml:space="preserve"> (elle doit avoir le detail, nature de la depense, montant, date,</w:t>
+      </w:r>
+      <w:r>
+        <w:rPr>
+          <w:highlight w:val="yellow"/>
+        </w:rPr>
+        <w:t xml:space="preserve"> quelle utilisateur, qui a approuvé le decaissement de l’argent</w:t>
+      </w:r>
+      <w:r>
+        <w:rPr>
+          <w:highlight w:val="yellow"/>
+        </w:rPr>
+        <w:t>, la depense va servir à quoi</w:t>
       </w:r>
       <w:r>
         <w:rPr>
@@ -555,21 +317,7 @@
         <w:rPr>
           <w:highlight w:val="yellow"/>
         </w:rPr>
-        <w:t xml:space="preserve">puisse avoir un </w:t>
-      </w:r>
-      <w:proofErr w:type="spellStart"/>
-      <w:r>
-        <w:rPr>
-          <w:highlight w:val="yellow"/>
-        </w:rPr>
-        <w:t>impacte</w:t>
-      </w:r>
-      <w:proofErr w:type="spellEnd"/>
-      <w:r>
-        <w:rPr>
-          <w:highlight w:val="yellow"/>
-        </w:rPr>
-        <w:t xml:space="preserve"> déjà sur le montant vendu. </w:t>
+        <w:t xml:space="preserve">puisse avoir un impacte déjà sur le montant vendu. </w:t>
       </w:r>
     </w:p>
     <w:p>
@@ -587,41 +335,13 @@
         <w:rPr>
           <w:highlight w:val="yellow"/>
         </w:rPr>
-        <w:t xml:space="preserve">Une possibilité d’avoir des graphiques </w:t>
-      </w:r>
-      <w:proofErr w:type="spellStart"/>
-      <w:r>
-        <w:rPr>
-          <w:highlight w:val="yellow"/>
-        </w:rPr>
-        <w:t>triable</w:t>
-      </w:r>
-      <w:proofErr w:type="spellEnd"/>
-      <w:r>
-        <w:rPr>
-          <w:highlight w:val="yellow"/>
-        </w:rPr>
-        <w:t xml:space="preserve"> par date juste pour savoir combien j’ai fait entrer</w:t>
-      </w:r>
-      <w:r>
-        <w:rPr>
-          <w:highlight w:val="yellow"/>
-        </w:rPr>
-        <w:t xml:space="preserve"> pendant telle </w:t>
-      </w:r>
-      <w:proofErr w:type="spellStart"/>
-      <w:r>
-        <w:rPr>
-          <w:highlight w:val="yellow"/>
-        </w:rPr>
-        <w:t>periode</w:t>
-      </w:r>
-      <w:proofErr w:type="spellEnd"/>
-      <w:r>
-        <w:rPr>
-          <w:highlight w:val="yellow"/>
-        </w:rPr>
-        <w:t>.</w:t>
+        <w:t>Une possibilité d’avoir des graphiques triable par date juste pour savoir combien j’ai fait entrer</w:t>
+      </w:r>
+      <w:r>
+        <w:rPr>
+          <w:highlight w:val="yellow"/>
+        </w:rPr>
+        <w:t xml:space="preserve"> pendant telle periode.</w:t>
       </w:r>
     </w:p>
     <w:p>
@@ -639,173 +359,31 @@
         <w:rPr>
           <w:highlight w:val="yellow"/>
         </w:rPr>
-        <w:t xml:space="preserve">Dans la </w:t>
-      </w:r>
-      <w:proofErr w:type="spellStart"/>
-      <w:r>
-        <w:rPr>
-          <w:highlight w:val="yellow"/>
-        </w:rPr>
-        <w:t>fenetre</w:t>
-      </w:r>
-      <w:proofErr w:type="spellEnd"/>
-      <w:r>
-        <w:rPr>
-          <w:highlight w:val="yellow"/>
-        </w:rPr>
-        <w:t xml:space="preserve"> </w:t>
-      </w:r>
-      <w:proofErr w:type="spellStart"/>
-      <w:r>
-        <w:rPr>
-          <w:highlight w:val="yellow"/>
-        </w:rPr>
-        <w:t>depense</w:t>
-      </w:r>
-      <w:proofErr w:type="spellEnd"/>
-      <w:r>
-        <w:rPr>
-          <w:highlight w:val="yellow"/>
-        </w:rPr>
-        <w:t xml:space="preserve"> qu’il ait un bouton qui </w:t>
-      </w:r>
-      <w:proofErr w:type="spellStart"/>
-      <w:r>
-        <w:rPr>
-          <w:highlight w:val="yellow"/>
-        </w:rPr>
-        <w:t>genere</w:t>
-      </w:r>
-      <w:proofErr w:type="spellEnd"/>
-      <w:r>
-        <w:rPr>
-          <w:highlight w:val="yellow"/>
-        </w:rPr>
-        <w:t xml:space="preserve"> le rapport complet, combine de vente</w:t>
-      </w:r>
-      <w:r>
-        <w:rPr>
-          <w:highlight w:val="yellow"/>
-        </w:rPr>
-        <w:t xml:space="preserve"> par chaque produit, service fait, quelle </w:t>
-      </w:r>
-      <w:proofErr w:type="spellStart"/>
-      <w:r>
-        <w:rPr>
-          <w:highlight w:val="yellow"/>
-        </w:rPr>
-        <w:t>depense</w:t>
-      </w:r>
-      <w:proofErr w:type="spellEnd"/>
-      <w:r>
-        <w:rPr>
-          <w:highlight w:val="yellow"/>
-        </w:rPr>
-        <w:t xml:space="preserve"> avec ses </w:t>
-      </w:r>
-      <w:proofErr w:type="spellStart"/>
-      <w:r>
-        <w:rPr>
-          <w:highlight w:val="yellow"/>
-        </w:rPr>
-        <w:t>details</w:t>
-      </w:r>
-      <w:proofErr w:type="spellEnd"/>
-      <w:r>
-        <w:rPr>
-          <w:highlight w:val="yellow"/>
-        </w:rPr>
-        <w:t>, et le solde</w:t>
-      </w:r>
-      <w:r>
-        <w:rPr>
-          <w:highlight w:val="yellow"/>
-        </w:rPr>
-        <w:t xml:space="preserve"> </w:t>
-      </w:r>
-      <w:proofErr w:type="spellStart"/>
-      <w:r>
-        <w:rPr>
-          <w:highlight w:val="yellow"/>
-        </w:rPr>
-        <w:t>apres</w:t>
-      </w:r>
-      <w:proofErr w:type="spellEnd"/>
-      <w:r>
-        <w:rPr>
-          <w:highlight w:val="yellow"/>
-        </w:rPr>
-        <w:t xml:space="preserve"> toutes les </w:t>
-      </w:r>
-      <w:proofErr w:type="spellStart"/>
-      <w:r>
-        <w:rPr>
-          <w:highlight w:val="yellow"/>
-        </w:rPr>
-        <w:t>depenses</w:t>
-      </w:r>
-      <w:proofErr w:type="spellEnd"/>
+        <w:t>Dans la fenetre depense qu’il ait un bouton qui genere le rapport complet, combine de vente</w:t>
+      </w:r>
+      <w:r>
+        <w:rPr>
+          <w:highlight w:val="yellow"/>
+        </w:rPr>
+        <w:t xml:space="preserve"> par chaque produit, service fait, quelle depense avec ses details, et le solde</w:t>
+      </w:r>
+      <w:r>
+        <w:rPr>
+          <w:highlight w:val="yellow"/>
+        </w:rPr>
+        <w:t xml:space="preserve"> apres toutes les depenses</w:t>
+      </w:r>
       <w:r>
         <w:rPr>
           <w:highlight w:val="yellow"/>
         </w:rPr>
         <w:t xml:space="preserve"> faites. </w:t>
       </w:r>
-      <w:proofErr w:type="gramStart"/>
-      <w:r>
-        <w:rPr>
-          <w:highlight w:val="yellow"/>
-        </w:rPr>
-        <w:t>qui</w:t>
-      </w:r>
-      <w:proofErr w:type="gramEnd"/>
-      <w:r>
-        <w:rPr>
-          <w:highlight w:val="yellow"/>
-        </w:rPr>
-        <w:t xml:space="preserve"> montre toutes les actions faites (saisie impression, photocopie, scan, autre, vente fourniture, connexion internet, vente eau </w:t>
-      </w:r>
-      <w:proofErr w:type="gramStart"/>
-      <w:r>
-        <w:rPr>
-          <w:highlight w:val="yellow"/>
-        </w:rPr>
-        <w:t>pure….</w:t>
-      </w:r>
-      <w:proofErr w:type="gramEnd"/>
-      <w:r>
-        <w:rPr>
-          <w:highlight w:val="yellow"/>
-        </w:rPr>
-        <w:t xml:space="preserve">) et que cela </w:t>
-      </w:r>
-      <w:proofErr w:type="spellStart"/>
-      <w:r>
-        <w:rPr>
-          <w:highlight w:val="yellow"/>
-        </w:rPr>
-        <w:t>cree</w:t>
-      </w:r>
-      <w:proofErr w:type="spellEnd"/>
-      <w:r>
-        <w:rPr>
-          <w:highlight w:val="yellow"/>
-        </w:rPr>
-        <w:t xml:space="preserve"> un total par service, si c’est saisie impression combien ? si c’est internet combien</w:t>
-      </w:r>
-      <w:proofErr w:type="gramStart"/>
-      <w:r>
-        <w:rPr>
-          <w:highlight w:val="yellow"/>
-        </w:rPr>
-        <w:t> ?...</w:t>
-      </w:r>
-      <w:proofErr w:type="gramEnd"/>
-      <w:r>
-        <w:rPr>
-          <w:highlight w:val="yellow"/>
-        </w:rPr>
-        <w:t xml:space="preserve">, </w:t>
+      <w:r>
+        <w:rPr>
+          <w:highlight w:val="yellow"/>
+        </w:rPr>
+        <w:t xml:space="preserve">qui montre toutes les actions faites (saisie impression, photocopie, scan, autre, vente fourniture, connexion internet, vente eau pure….) et que cela cree un total par service, si c’est saisie impression combien ? si c’est internet combien ?..., </w:t>
       </w:r>
     </w:p>
     <w:p>
@@ -823,24 +401,28 @@
     <w:p>
       <w:pPr>
         <w:pStyle w:val="Paragraphedeliste"/>
-      </w:pPr>
-    </w:p>
-    <w:p>
-      <w:r>
-        <w:t xml:space="preserve">Affichage de </w:t>
-      </w:r>
-      <w:proofErr w:type="spellStart"/>
-      <w:r>
-        <w:t>fenetre</w:t>
-      </w:r>
-      <w:proofErr w:type="spellEnd"/>
-      <w:r>
-        <w:t xml:space="preserve"> par profil :</w:t>
+        <w:numPr>
+          <w:ilvl w:val="0"/>
+          <w:numId w:val="1"/>
+        </w:numPr>
+      </w:pPr>
+      <w:r>
+        <w:t>Dans la table historique approvisionnement je voulais savoir aussi l’utilisateur qui a faire la reappro</w:t>
       </w:r>
     </w:p>
     <w:p>
       <w:pPr>
         <w:pStyle w:val="Paragraphedeliste"/>
+      </w:pPr>
+    </w:p>
+    <w:p>
+      <w:r>
+        <w:t>Affichage de fenetre par profil :</w:t>
+      </w:r>
+    </w:p>
+    <w:p>
+      <w:pPr>
+        <w:pStyle w:val="Paragraphedeliste"/>
         <w:numPr>
           <w:ilvl w:val="0"/>
           <w:numId w:val="1"/>
@@ -876,54 +458,20 @@
           <w:numId w:val="1"/>
         </w:numPr>
       </w:pPr>
-      <w:proofErr w:type="gramStart"/>
       <w:r>
         <w:t>La tablea</w:t>
       </w:r>
       <w:r>
-        <w:t>u</w:t>
-      </w:r>
-      <w:proofErr w:type="gramEnd"/>
-      <w:r>
-        <w:t xml:space="preserve"> qui montre les </w:t>
-      </w:r>
-      <w:proofErr w:type="spellStart"/>
-      <w:r>
-        <w:t>details</w:t>
-      </w:r>
-      <w:proofErr w:type="spellEnd"/>
-      <w:r>
-        <w:t xml:space="preserve"> de toutes les ventes et services fait durant une </w:t>
-      </w:r>
-      <w:proofErr w:type="spellStart"/>
-      <w:r>
-        <w:t>periode</w:t>
-      </w:r>
-      <w:proofErr w:type="spellEnd"/>
-      <w:r>
-        <w:t xml:space="preserve">, les </w:t>
-      </w:r>
-      <w:proofErr w:type="spellStart"/>
-      <w:r>
-        <w:t>grafiques</w:t>
-      </w:r>
-      <w:proofErr w:type="spellEnd"/>
-      <w:r>
-        <w:t>, les montants donc tous</w:t>
+        <w:t>u qui montre les details de toutes les ventes et services fait durant une periode</w:t>
+      </w:r>
+      <w:r>
+        <w:t>, les grafiques, les montants donc tous</w:t>
       </w:r>
       <w:r>
         <w:t>,</w:t>
       </w:r>
       <w:r>
-        <w:t xml:space="preserve"> ce qu’un simple </w:t>
-      </w:r>
-      <w:proofErr w:type="spellStart"/>
-      <w:r>
-        <w:t>Admnistrateur</w:t>
-      </w:r>
-      <w:proofErr w:type="spellEnd"/>
-      <w:r>
-        <w:t xml:space="preserve"> ne peut pas voir. </w:t>
+        <w:t xml:space="preserve"> ce qu’un simple Admnistrateur ne peut pas voir. </w:t>
       </w:r>
     </w:p>
     <w:p/>
@@ -937,22 +485,8 @@
         </w:numPr>
       </w:pPr>
       <w:r>
-        <w:lastRenderedPageBreak/>
-        <w:t xml:space="preserve">A la fin </w:t>
-      </w:r>
-      <w:proofErr w:type="spellStart"/>
-      <w:r>
-        <w:t>Deployer</w:t>
-      </w:r>
-      <w:proofErr w:type="spellEnd"/>
-      <w:r>
-        <w:t xml:space="preserve"> sur </w:t>
-      </w:r>
-      <w:proofErr w:type="spellStart"/>
-      <w:r>
-        <w:t>Netlify</w:t>
-      </w:r>
-      <w:proofErr w:type="spellEnd"/>
+        <w:t>A la fin Deployer sur Netlify</w:t>
+      </w:r>
     </w:p>
     <w:p>
       <w:pPr>
@@ -978,45 +512,8 @@
         </w:numPr>
         <w:shd w:val="clear" w:color="auto" w:fill="B4C6E7" w:themeFill="accent1" w:themeFillTint="66"/>
       </w:pPr>
-      <w:proofErr w:type="spellStart"/>
-      <w:r>
-        <w:t>supabase-schema.sql</w:t>
-      </w:r>
-      <w:proofErr w:type="spellEnd"/>
-      <w:r>
-        <w:t xml:space="preserve">, </w:t>
-      </w:r>
-      <w:proofErr w:type="spellStart"/>
-      <w:r>
-        <w:t>supabase-auth-migration.sql</w:t>
-      </w:r>
-      <w:proofErr w:type="spellEnd"/>
-      <w:r>
-        <w:t xml:space="preserve">, </w:t>
-      </w:r>
-      <w:proofErr w:type="spellStart"/>
-      <w:r>
-        <w:t>supabase</w:t>
-      </w:r>
-      <w:proofErr w:type="spellEnd"/>
-      <w:r>
-        <w:t>-audit-</w:t>
-      </w:r>
-      <w:proofErr w:type="spellStart"/>
-      <w:r>
-        <w:t>traceability</w:t>
-      </w:r>
-      <w:proofErr w:type="spellEnd"/>
-      <w:r>
-        <w:t>-</w:t>
-      </w:r>
-      <w:proofErr w:type="spellStart"/>
-      <w:r>
-        <w:t>migration.sql</w:t>
-      </w:r>
-      <w:proofErr w:type="spellEnd"/>
-      <w:r>
-        <w:t xml:space="preserve"> exécutés</w:t>
+      <w:r>
+        <w:t>supabase-schema.sql, supabase-auth-migration.sql, supabase-audit-traceability-migration.sql exécutés</w:t>
       </w:r>
     </w:p>
     <w:p>
@@ -1027,63 +524,8 @@
         </w:numPr>
         <w:shd w:val="clear" w:color="auto" w:fill="B4C6E7" w:themeFill="accent1" w:themeFillTint="66"/>
       </w:pPr>
-      <w:proofErr w:type="gramStart"/>
-      <w:r>
-        <w:t>la</w:t>
-      </w:r>
-      <w:proofErr w:type="gramEnd"/>
-      <w:r>
-        <w:t xml:space="preserve"> fonction </w:t>
-      </w:r>
-      <w:proofErr w:type="spellStart"/>
-      <w:r>
-        <w:t>touch_last_</w:t>
-      </w:r>
-      <w:proofErr w:type="gramStart"/>
-      <w:r>
-        <w:t>login</w:t>
-      </w:r>
-      <w:proofErr w:type="spellEnd"/>
-      <w:r>
-        <w:t>(</w:t>
-      </w:r>
-      <w:proofErr w:type="gramEnd"/>
-      <w:r>
-        <w:t xml:space="preserve">) corrigée contient bien </w:t>
-      </w:r>
-      <w:proofErr w:type="spellStart"/>
-      <w:r>
-        <w:t>where</w:t>
-      </w:r>
-      <w:proofErr w:type="spellEnd"/>
-      <w:r>
-        <w:t xml:space="preserve"> </w:t>
-      </w:r>
-      <w:proofErr w:type="spellStart"/>
-      <w:proofErr w:type="gramStart"/>
-      <w:r>
-        <w:t>public.users</w:t>
-      </w:r>
-      <w:proofErr w:type="gramEnd"/>
-      <w:r>
-        <w:t>.auth_user_id</w:t>
-      </w:r>
-      <w:proofErr w:type="spellEnd"/>
-      <w:r>
-        <w:t xml:space="preserve"> = </w:t>
-      </w:r>
-      <w:proofErr w:type="spellStart"/>
-      <w:proofErr w:type="gramStart"/>
-      <w:r>
-        <w:t>auth.uid</w:t>
-      </w:r>
-      <w:proofErr w:type="spellEnd"/>
-      <w:r>
-        <w:t>(</w:t>
-      </w:r>
-      <w:proofErr w:type="gramEnd"/>
-      <w:r>
-        <w:t>)</w:t>
+      <w:r>
+        <w:t>la fonction touch_last_login() corrigée contient bien where public.users.auth_user_id = auth.uid()</w:t>
       </w:r>
     </w:p>
     <w:p>
@@ -1094,37 +536,9 @@
         </w:numPr>
         <w:shd w:val="clear" w:color="auto" w:fill="B4C6E7" w:themeFill="accent1" w:themeFillTint="66"/>
       </w:pPr>
-      <w:proofErr w:type="gramStart"/>
-      <w:r>
-        <w:t>la</w:t>
-      </w:r>
-      <w:proofErr w:type="gramEnd"/>
-      <w:r>
-        <w:t xml:space="preserve"> table </w:t>
-      </w:r>
-      <w:proofErr w:type="spellStart"/>
-      <w:proofErr w:type="gramStart"/>
-      <w:r>
-        <w:t>public.users</w:t>
-      </w:r>
-      <w:proofErr w:type="spellEnd"/>
-      <w:proofErr w:type="gramEnd"/>
-      <w:r>
-        <w:t xml:space="preserve"> contient ton utilisateur avec le même e-mail que dans </w:t>
-      </w:r>
-      <w:proofErr w:type="spellStart"/>
-      <w:r>
-        <w:t>Authentication</w:t>
-      </w:r>
-      <w:proofErr w:type="spellEnd"/>
-      <w:r>
-        <w:t xml:space="preserve"> &gt; </w:t>
-      </w:r>
-      <w:proofErr w:type="spellStart"/>
-      <w:r>
-        <w:t>Users</w:t>
-      </w:r>
-      <w:proofErr w:type="spellEnd"/>
+      <w:r>
+        <w:t>la table public.users contient ton utilisateur avec le même e-mail que dans Authentication &gt; Users</w:t>
+      </w:r>
     </w:p>
     <w:p>
       <w:pPr>
@@ -1134,37 +548,17 @@
         </w:numPr>
         <w:shd w:val="clear" w:color="auto" w:fill="B4C6E7" w:themeFill="accent1" w:themeFillTint="66"/>
       </w:pPr>
-      <w:proofErr w:type="gramStart"/>
-      <w:r>
-        <w:t>ton</w:t>
-      </w:r>
-      <w:proofErr w:type="gramEnd"/>
-      <w:r>
-        <w:t xml:space="preserve"> utilisateur a </w:t>
-      </w:r>
-      <w:proofErr w:type="spellStart"/>
-      <w:r>
-        <w:t>role</w:t>
-      </w:r>
-      <w:proofErr w:type="spellEnd"/>
-      <w:r>
-        <w:t xml:space="preserve"> = 'Super admin' et active = </w:t>
-      </w:r>
-      <w:proofErr w:type="spellStart"/>
-      <w:r>
-        <w:t>true</w:t>
-      </w:r>
-      <w:proofErr w:type="spellEnd"/>
+      <w:r>
+        <w:t>ton utilisateur a role = 'Super admin' et active = true</w:t>
+      </w:r>
     </w:p>
     <w:p>
       <w:pPr>
         <w:shd w:val="clear" w:color="auto" w:fill="B4C6E7" w:themeFill="accent1" w:themeFillTint="66"/>
       </w:pPr>
-      <w:proofErr w:type="spellStart"/>
       <w:r>
         <w:t>Netlify</w:t>
       </w:r>
-      <w:proofErr w:type="spellEnd"/>
     </w:p>
     <w:p>
       <w:pPr>
@@ -1174,21 +568,8 @@
         </w:numPr>
         <w:shd w:val="clear" w:color="auto" w:fill="B4C6E7" w:themeFill="accent1" w:themeFillTint="66"/>
       </w:pPr>
-      <w:proofErr w:type="gramStart"/>
-      <w:r>
-        <w:t>le</w:t>
-      </w:r>
-      <w:proofErr w:type="gramEnd"/>
-      <w:r>
-        <w:t xml:space="preserve"> dernier commit </w:t>
-      </w:r>
-      <w:proofErr w:type="gramStart"/>
-      <w:r>
-        <w:t>poussé</w:t>
-      </w:r>
-      <w:proofErr w:type="gramEnd"/>
-      <w:r>
-        <w:t xml:space="preserve"> sur main apparaît bien sur GitHub</w:t>
+      <w:r>
+        <w:t>le dernier commit poussé sur main apparaît bien sur GitHub</w:t>
       </w:r>
     </w:p>
     <w:p>
@@ -1199,27 +580,9 @@
         </w:numPr>
         <w:shd w:val="clear" w:color="auto" w:fill="B4C6E7" w:themeFill="accent1" w:themeFillTint="66"/>
       </w:pPr>
-      <w:proofErr w:type="gramStart"/>
-      <w:r>
-        <w:t>le</w:t>
-      </w:r>
-      <w:proofErr w:type="gramEnd"/>
-      <w:r>
-        <w:t xml:space="preserve"> déploiement </w:t>
-      </w:r>
-      <w:proofErr w:type="spellStart"/>
-      <w:r>
-        <w:t>Netlify</w:t>
-      </w:r>
-      <w:proofErr w:type="spellEnd"/>
-      <w:r>
-        <w:t xml:space="preserve"> est passé en </w:t>
-      </w:r>
-      <w:proofErr w:type="spellStart"/>
-      <w:r>
-        <w:t>Published</w:t>
-      </w:r>
-      <w:proofErr w:type="spellEnd"/>
+      <w:r>
+        <w:t>le déploiement Netlify est passé en Published</w:t>
+      </w:r>
     </w:p>
     <w:p>
       <w:pPr>
@@ -1229,13 +592,8 @@
         </w:numPr>
         <w:shd w:val="clear" w:color="auto" w:fill="B4C6E7" w:themeFill="accent1" w:themeFillTint="66"/>
       </w:pPr>
-      <w:proofErr w:type="gramStart"/>
-      <w:r>
-        <w:t>les</w:t>
-      </w:r>
-      <w:proofErr w:type="gramEnd"/>
-      <w:r>
-        <w:t xml:space="preserve"> variables VITE_SUPABASE_URL et VITE_SUPABASE_ANON_KEY sont bien configurées</w:t>
+      <w:r>
+        <w:t>les variables VITE_SUPABASE_URL et VITE_SUPABASE_ANON_KEY sont bien configurées</w:t>
       </w:r>
     </w:p>
     <w:p>
@@ -1246,31 +604,16 @@
         </w:numPr>
         <w:shd w:val="clear" w:color="auto" w:fill="B4C6E7" w:themeFill="accent1" w:themeFillTint="66"/>
       </w:pPr>
-      <w:proofErr w:type="gramStart"/>
-      <w:r>
-        <w:t>la</w:t>
-      </w:r>
-      <w:proofErr w:type="gramEnd"/>
-      <w:r>
-        <w:t xml:space="preserve"> connexion web fonctionne avec ton compte </w:t>
-      </w:r>
-      <w:proofErr w:type="spellStart"/>
-      <w:r>
-        <w:t>Supabase</w:t>
-      </w:r>
-      <w:proofErr w:type="spellEnd"/>
+      <w:r>
+        <w:t>la connexion web fonctionne avec ton compte Supabase</w:t>
+      </w:r>
     </w:p>
     <w:p>
       <w:pPr>
         <w:shd w:val="clear" w:color="auto" w:fill="B4C6E7" w:themeFill="accent1" w:themeFillTint="66"/>
       </w:pPr>
-      <w:proofErr w:type="gramStart"/>
-      <w:r>
-        <w:t>desktop</w:t>
-      </w:r>
-      <w:proofErr w:type="gramEnd"/>
-      <w:r>
-        <w:t xml:space="preserve"> .exe</w:t>
+      <w:r>
+        <w:t>desktop .exe</w:t>
       </w:r>
     </w:p>
     <w:p>
@@ -1281,13 +624,8 @@
         </w:numPr>
         <w:shd w:val="clear" w:color="auto" w:fill="B4C6E7" w:themeFill="accent1" w:themeFillTint="66"/>
       </w:pPr>
-      <w:proofErr w:type="gramStart"/>
-      <w:r>
-        <w:t>un</w:t>
-      </w:r>
-      <w:proofErr w:type="gramEnd"/>
-      <w:r>
-        <w:t xml:space="preserve"> nouvel .exe a été reconstruit après les changements</w:t>
+      <w:r>
+        <w:t>un nouvel .exe a été reconstruit après les changements</w:t>
       </w:r>
     </w:p>
     <w:p>
@@ -1298,19 +636,9 @@
         </w:numPr>
         <w:shd w:val="clear" w:color="auto" w:fill="B4C6E7" w:themeFill="accent1" w:themeFillTint="66"/>
       </w:pPr>
-      <w:proofErr w:type="gramStart"/>
-      <w:r>
-        <w:t>avec</w:t>
-      </w:r>
-      <w:proofErr w:type="gramEnd"/>
-      <w:r>
-        <w:t xml:space="preserve"> internet, la connexion desktop fonctionne avec le compte </w:t>
-      </w:r>
-      <w:proofErr w:type="spellStart"/>
-      <w:r>
-        <w:t>Supabase</w:t>
-      </w:r>
-      <w:proofErr w:type="spellEnd"/>
+      <w:r>
+        <w:t>avec internet, la connexion desktop fonctionne avec le compte Supabase</w:t>
+      </w:r>
     </w:p>
     <w:p>
       <w:pPr>
@@ -1320,13 +648,8 @@
         </w:numPr>
         <w:shd w:val="clear" w:color="auto" w:fill="B4C6E7" w:themeFill="accent1" w:themeFillTint="66"/>
       </w:pPr>
-      <w:proofErr w:type="gramStart"/>
-      <w:r>
-        <w:t>après</w:t>
-      </w:r>
-      <w:proofErr w:type="gramEnd"/>
-      <w:r>
-        <w:t xml:space="preserve"> cette première connexion, le même compte peut se reconnecter hors ligne</w:t>
+      <w:r>
+        <w:t>après cette première connexion, le même compte peut se reconnecter hors ligne</w:t>
       </w:r>
     </w:p>
     <w:p>
@@ -1337,21 +660,8 @@
         </w:numPr>
         <w:shd w:val="clear" w:color="auto" w:fill="B4C6E7" w:themeFill="accent1" w:themeFillTint="66"/>
       </w:pPr>
-      <w:proofErr w:type="gramStart"/>
-      <w:r>
-        <w:t>la</w:t>
-      </w:r>
-      <w:proofErr w:type="gramEnd"/>
-      <w:r>
-        <w:t xml:space="preserve"> synchronisation desktop → </w:t>
-      </w:r>
-      <w:proofErr w:type="spellStart"/>
-      <w:r>
-        <w:t>Supabase</w:t>
-      </w:r>
-      <w:proofErr w:type="spellEnd"/>
-      <w:r>
-        <w:t xml:space="preserve"> fonctionne quand la connexion revient</w:t>
+      <w:r>
+        <w:t>la synchronisation desktop → Supabase fonctionne quand la connexion revient</w:t>
       </w:r>
     </w:p>
     <w:p>
@@ -1365,36 +675,12 @@
     <w:p/>
     <w:p>
       <w:r>
-        <w:t xml:space="preserve">Alors la prochaine étape est </w:t>
-      </w:r>
-      <w:proofErr w:type="gramStart"/>
-      <w:r>
-        <w:t>simple:</w:t>
-      </w:r>
-      <w:proofErr w:type="gramEnd"/>
-      <w:r>
-        <w:t xml:space="preserve"> connecter ton dépôt GitHub à </w:t>
-      </w:r>
-      <w:proofErr w:type="spellStart"/>
-      <w:r>
-        <w:t>Netlify</w:t>
-      </w:r>
-      <w:proofErr w:type="spellEnd"/>
-      <w:r>
-        <w:t>.</w:t>
-      </w:r>
-    </w:p>
-    <w:p>
-      <w:r>
-        <w:t xml:space="preserve">Fais ceci dans </w:t>
-      </w:r>
-      <w:proofErr w:type="spellStart"/>
-      <w:r>
-        <w:t>Netlify</w:t>
-      </w:r>
-      <w:proofErr w:type="spellEnd"/>
-      <w:r>
-        <w:t xml:space="preserve"> :</w:t>
+        <w:t>Alors la prochaine étape est simple: connecter ton dépôt GitHub à Netlify.</w:t>
+      </w:r>
+    </w:p>
+    <w:p>
+      <w:r>
+        <w:t>Fais ceci dans Netlify :</w:t>
       </w:r>
     </w:p>
     <w:p>
@@ -1416,21 +702,8 @@
         </w:numPr>
       </w:pPr>
       <w:r>
-        <w:t xml:space="preserve">Import an </w:t>
-      </w:r>
-      <w:proofErr w:type="spellStart"/>
-      <w:r>
-        <w:t>existing</w:t>
-      </w:r>
-      <w:proofErr w:type="spellEnd"/>
-      <w:r>
-        <w:t xml:space="preserve"> </w:t>
-      </w:r>
-      <w:proofErr w:type="spellStart"/>
-      <w:r>
-        <w:t>project</w:t>
-      </w:r>
-      <w:proofErr w:type="spellEnd"/>
+        <w:t>Import an existing project</w:t>
+      </w:r>
     </w:p>
     <w:p>
       <w:pPr>
@@ -1439,13 +712,8 @@
           <w:numId w:val="5"/>
         </w:numPr>
       </w:pPr>
-      <w:proofErr w:type="gramStart"/>
-      <w:r>
-        <w:t>connecte</w:t>
-      </w:r>
-      <w:proofErr w:type="gramEnd"/>
-      <w:r>
-        <w:t xml:space="preserve"> GitHub</w:t>
+      <w:r>
+        <w:t>connecte GitHub</w:t>
       </w:r>
     </w:p>
     <w:p>
@@ -1455,21 +723,8 @@
           <w:numId w:val="5"/>
         </w:numPr>
       </w:pPr>
-      <w:proofErr w:type="gramStart"/>
-      <w:r>
-        <w:t>choisis</w:t>
-      </w:r>
-      <w:proofErr w:type="gramEnd"/>
-      <w:r>
-        <w:t xml:space="preserve"> le dépôt </w:t>
-      </w:r>
-      <w:proofErr w:type="spellStart"/>
-      <w:r>
-        <w:t>walikaletoworldrt</w:t>
-      </w:r>
-      <w:proofErr w:type="spellEnd"/>
-      <w:r>
-        <w:t>-hue/Gestion-papeterie</w:t>
+      <w:r>
+        <w:t>choisis le dépôt walikaletoworldrt-hue/Gestion-papeterie</w:t>
       </w:r>
     </w:p>
     <w:p>
@@ -1479,13 +734,8 @@
           <w:numId w:val="5"/>
         </w:numPr>
       </w:pPr>
-      <w:proofErr w:type="gramStart"/>
-      <w:r>
-        <w:t>vérifie</w:t>
-      </w:r>
-      <w:proofErr w:type="gramEnd"/>
-      <w:r>
-        <w:t xml:space="preserve"> les réglages :</w:t>
+      <w:r>
+        <w:t>vérifie les réglages :</w:t>
       </w:r>
     </w:p>
     <w:p>
@@ -1512,19 +762,9 @@
           <w:numId w:val="5"/>
         </w:numPr>
       </w:pPr>
-      <w:proofErr w:type="spellStart"/>
-      <w:r>
-        <w:t>Publish</w:t>
-      </w:r>
-      <w:proofErr w:type="spellEnd"/>
-      <w:r>
-        <w:t xml:space="preserve"> directory : </w:t>
-      </w:r>
-      <w:proofErr w:type="spellStart"/>
-      <w:r>
-        <w:t>dist</w:t>
-      </w:r>
-      <w:proofErr w:type="spellEnd"/>
+      <w:r>
+        <w:t>Publish directory : dist</w:t>
+      </w:r>
     </w:p>
     <w:p>
       <w:pPr>
@@ -1534,6 +774,7 @@
         </w:numPr>
       </w:pPr>
       <w:r>
+        <w:lastRenderedPageBreak/>
         <w:t>Node version : 20</w:t>
       </w:r>
     </w:p>
@@ -1544,14 +785,8 @@
           <w:numId w:val="5"/>
         </w:numPr>
       </w:pPr>
-      <w:proofErr w:type="gramStart"/>
-      <w:r>
-        <w:lastRenderedPageBreak/>
-        <w:t>ajoute</w:t>
-      </w:r>
-      <w:proofErr w:type="gramEnd"/>
-      <w:r>
-        <w:t xml:space="preserve"> les variables d’environnement :</w:t>
+      <w:r>
+        <w:t>ajoute les variables d’environnement :</w:t>
       </w:r>
     </w:p>
     <w:p>
@@ -1583,13 +818,8 @@
           <w:numId w:val="5"/>
         </w:numPr>
       </w:pPr>
-      <w:proofErr w:type="gramStart"/>
-      <w:r>
-        <w:t>lance</w:t>
-      </w:r>
-      <w:proofErr w:type="gramEnd"/>
-      <w:r>
-        <w:t xml:space="preserve"> le déploiement</w:t>
+      <w:r>
+        <w:t>lance le déploiement</w:t>
       </w:r>
     </w:p>
     <w:p>
@@ -1617,21 +847,8 @@
           <w:numId w:val="6"/>
         </w:numPr>
       </w:pPr>
-      <w:proofErr w:type="gramStart"/>
-      <w:r>
-        <w:t>sur</w:t>
-      </w:r>
-      <w:proofErr w:type="gramEnd"/>
-      <w:r>
-        <w:t xml:space="preserve"> </w:t>
-      </w:r>
-      <w:proofErr w:type="spellStart"/>
-      <w:r>
-        <w:t>Netlify</w:t>
-      </w:r>
-      <w:proofErr w:type="spellEnd"/>
-      <w:r>
-        <w:t>, utilise bien les noms VITE_SUPABASE_URL et VITE_SUPABASE_ANON_KEY</w:t>
+      <w:r>
+        <w:t>sur Netlify, utilise bien les noms VITE_SUPABASE_URL et VITE_SUPABASE_ANON_KEY</w:t>
       </w:r>
     </w:p>
     <w:p>
@@ -1641,13 +858,8 @@
           <w:numId w:val="6"/>
         </w:numPr>
       </w:pPr>
-      <w:proofErr w:type="gramStart"/>
-      <w:r>
-        <w:t>pas</w:t>
-      </w:r>
-      <w:proofErr w:type="gramEnd"/>
-      <w:r>
-        <w:t xml:space="preserve"> NEXT_PUBLIC_*, car ton app est en Vite</w:t>
+      <w:r>
+        <w:t>pas NEXT_PUBLIC_*, car ton app est en Vite</w:t>
       </w:r>
     </w:p>
     <w:p>
@@ -1662,27 +874,9 @@
           <w:numId w:val="7"/>
         </w:numPr>
       </w:pPr>
-      <w:proofErr w:type="gramStart"/>
-      <w:r>
-        <w:t>l’état</w:t>
-      </w:r>
-      <w:proofErr w:type="gramEnd"/>
-      <w:r>
-        <w:t xml:space="preserve"> du </w:t>
-      </w:r>
-      <w:proofErr w:type="spellStart"/>
-      <w:r>
-        <w:t>build</w:t>
-      </w:r>
-      <w:proofErr w:type="spellEnd"/>
-      <w:r>
-        <w:t xml:space="preserve"> </w:t>
-      </w:r>
-      <w:proofErr w:type="spellStart"/>
-      <w:r>
-        <w:t>Netlify</w:t>
-      </w:r>
-      <w:proofErr w:type="spellEnd"/>
+      <w:r>
+        <w:t>l’état du build Netlify</w:t>
+      </w:r>
     </w:p>
     <w:p>
       <w:pPr>
@@ -1691,13 +885,8 @@
           <w:numId w:val="7"/>
         </w:numPr>
       </w:pPr>
-      <w:proofErr w:type="gramStart"/>
-      <w:r>
-        <w:t>et</w:t>
-      </w:r>
-      <w:proofErr w:type="gramEnd"/>
-      <w:r>
-        <w:t xml:space="preserve"> si tu veux, l’URL du site déployé</w:t>
+      <w:r>
+        <w:t>et si tu veux, l’URL du site déployé</w:t>
       </w:r>
     </w:p>
     <w:p>

</xml_diff>

<commit_message>
personnaliser la page d'impression
</commit_message>
<xml_diff>
--- a/Projet Application Papeterie walikale to world.docx
+++ b/Projet Application Papeterie walikale to world.docx
@@ -1,6 +1,6 @@
 
 <file path=word/document.xml><?xml version="1.0" encoding="utf-8"?>
-<w:document xmlns:wpc="http://schemas.microsoft.com/office/word/2010/wordprocessingCanvas" xmlns:cx="http://schemas.microsoft.com/office/drawing/2014/chartex" xmlns:cx1="http://schemas.microsoft.com/office/drawing/2015/9/8/chartex" xmlns:cx2="http://schemas.microsoft.com/office/drawing/2015/10/21/chartex" xmlns:cx3="http://schemas.microsoft.com/office/drawing/2016/5/9/chartex" xmlns:cx4="http://schemas.microsoft.com/office/drawing/2016/5/10/chartex" xmlns:cx5="http://schemas.microsoft.com/office/drawing/2016/5/11/chartex" xmlns:cx6="http://schemas.microsoft.com/office/drawing/2016/5/12/chartex" xmlns:cx7="http://schemas.microsoft.com/office/drawing/2016/5/13/chartex" xmlns:cx8="http://schemas.microsoft.com/office/drawing/2016/5/14/chartex" xmlns:mc="http://schemas.openxmlformats.org/markup-compatibility/2006" xmlns:aink="http://schemas.microsoft.com/office/drawing/2016/ink" xmlns:am3d="http://schemas.microsoft.com/office/drawing/2017/model3d" xmlns:o="urn:schemas-microsoft-com:office:office" xmlns:oel="http://schemas.microsoft.com/office/2019/extlst" xmlns:r="http://schemas.openxmlformats.org/officeDocument/2006/relationships" xmlns:m="http://schemas.openxmlformats.org/officeDocument/2006/math" xmlns:v="urn:schemas-microsoft-com:vml" xmlns:wp14="http://schemas.microsoft.com/office/word/2010/wordprocessingDrawing" xmlns:wp="http://schemas.openxmlformats.org/drawingml/2006/wordprocessingDrawing" xmlns:w10="urn:schemas-microsoft-com:office:word" xmlns:w="http://schemas.openxmlformats.org/wordprocessingml/2006/main" xmlns:w14="http://schemas.microsoft.com/office/word/2010/wordml" xmlns:w15="http://schemas.microsoft.com/office/word/2012/wordml" xmlns:w16cex="http://schemas.microsoft.com/office/word/2018/wordml/cex" xmlns:w16cid="http://schemas.microsoft.com/office/word/2016/wordml/cid" xmlns:w16="http://schemas.microsoft.com/office/word/2018/wordml" xmlns:w16du="http://schemas.microsoft.com/office/word/2023/wordml/word16du" xmlns:w16sdtdh="http://schemas.microsoft.com/office/word/2020/wordml/sdtdatahash" xmlns:w16sdtfl="http://schemas.microsoft.com/office/word/2024/wordml/sdtformatlock" xmlns:w16se="http://schemas.microsoft.com/office/word/2015/wordml/symex" xmlns:wpg="http://schemas.microsoft.com/office/word/2010/wordprocessingGroup" xmlns:wpi="http://schemas.microsoft.com/office/word/2010/wordprocessingInk" xmlns:wne="http://schemas.microsoft.com/office/word/2006/wordml" xmlns:wps="http://schemas.microsoft.com/office/word/2010/wordprocessingShape" mc:Ignorable="w14 w15 w16se w16cid w16 w16cex w16sdtdh w16sdtfl w16du wp14">
+<w:document xmlns:wpc="http://schemas.microsoft.com/office/word/2010/wordprocessingCanvas" xmlns:cx="http://schemas.microsoft.com/office/drawing/2014/chartex" xmlns:cx1="http://schemas.microsoft.com/office/drawing/2015/9/8/chartex" xmlns:cx2="http://schemas.microsoft.com/office/drawing/2015/10/21/chartex" xmlns:cx3="http://schemas.microsoft.com/office/drawing/2016/5/9/chartex" xmlns:cx4="http://schemas.microsoft.com/office/drawing/2016/5/10/chartex" xmlns:cx5="http://schemas.microsoft.com/office/drawing/2016/5/11/chartex" xmlns:cx6="http://schemas.microsoft.com/office/drawing/2016/5/12/chartex" xmlns:cx7="http://schemas.microsoft.com/office/drawing/2016/5/13/chartex" xmlns:cx8="http://schemas.microsoft.com/office/drawing/2016/5/14/chartex" xmlns:mc="http://schemas.openxmlformats.org/markup-compatibility/2006" xmlns:aink="http://schemas.microsoft.com/office/drawing/2016/ink" xmlns:am3d="http://schemas.microsoft.com/office/drawing/2017/model3d" xmlns:o="urn:schemas-microsoft-com:office:office" xmlns:oel="http://schemas.microsoft.com/office/2019/extlst" xmlns:r="http://schemas.openxmlformats.org/officeDocument/2006/relationships" xmlns:m="http://schemas.openxmlformats.org/officeDocument/2006/math" xmlns:v="urn:schemas-microsoft-com:vml" xmlns:wp14="http://schemas.microsoft.com/office/word/2010/wordprocessingDrawing" xmlns:wp="http://schemas.openxmlformats.org/drawingml/2006/wordprocessingDrawing" xmlns:w10="urn:schemas-microsoft-com:office:word" xmlns:w="http://schemas.openxmlformats.org/wordprocessingml/2006/main" xmlns:w14="http://schemas.microsoft.com/office/word/2010/wordml" xmlns:w15="http://schemas.microsoft.com/office/word/2012/wordml" xmlns:w16cei="http://schemas.microsoft.com/office/word/2026/wordml/cei" xmlns:w16cex="http://schemas.microsoft.com/office/word/2018/wordml/cex" xmlns:w16cid="http://schemas.microsoft.com/office/word/2016/wordml/cid" xmlns:w16="http://schemas.microsoft.com/office/word/2018/wordml" xmlns:w16du="http://schemas.microsoft.com/office/word/2023/wordml/word16du" xmlns:w16sdtdh="http://schemas.microsoft.com/office/word/2020/wordml/sdtdatahash" xmlns:w16sdtfl="http://schemas.microsoft.com/office/word/2024/wordml/sdtformatlock" xmlns:w16se="http://schemas.microsoft.com/office/word/2015/wordml/symex" xmlns:wpg="http://schemas.microsoft.com/office/word/2010/wordprocessingGroup" xmlns:wpi="http://schemas.microsoft.com/office/word/2010/wordprocessingInk" xmlns:wne="http://schemas.microsoft.com/office/word/2006/wordml" xmlns:wps="http://schemas.microsoft.com/office/word/2010/wordprocessingShape" mc:Ignorable="w14 w15 w16se w16cid w16 w16cex w16sdtdh w16sdtfl w16du wp14">
   <w:body>
     <w:p>
       <w:r>
@@ -395,6 +395,9 @@
         </w:numPr>
       </w:pPr>
       <w:r>
+        <w:rPr>
+          <w:highlight w:val="yellow"/>
+        </w:rPr>
         <w:t>Bouton synchroniser ne fait aucune action</w:t>
       </w:r>
     </w:p>
@@ -409,6 +412,81 @@
       <w:r>
         <w:t>Dans la table historique approvisionnement je voulais savoir aussi l’utilisateur qui a faire la reappro</w:t>
       </w:r>
+    </w:p>
+    <w:p>
+      <w:pPr>
+        <w:pStyle w:val="NormalWeb"/>
+        <w:numPr>
+          <w:ilvl w:val="0"/>
+          <w:numId w:val="1"/>
+        </w:numPr>
+      </w:pPr>
+      <w:r>
+        <w:t xml:space="preserve">on va encore retravailler pour rendre propre la facture et pas trop encombrante, </w:t>
+      </w:r>
+    </w:p>
+    <w:p>
+      <w:pPr>
+        <w:pStyle w:val="NormalWeb"/>
+        <w:numPr>
+          <w:ilvl w:val="0"/>
+          <w:numId w:val="1"/>
+        </w:numPr>
+      </w:pPr>
+      <w:r>
+        <w:t>aussi pour le raport financier des ventes et depense je ne veux pas avoir le nom</w:t>
+      </w:r>
+      <w:r>
+        <w:t xml:space="preserve"> </w:t>
+      </w:r>
+      <w:r>
+        <w:t xml:space="preserve">de netlify en haut de la page et </w:t>
+      </w:r>
+    </w:p>
+    <w:p>
+      <w:pPr>
+        <w:pStyle w:val="NormalWeb"/>
+        <w:numPr>
+          <w:ilvl w:val="0"/>
+          <w:numId w:val="1"/>
+        </w:numPr>
+      </w:pPr>
+      <w:r>
+        <w:t xml:space="preserve">ce rapport doit contenir les entête de la boutique, le logo et toutes les information. </w:t>
+      </w:r>
+    </w:p>
+    <w:p>
+      <w:pPr>
+        <w:pStyle w:val="NormalWeb"/>
+        <w:numPr>
+          <w:ilvl w:val="0"/>
+          <w:numId w:val="1"/>
+        </w:numPr>
+      </w:pPr>
+      <w:r>
+        <w:t xml:space="preserve">aussi dans le resumé et interpretation commentair, à la fin tu dois me donnez une conclusion comparative des activités s'il y a eu echec ou perte ou encore j'ai bien calibrer les depenses par rapport aux ventes. </w:t>
+      </w:r>
+    </w:p>
+    <w:p>
+      <w:pPr>
+        <w:pStyle w:val="NormalWeb"/>
+        <w:numPr>
+          <w:ilvl w:val="0"/>
+          <w:numId w:val="1"/>
+        </w:numPr>
+      </w:pPr>
+      <w:r>
+        <w:lastRenderedPageBreak/>
+        <w:t>Il y a une possibilité que le lien publié via netlify, que l’application</w:t>
+      </w:r>
+      <w:r>
+        <w:t xml:space="preserve"> soit installable en cliquant sur le navigateur</w:t>
+      </w:r>
+    </w:p>
+    <w:p>
+      <w:pPr>
+        <w:pStyle w:val="Paragraphedeliste"/>
+      </w:pPr>
     </w:p>
     <w:p>
       <w:pPr>
@@ -680,6 +758,7 @@
     </w:p>
     <w:p>
       <w:r>
+        <w:lastRenderedPageBreak/>
         <w:t>Fais ceci dans Netlify :</w:t>
       </w:r>
     </w:p>
@@ -774,7 +853,6 @@
         </w:numPr>
       </w:pPr>
       <w:r>
-        <w:lastRenderedPageBreak/>
         <w:t>Node version : 20</w:t>
       </w:r>
     </w:p>
@@ -906,7 +984,7 @@
 </file>
 
 <file path=word/numbering.xml><?xml version="1.0" encoding="utf-8"?>
-<w:numbering xmlns:wpc="http://schemas.microsoft.com/office/word/2010/wordprocessingCanvas" xmlns:cx="http://schemas.microsoft.com/office/drawing/2014/chartex" xmlns:cx1="http://schemas.microsoft.com/office/drawing/2015/9/8/chartex" xmlns:cx2="http://schemas.microsoft.com/office/drawing/2015/10/21/chartex" xmlns:cx3="http://schemas.microsoft.com/office/drawing/2016/5/9/chartex" xmlns:cx4="http://schemas.microsoft.com/office/drawing/2016/5/10/chartex" xmlns:cx5="http://schemas.microsoft.com/office/drawing/2016/5/11/chartex" xmlns:cx6="http://schemas.microsoft.com/office/drawing/2016/5/12/chartex" xmlns:cx7="http://schemas.microsoft.com/office/drawing/2016/5/13/chartex" xmlns:cx8="http://schemas.microsoft.com/office/drawing/2016/5/14/chartex" xmlns:mc="http://schemas.openxmlformats.org/markup-compatibility/2006" xmlns:aink="http://schemas.microsoft.com/office/drawing/2016/ink" xmlns:am3d="http://schemas.microsoft.com/office/drawing/2017/model3d" xmlns:o="urn:schemas-microsoft-com:office:office" xmlns:oel="http://schemas.microsoft.com/office/2019/extlst" xmlns:r="http://schemas.openxmlformats.org/officeDocument/2006/relationships" xmlns:m="http://schemas.openxmlformats.org/officeDocument/2006/math" xmlns:v="urn:schemas-microsoft-com:vml" xmlns:wp14="http://schemas.microsoft.com/office/word/2010/wordprocessingDrawing" xmlns:wp="http://schemas.openxmlformats.org/drawingml/2006/wordprocessingDrawing" xmlns:w10="urn:schemas-microsoft-com:office:word" xmlns:w="http://schemas.openxmlformats.org/wordprocessingml/2006/main" xmlns:w14="http://schemas.microsoft.com/office/word/2010/wordml" xmlns:w15="http://schemas.microsoft.com/office/word/2012/wordml" xmlns:w16cex="http://schemas.microsoft.com/office/word/2018/wordml/cex" xmlns:w16cid="http://schemas.microsoft.com/office/word/2016/wordml/cid" xmlns:w16="http://schemas.microsoft.com/office/word/2018/wordml" xmlns:w16du="http://schemas.microsoft.com/office/word/2023/wordml/word16du" xmlns:w16sdtdh="http://schemas.microsoft.com/office/word/2020/wordml/sdtdatahash" xmlns:w16sdtfl="http://schemas.microsoft.com/office/word/2024/wordml/sdtformatlock" xmlns:w16se="http://schemas.microsoft.com/office/word/2015/wordml/symex" xmlns:wpg="http://schemas.microsoft.com/office/word/2010/wordprocessingGroup" xmlns:wpi="http://schemas.microsoft.com/office/word/2010/wordprocessingInk" xmlns:wne="http://schemas.microsoft.com/office/word/2006/wordml" xmlns:wps="http://schemas.microsoft.com/office/word/2010/wordprocessingShape" mc:Ignorable="w14 w15 w16se w16cid w16 w16cex w16sdtdh w16sdtfl w16du wp14">
+<w:numbering xmlns:wpc="http://schemas.microsoft.com/office/word/2010/wordprocessingCanvas" xmlns:cx="http://schemas.microsoft.com/office/drawing/2014/chartex" xmlns:cx1="http://schemas.microsoft.com/office/drawing/2015/9/8/chartex" xmlns:cx2="http://schemas.microsoft.com/office/drawing/2015/10/21/chartex" xmlns:cx3="http://schemas.microsoft.com/office/drawing/2016/5/9/chartex" xmlns:cx4="http://schemas.microsoft.com/office/drawing/2016/5/10/chartex" xmlns:cx5="http://schemas.microsoft.com/office/drawing/2016/5/11/chartex" xmlns:cx6="http://schemas.microsoft.com/office/drawing/2016/5/12/chartex" xmlns:cx7="http://schemas.microsoft.com/office/drawing/2016/5/13/chartex" xmlns:cx8="http://schemas.microsoft.com/office/drawing/2016/5/14/chartex" xmlns:mc="http://schemas.openxmlformats.org/markup-compatibility/2006" xmlns:aink="http://schemas.microsoft.com/office/drawing/2016/ink" xmlns:am3d="http://schemas.microsoft.com/office/drawing/2017/model3d" xmlns:o="urn:schemas-microsoft-com:office:office" xmlns:oel="http://schemas.microsoft.com/office/2019/extlst" xmlns:r="http://schemas.openxmlformats.org/officeDocument/2006/relationships" xmlns:m="http://schemas.openxmlformats.org/officeDocument/2006/math" xmlns:v="urn:schemas-microsoft-com:vml" xmlns:wp14="http://schemas.microsoft.com/office/word/2010/wordprocessingDrawing" xmlns:wp="http://schemas.openxmlformats.org/drawingml/2006/wordprocessingDrawing" xmlns:w10="urn:schemas-microsoft-com:office:word" xmlns:w="http://schemas.openxmlformats.org/wordprocessingml/2006/main" xmlns:w14="http://schemas.microsoft.com/office/word/2010/wordml" xmlns:w15="http://schemas.microsoft.com/office/word/2012/wordml" xmlns:w16cei="http://schemas.microsoft.com/office/word/2026/wordml/cei" xmlns:w16cex="http://schemas.microsoft.com/office/word/2018/wordml/cex" xmlns:w16cid="http://schemas.microsoft.com/office/word/2016/wordml/cid" xmlns:w16="http://schemas.microsoft.com/office/word/2018/wordml" xmlns:w16du="http://schemas.microsoft.com/office/word/2023/wordml/word16du" xmlns:w16sdtdh="http://schemas.microsoft.com/office/word/2020/wordml/sdtdatahash" xmlns:w16sdtfl="http://schemas.microsoft.com/office/word/2024/wordml/sdtformatlock" xmlns:w16se="http://schemas.microsoft.com/office/word/2015/wordml/symex" xmlns:wpg="http://schemas.microsoft.com/office/word/2010/wordprocessingGroup" xmlns:wpi="http://schemas.microsoft.com/office/word/2010/wordprocessingInk" xmlns:wne="http://schemas.microsoft.com/office/word/2006/wordml" xmlns:wps="http://schemas.microsoft.com/office/word/2010/wordprocessingShape" mc:Ignorable="w14 w15 w16se w16cid w16 w16cex w16sdtdh w16sdtfl w16du wp14">
   <w:abstractNum w:abstractNumId="0" w15:restartNumberingAfterBreak="0">
     <w:nsid w:val="162E1810"/>
     <w:multiLevelType w:val="multilevel"/>
@@ -2822,6 +2900,25 @@
       <w:spacing w:val="5"/>
     </w:rPr>
   </w:style>
+  <w:style w:type="paragraph" w:styleId="NormalWeb">
+    <w:name w:val="Normal (Web)"/>
+    <w:basedOn w:val="Normal"/>
+    <w:uiPriority w:val="99"/>
+    <w:semiHidden/>
+    <w:unhideWhenUsed/>
+    <w:rsid w:val="008B609C"/>
+    <w:pPr>
+      <w:spacing w:before="100" w:beforeAutospacing="1" w:after="100" w:afterAutospacing="1" w:line="240" w:lineRule="auto"/>
+    </w:pPr>
+    <w:rPr>
+      <w:rFonts w:ascii="Times New Roman" w:eastAsia="Times New Roman" w:hAnsi="Times New Roman" w:cs="Times New Roman"/>
+      <w:kern w:val="0"/>
+      <w:sz w:val="24"/>
+      <w:szCs w:val="24"/>
+      <w:lang w:eastAsia="fr-FR"/>
+      <w14:ligatures w14:val="none"/>
+    </w:rPr>
+  </w:style>
 </w:styles>
 </file>
 

</xml_diff>

<commit_message>
mise à jour du status du commentaire selon le cas reel
</commit_message>
<xml_diff>
--- a/Projet Application Papeterie walikale to world.docx
+++ b/Projet Application Papeterie walikale to world.docx
@@ -4,7 +4,15 @@
   <w:body>
     <w:p>
       <w:r>
-        <w:t>Projet Papeterie walikale to world</w:t>
+        <w:t xml:space="preserve">Projet Papeterie </w:t>
+      </w:r>
+      <w:proofErr w:type="spellStart"/>
+      <w:r>
+        <w:t>walikale</w:t>
+      </w:r>
+      <w:proofErr w:type="spellEnd"/>
+      <w:r>
+        <w:t xml:space="preserve"> to world</w:t>
       </w:r>
     </w:p>
     <w:p>
@@ -21,8 +29,13 @@
         </w:numPr>
       </w:pPr>
       <w:r>
-        <w:t>Gestion vente papeterie y compris les depenses</w:t>
-      </w:r>
+        <w:t xml:space="preserve">Gestion vente papeterie y compris les </w:t>
+      </w:r>
+      <w:proofErr w:type="spellStart"/>
+      <w:r>
+        <w:t>depenses</w:t>
+      </w:r>
+      <w:proofErr w:type="spellEnd"/>
     </w:p>
     <w:p>
       <w:pPr>
@@ -33,8 +46,13 @@
         </w:numPr>
       </w:pPr>
       <w:r>
-        <w:t>Gestion du personnel (les salaires, primes)..</w:t>
-      </w:r>
+        <w:t>Gestion du personnel (les salaires, primes</w:t>
+      </w:r>
+      <w:proofErr w:type="gramStart"/>
+      <w:r>
+        <w:t>)..</w:t>
+      </w:r>
+      <w:proofErr w:type="gramEnd"/>
     </w:p>
     <w:p>
       <w:pPr>
@@ -44,7 +62,15 @@
         <w:t xml:space="preserve">L’application doit être en ligne pour permettre le suivi à distance, </w:t>
       </w:r>
       <w:r>
-        <w:t xml:space="preserve">mais aussi fonctionne en hors ligne aussi et synchronise une fois connecté à internet. </w:t>
+        <w:t xml:space="preserve">mais aussi fonctionne en hors ligne aussi et synchronise une fois </w:t>
+      </w:r>
+      <w:proofErr w:type="gramStart"/>
+      <w:r>
+        <w:t>connecté</w:t>
+      </w:r>
+      <w:proofErr w:type="gramEnd"/>
+      <w:r>
+        <w:t xml:space="preserve"> à internet. </w:t>
       </w:r>
     </w:p>
     <w:p>
@@ -86,13 +112,41 @@
         <w:rPr>
           <w:highlight w:val="yellow"/>
         </w:rPr>
-        <w:t>Ceux qui modifie en local puisse avoir la possibilité de travailler meme sans internet et synchroniser en cliquant sur le bouton synchroniser a</w:t>
-      </w:r>
-      <w:r>
-        <w:rPr>
-          <w:highlight w:val="yellow"/>
-        </w:rPr>
-        <w:t>fin que cela puisse pusher vers supabase.</w:t>
+        <w:t xml:space="preserve">Ceux qui modifie en local puisse avoir la possibilité de travailler </w:t>
+      </w:r>
+      <w:proofErr w:type="spellStart"/>
+      <w:r>
+        <w:rPr>
+          <w:highlight w:val="yellow"/>
+        </w:rPr>
+        <w:t>meme</w:t>
+      </w:r>
+      <w:proofErr w:type="spellEnd"/>
+      <w:r>
+        <w:rPr>
+          <w:highlight w:val="yellow"/>
+        </w:rPr>
+        <w:t xml:space="preserve"> sans internet et synchroniser en cliquant sur le bouton synchroniser a</w:t>
+      </w:r>
+      <w:r>
+        <w:rPr>
+          <w:highlight w:val="yellow"/>
+        </w:rPr>
+        <w:t xml:space="preserve">fin que cela puisse pusher vers </w:t>
+      </w:r>
+      <w:proofErr w:type="spellStart"/>
+      <w:r>
+        <w:rPr>
+          <w:highlight w:val="yellow"/>
+        </w:rPr>
+        <w:t>supabase</w:t>
+      </w:r>
+      <w:proofErr w:type="spellEnd"/>
+      <w:r>
+        <w:rPr>
+          <w:highlight w:val="yellow"/>
+        </w:rPr>
+        <w:t>.</w:t>
       </w:r>
       <w:r>
         <w:t xml:space="preserve"> </w:t>
@@ -143,7 +197,21 @@
         <w:rPr>
           <w:highlight w:val="yellow"/>
         </w:rPr>
-        <w:t>a fenetre d’approvisionnement</w:t>
+        <w:t xml:space="preserve">a </w:t>
+      </w:r>
+      <w:proofErr w:type="spellStart"/>
+      <w:r>
+        <w:rPr>
+          <w:highlight w:val="yellow"/>
+        </w:rPr>
+        <w:t>fenetre</w:t>
+      </w:r>
+      <w:proofErr w:type="spellEnd"/>
+      <w:r>
+        <w:rPr>
+          <w:highlight w:val="yellow"/>
+        </w:rPr>
+        <w:t xml:space="preserve"> d’approvisionnement</w:t>
       </w:r>
       <w:r>
         <w:rPr>
@@ -179,7 +247,21 @@
         <w:rPr>
           <w:highlight w:val="yellow"/>
         </w:rPr>
-        <w:t>Historique d’approvisionnement (pour avoir une trace de tous les approvisionnement fait)</w:t>
+        <w:t xml:space="preserve">Historique d’approvisionnement (pour avoir une trace de </w:t>
+      </w:r>
+      <w:proofErr w:type="gramStart"/>
+      <w:r>
+        <w:rPr>
+          <w:highlight w:val="yellow"/>
+        </w:rPr>
+        <w:t>tous les approvisionnement</w:t>
+      </w:r>
+      <w:proofErr w:type="gramEnd"/>
+      <w:r>
+        <w:rPr>
+          <w:highlight w:val="yellow"/>
+        </w:rPr>
+        <w:t xml:space="preserve"> fait)</w:t>
       </w:r>
     </w:p>
     <w:p>
@@ -197,20 +279,64 @@
         <w:rPr>
           <w:highlight w:val="yellow"/>
         </w:rPr>
-        <w:t>Enlever les 00 apres le chiffre, par exemple pour une produit vendu</w:t>
-      </w:r>
-      <w:r>
-        <w:rPr>
-          <w:highlight w:val="yellow"/>
-        </w:rPr>
-        <w:t xml:space="preserve"> à 500fc, mettez seulement 500FC et 500.00FC. aussi la quantité d’approvisionnement, laissez la case vide et ne mettez pas 0 </w:t>
-      </w:r>
-      <w:r>
-        <w:rPr>
-          <w:highlight w:val="yellow"/>
-        </w:rPr>
-        <w:t>au prealable</w:t>
-      </w:r>
+        <w:t xml:space="preserve">Enlever les 00 </w:t>
+      </w:r>
+      <w:proofErr w:type="spellStart"/>
+      <w:r>
+        <w:rPr>
+          <w:highlight w:val="yellow"/>
+        </w:rPr>
+        <w:t>apres</w:t>
+      </w:r>
+      <w:proofErr w:type="spellEnd"/>
+      <w:r>
+        <w:rPr>
+          <w:highlight w:val="yellow"/>
+        </w:rPr>
+        <w:t xml:space="preserve"> le chiffre, par exemple pour </w:t>
+      </w:r>
+      <w:proofErr w:type="gramStart"/>
+      <w:r>
+        <w:rPr>
+          <w:highlight w:val="yellow"/>
+        </w:rPr>
+        <w:t>une produit vendu</w:t>
+      </w:r>
+      <w:proofErr w:type="gramEnd"/>
+      <w:r>
+        <w:rPr>
+          <w:highlight w:val="yellow"/>
+        </w:rPr>
+        <w:t xml:space="preserve"> à 500fc, mettez seulement 500FC et 500.00FC. </w:t>
+      </w:r>
+      <w:proofErr w:type="gramStart"/>
+      <w:r>
+        <w:rPr>
+          <w:highlight w:val="yellow"/>
+        </w:rPr>
+        <w:t>aussi</w:t>
+      </w:r>
+      <w:proofErr w:type="gramEnd"/>
+      <w:r>
+        <w:rPr>
+          <w:highlight w:val="yellow"/>
+        </w:rPr>
+        <w:t xml:space="preserve"> la quantité d’approvisionnement, laissez la case vide et ne mettez pas 0 </w:t>
+      </w:r>
+      <w:r>
+        <w:rPr>
+          <w:highlight w:val="yellow"/>
+        </w:rPr>
+        <w:t xml:space="preserve">au </w:t>
+      </w:r>
+      <w:proofErr w:type="spellStart"/>
+      <w:r>
+        <w:rPr>
+          <w:highlight w:val="yellow"/>
+        </w:rPr>
+        <w:t>prealable</w:t>
+      </w:r>
+      <w:proofErr w:type="spellEnd"/>
       <w:r>
         <w:rPr>
           <w:highlight w:val="yellow"/>
@@ -269,7 +395,21 @@
         <w:rPr>
           <w:highlight w:val="yellow"/>
         </w:rPr>
-        <w:t xml:space="preserve">Dans la table produit, mettre cette fenetre comme le formulaire d’approvisionnement, </w:t>
+        <w:t xml:space="preserve">Dans la table produit, mettre cette </w:t>
+      </w:r>
+      <w:proofErr w:type="spellStart"/>
+      <w:r>
+        <w:rPr>
+          <w:highlight w:val="yellow"/>
+        </w:rPr>
+        <w:t>fenetre</w:t>
+      </w:r>
+      <w:proofErr w:type="spellEnd"/>
+      <w:r>
+        <w:rPr>
+          <w:highlight w:val="yellow"/>
+        </w:rPr>
+        <w:t xml:space="preserve"> comme le formulaire d’approvisionnement, </w:t>
       </w:r>
     </w:p>
     <w:p>
@@ -287,25 +427,123 @@
         <w:rPr>
           <w:highlight w:val="yellow"/>
         </w:rPr>
-        <w:t>La fenetre de depenses engagées</w:t>
-      </w:r>
-      <w:r>
-        <w:rPr>
-          <w:highlight w:val="yellow"/>
-        </w:rPr>
-        <w:t xml:space="preserve"> (elle doit avoir le detail, nature de la depense, montant, date,</w:t>
-      </w:r>
-      <w:r>
-        <w:rPr>
-          <w:highlight w:val="yellow"/>
-        </w:rPr>
-        <w:t xml:space="preserve"> quelle utilisateur, qui a approuvé le decaissement de l’argent</w:t>
-      </w:r>
-      <w:r>
-        <w:rPr>
-          <w:highlight w:val="yellow"/>
-        </w:rPr>
-        <w:t>, la depense va servir à quoi</w:t>
+        <w:t xml:space="preserve">La </w:t>
+      </w:r>
+      <w:proofErr w:type="spellStart"/>
+      <w:r>
+        <w:rPr>
+          <w:highlight w:val="yellow"/>
+        </w:rPr>
+        <w:t>fenetre</w:t>
+      </w:r>
+      <w:proofErr w:type="spellEnd"/>
+      <w:r>
+        <w:rPr>
+          <w:highlight w:val="yellow"/>
+        </w:rPr>
+        <w:t xml:space="preserve"> de </w:t>
+      </w:r>
+      <w:proofErr w:type="spellStart"/>
+      <w:r>
+        <w:rPr>
+          <w:highlight w:val="yellow"/>
+        </w:rPr>
+        <w:t>depenses</w:t>
+      </w:r>
+      <w:proofErr w:type="spellEnd"/>
+      <w:r>
+        <w:rPr>
+          <w:highlight w:val="yellow"/>
+        </w:rPr>
+        <w:t xml:space="preserve"> engagées</w:t>
+      </w:r>
+      <w:r>
+        <w:rPr>
+          <w:highlight w:val="yellow"/>
+        </w:rPr>
+        <w:t xml:space="preserve"> (elle doit avoir le </w:t>
+      </w:r>
+      <w:proofErr w:type="spellStart"/>
+      <w:r>
+        <w:rPr>
+          <w:highlight w:val="yellow"/>
+        </w:rPr>
+        <w:t>detail</w:t>
+      </w:r>
+      <w:proofErr w:type="spellEnd"/>
+      <w:r>
+        <w:rPr>
+          <w:highlight w:val="yellow"/>
+        </w:rPr>
+        <w:t xml:space="preserve">, nature de la </w:t>
+      </w:r>
+      <w:proofErr w:type="spellStart"/>
+      <w:r>
+        <w:rPr>
+          <w:highlight w:val="yellow"/>
+        </w:rPr>
+        <w:t>depense</w:t>
+      </w:r>
+      <w:proofErr w:type="spellEnd"/>
+      <w:r>
+        <w:rPr>
+          <w:highlight w:val="yellow"/>
+        </w:rPr>
+        <w:t>, montant, date,</w:t>
+      </w:r>
+      <w:r>
+        <w:rPr>
+          <w:highlight w:val="yellow"/>
+        </w:rPr>
+        <w:t xml:space="preserve"> </w:t>
+      </w:r>
+      <w:proofErr w:type="gramStart"/>
+      <w:r>
+        <w:rPr>
+          <w:highlight w:val="yellow"/>
+        </w:rPr>
+        <w:t>quelle utilisateur</w:t>
+      </w:r>
+      <w:proofErr w:type="gramEnd"/>
+      <w:r>
+        <w:rPr>
+          <w:highlight w:val="yellow"/>
+        </w:rPr>
+        <w:t xml:space="preserve">, qui a approuvé le </w:t>
+      </w:r>
+      <w:proofErr w:type="spellStart"/>
+      <w:r>
+        <w:rPr>
+          <w:highlight w:val="yellow"/>
+        </w:rPr>
+        <w:t>decaissement</w:t>
+      </w:r>
+      <w:proofErr w:type="spellEnd"/>
+      <w:r>
+        <w:rPr>
+          <w:highlight w:val="yellow"/>
+        </w:rPr>
+        <w:t xml:space="preserve"> de l’argent</w:t>
+      </w:r>
+      <w:r>
+        <w:rPr>
+          <w:highlight w:val="yellow"/>
+        </w:rPr>
+        <w:t xml:space="preserve">, la </w:t>
+      </w:r>
+      <w:proofErr w:type="spellStart"/>
+      <w:r>
+        <w:rPr>
+          <w:highlight w:val="yellow"/>
+        </w:rPr>
+        <w:t>depense</w:t>
+      </w:r>
+      <w:proofErr w:type="spellEnd"/>
+      <w:r>
+        <w:rPr>
+          <w:highlight w:val="yellow"/>
+        </w:rPr>
+        <w:t xml:space="preserve"> va servir à quoi</w:t>
       </w:r>
       <w:r>
         <w:rPr>
@@ -317,7 +555,21 @@
         <w:rPr>
           <w:highlight w:val="yellow"/>
         </w:rPr>
-        <w:t xml:space="preserve">puisse avoir un impacte déjà sur le montant vendu. </w:t>
+        <w:t xml:space="preserve">puisse avoir un </w:t>
+      </w:r>
+      <w:proofErr w:type="spellStart"/>
+      <w:r>
+        <w:rPr>
+          <w:highlight w:val="yellow"/>
+        </w:rPr>
+        <w:t>impacte</w:t>
+      </w:r>
+      <w:proofErr w:type="spellEnd"/>
+      <w:r>
+        <w:rPr>
+          <w:highlight w:val="yellow"/>
+        </w:rPr>
+        <w:t xml:space="preserve"> déjà sur le montant vendu. </w:t>
       </w:r>
     </w:p>
     <w:p>
@@ -335,13 +587,41 @@
         <w:rPr>
           <w:highlight w:val="yellow"/>
         </w:rPr>
-        <w:t>Une possibilité d’avoir des graphiques triable par date juste pour savoir combien j’ai fait entrer</w:t>
-      </w:r>
-      <w:r>
-        <w:rPr>
-          <w:highlight w:val="yellow"/>
-        </w:rPr>
-        <w:t xml:space="preserve"> pendant telle periode.</w:t>
+        <w:t xml:space="preserve">Une possibilité d’avoir des graphiques </w:t>
+      </w:r>
+      <w:proofErr w:type="spellStart"/>
+      <w:r>
+        <w:rPr>
+          <w:highlight w:val="yellow"/>
+        </w:rPr>
+        <w:t>triable</w:t>
+      </w:r>
+      <w:proofErr w:type="spellEnd"/>
+      <w:r>
+        <w:rPr>
+          <w:highlight w:val="yellow"/>
+        </w:rPr>
+        <w:t xml:space="preserve"> par date juste pour savoir combien j’ai fait entrer</w:t>
+      </w:r>
+      <w:r>
+        <w:rPr>
+          <w:highlight w:val="yellow"/>
+        </w:rPr>
+        <w:t xml:space="preserve"> pendant telle </w:t>
+      </w:r>
+      <w:proofErr w:type="spellStart"/>
+      <w:r>
+        <w:rPr>
+          <w:highlight w:val="yellow"/>
+        </w:rPr>
+        <w:t>periode</w:t>
+      </w:r>
+      <w:proofErr w:type="spellEnd"/>
+      <w:r>
+        <w:rPr>
+          <w:highlight w:val="yellow"/>
+        </w:rPr>
+        <w:t>.</w:t>
       </w:r>
     </w:p>
     <w:p>
@@ -359,31 +639,173 @@
         <w:rPr>
           <w:highlight w:val="yellow"/>
         </w:rPr>
-        <w:t>Dans la fenetre depense qu’il ait un bouton qui genere le rapport complet, combine de vente</w:t>
-      </w:r>
-      <w:r>
-        <w:rPr>
-          <w:highlight w:val="yellow"/>
-        </w:rPr>
-        <w:t xml:space="preserve"> par chaque produit, service fait, quelle depense avec ses details, et le solde</w:t>
-      </w:r>
-      <w:r>
-        <w:rPr>
-          <w:highlight w:val="yellow"/>
-        </w:rPr>
-        <w:t xml:space="preserve"> apres toutes les depenses</w:t>
-      </w:r>
+        <w:t xml:space="preserve">Dans la </w:t>
+      </w:r>
+      <w:proofErr w:type="spellStart"/>
+      <w:r>
+        <w:rPr>
+          <w:highlight w:val="yellow"/>
+        </w:rPr>
+        <w:t>fenetre</w:t>
+      </w:r>
+      <w:proofErr w:type="spellEnd"/>
+      <w:r>
+        <w:rPr>
+          <w:highlight w:val="yellow"/>
+        </w:rPr>
+        <w:t xml:space="preserve"> </w:t>
+      </w:r>
+      <w:proofErr w:type="spellStart"/>
+      <w:r>
+        <w:rPr>
+          <w:highlight w:val="yellow"/>
+        </w:rPr>
+        <w:t>depense</w:t>
+      </w:r>
+      <w:proofErr w:type="spellEnd"/>
+      <w:r>
+        <w:rPr>
+          <w:highlight w:val="yellow"/>
+        </w:rPr>
+        <w:t xml:space="preserve"> qu’il ait un bouton qui </w:t>
+      </w:r>
+      <w:proofErr w:type="spellStart"/>
+      <w:r>
+        <w:rPr>
+          <w:highlight w:val="yellow"/>
+        </w:rPr>
+        <w:t>genere</w:t>
+      </w:r>
+      <w:proofErr w:type="spellEnd"/>
+      <w:r>
+        <w:rPr>
+          <w:highlight w:val="yellow"/>
+        </w:rPr>
+        <w:t xml:space="preserve"> le rapport complet, combine de vente</w:t>
+      </w:r>
+      <w:r>
+        <w:rPr>
+          <w:highlight w:val="yellow"/>
+        </w:rPr>
+        <w:t xml:space="preserve"> par chaque produit, service fait, quelle </w:t>
+      </w:r>
+      <w:proofErr w:type="spellStart"/>
+      <w:r>
+        <w:rPr>
+          <w:highlight w:val="yellow"/>
+        </w:rPr>
+        <w:t>depense</w:t>
+      </w:r>
+      <w:proofErr w:type="spellEnd"/>
+      <w:r>
+        <w:rPr>
+          <w:highlight w:val="yellow"/>
+        </w:rPr>
+        <w:t xml:space="preserve"> avec ses </w:t>
+      </w:r>
+      <w:proofErr w:type="spellStart"/>
+      <w:r>
+        <w:rPr>
+          <w:highlight w:val="yellow"/>
+        </w:rPr>
+        <w:t>details</w:t>
+      </w:r>
+      <w:proofErr w:type="spellEnd"/>
+      <w:r>
+        <w:rPr>
+          <w:highlight w:val="yellow"/>
+        </w:rPr>
+        <w:t>, et le solde</w:t>
+      </w:r>
+      <w:r>
+        <w:rPr>
+          <w:highlight w:val="yellow"/>
+        </w:rPr>
+        <w:t xml:space="preserve"> </w:t>
+      </w:r>
+      <w:proofErr w:type="spellStart"/>
+      <w:r>
+        <w:rPr>
+          <w:highlight w:val="yellow"/>
+        </w:rPr>
+        <w:t>apres</w:t>
+      </w:r>
+      <w:proofErr w:type="spellEnd"/>
+      <w:r>
+        <w:rPr>
+          <w:highlight w:val="yellow"/>
+        </w:rPr>
+        <w:t xml:space="preserve"> toutes les </w:t>
+      </w:r>
+      <w:proofErr w:type="spellStart"/>
+      <w:r>
+        <w:rPr>
+          <w:highlight w:val="yellow"/>
+        </w:rPr>
+        <w:t>depenses</w:t>
+      </w:r>
+      <w:proofErr w:type="spellEnd"/>
       <w:r>
         <w:rPr>
           <w:highlight w:val="yellow"/>
         </w:rPr>
         <w:t xml:space="preserve"> faites. </w:t>
       </w:r>
-      <w:r>
-        <w:rPr>
-          <w:highlight w:val="yellow"/>
-        </w:rPr>
-        <w:t xml:space="preserve">qui montre toutes les actions faites (saisie impression, photocopie, scan, autre, vente fourniture, connexion internet, vente eau pure….) et que cela cree un total par service, si c’est saisie impression combien ? si c’est internet combien ?..., </w:t>
+      <w:proofErr w:type="gramStart"/>
+      <w:r>
+        <w:rPr>
+          <w:highlight w:val="yellow"/>
+        </w:rPr>
+        <w:t>qui</w:t>
+      </w:r>
+      <w:proofErr w:type="gramEnd"/>
+      <w:r>
+        <w:rPr>
+          <w:highlight w:val="yellow"/>
+        </w:rPr>
+        <w:t xml:space="preserve"> montre toutes les actions faites (saisie impression, photocopie, scan, autre, vente fourniture, connexion internet, vente eau </w:t>
+      </w:r>
+      <w:proofErr w:type="gramStart"/>
+      <w:r>
+        <w:rPr>
+          <w:highlight w:val="yellow"/>
+        </w:rPr>
+        <w:t>pure….</w:t>
+      </w:r>
+      <w:proofErr w:type="gramEnd"/>
+      <w:r>
+        <w:rPr>
+          <w:highlight w:val="yellow"/>
+        </w:rPr>
+        <w:t xml:space="preserve">) et que cela </w:t>
+      </w:r>
+      <w:proofErr w:type="spellStart"/>
+      <w:r>
+        <w:rPr>
+          <w:highlight w:val="yellow"/>
+        </w:rPr>
+        <w:t>cree</w:t>
+      </w:r>
+      <w:proofErr w:type="spellEnd"/>
+      <w:r>
+        <w:rPr>
+          <w:highlight w:val="yellow"/>
+        </w:rPr>
+        <w:t xml:space="preserve"> un total par service, si c’est saisie impression combien ? si c’est internet combien</w:t>
+      </w:r>
+      <w:proofErr w:type="gramStart"/>
+      <w:r>
+        <w:rPr>
+          <w:highlight w:val="yellow"/>
+        </w:rPr>
+        <w:t> ?...</w:t>
+      </w:r>
+      <w:proofErr w:type="gramEnd"/>
+      <w:r>
+        <w:rPr>
+          <w:highlight w:val="yellow"/>
+        </w:rPr>
+        <w:t xml:space="preserve">, </w:t>
       </w:r>
     </w:p>
     <w:p>
@@ -410,8 +832,21 @@
         </w:numPr>
       </w:pPr>
       <w:r>
-        <w:t>Dans la table historique approvisionnement je voulais savoir aussi l’utilisateur qui a faire la reappro</w:t>
-      </w:r>
+        <w:t xml:space="preserve">Dans la table historique approvisionnement je voulais savoir aussi l’utilisateur qui </w:t>
+      </w:r>
+      <w:proofErr w:type="spellStart"/>
+      <w:r>
+        <w:t>a</w:t>
+      </w:r>
+      <w:proofErr w:type="spellEnd"/>
+      <w:r>
+        <w:t xml:space="preserve"> faire la </w:t>
+      </w:r>
+      <w:proofErr w:type="spellStart"/>
+      <w:r>
+        <w:t>reappro</w:t>
+      </w:r>
+      <w:proofErr w:type="spellEnd"/>
     </w:p>
     <w:p>
       <w:pPr>
@@ -421,8 +856,13 @@
           <w:numId w:val="1"/>
         </w:numPr>
       </w:pPr>
-      <w:r>
-        <w:t xml:space="preserve">on va encore retravailler pour rendre propre la facture et pas trop encombrante, </w:t>
+      <w:proofErr w:type="gramStart"/>
+      <w:r>
+        <w:t>on</w:t>
+      </w:r>
+      <w:proofErr w:type="gramEnd"/>
+      <w:r>
+        <w:t xml:space="preserve"> va encore retravailler pour rendre propre la facture et pas trop encombrante, </w:t>
       </w:r>
     </w:p>
     <w:p>
@@ -433,14 +873,157 @@
           <w:numId w:val="1"/>
         </w:numPr>
       </w:pPr>
-      <w:r>
-        <w:t>aussi pour le raport financier des ventes et depense je ne veux pas avoir le nom</w:t>
+      <w:proofErr w:type="gramStart"/>
+      <w:r>
+        <w:t>aussi</w:t>
+      </w:r>
+      <w:proofErr w:type="gramEnd"/>
+      <w:r>
+        <w:t xml:space="preserve"> pour le </w:t>
+      </w:r>
+      <w:proofErr w:type="spellStart"/>
+      <w:r>
+        <w:t>raport</w:t>
+      </w:r>
+      <w:proofErr w:type="spellEnd"/>
+      <w:r>
+        <w:t xml:space="preserve"> financier des ventes et </w:t>
+      </w:r>
+      <w:proofErr w:type="spellStart"/>
+      <w:r>
+        <w:t>depense</w:t>
+      </w:r>
+      <w:proofErr w:type="spellEnd"/>
+      <w:r>
+        <w:t xml:space="preserve"> je ne veux pas avoir le nom de </w:t>
+      </w:r>
+      <w:proofErr w:type="spellStart"/>
+      <w:r>
+        <w:t>netlify</w:t>
+      </w:r>
+      <w:proofErr w:type="spellEnd"/>
+      <w:r>
+        <w:t xml:space="preserve"> en haut de la page et </w:t>
+      </w:r>
+    </w:p>
+    <w:p>
+      <w:pPr>
+        <w:pStyle w:val="NormalWeb"/>
+        <w:numPr>
+          <w:ilvl w:val="0"/>
+          <w:numId w:val="1"/>
+        </w:numPr>
+      </w:pPr>
+      <w:proofErr w:type="gramStart"/>
+      <w:r>
+        <w:rPr>
+          <w:highlight w:val="yellow"/>
+        </w:rPr>
+        <w:t>ce</w:t>
+      </w:r>
+      <w:proofErr w:type="gramEnd"/>
+      <w:r>
+        <w:rPr>
+          <w:highlight w:val="yellow"/>
+        </w:rPr>
+        <w:t xml:space="preserve"> rapport doit contenir </w:t>
+      </w:r>
+      <w:proofErr w:type="gramStart"/>
+      <w:r>
+        <w:rPr>
+          <w:highlight w:val="yellow"/>
+        </w:rPr>
+        <w:t>les entête</w:t>
+      </w:r>
+      <w:proofErr w:type="gramEnd"/>
+      <w:r>
+        <w:rPr>
+          <w:highlight w:val="yellow"/>
+        </w:rPr>
+        <w:t xml:space="preserve"> de la boutique, le logo et </w:t>
+      </w:r>
+      <w:proofErr w:type="gramStart"/>
+      <w:r>
+        <w:rPr>
+          <w:highlight w:val="yellow"/>
+        </w:rPr>
+        <w:t>toutes les information</w:t>
+      </w:r>
+      <w:proofErr w:type="gramEnd"/>
+      <w:r>
+        <w:t xml:space="preserve">. </w:t>
+      </w:r>
+    </w:p>
+    <w:p>
+      <w:pPr>
+        <w:pStyle w:val="NormalWeb"/>
+        <w:numPr>
+          <w:ilvl w:val="0"/>
+          <w:numId w:val="1"/>
+        </w:numPr>
+      </w:pPr>
+      <w:proofErr w:type="gramStart"/>
+      <w:r>
+        <w:t>aussi</w:t>
+      </w:r>
+      <w:proofErr w:type="gramEnd"/>
+      <w:r>
+        <w:t xml:space="preserve"> dans </w:t>
+      </w:r>
+      <w:r>
+        <w:t>la zone</w:t>
       </w:r>
       <w:r>
         <w:t xml:space="preserve"> </w:t>
       </w:r>
-      <w:r>
-        <w:t xml:space="preserve">de netlify en haut de la page et </w:t>
+      <w:proofErr w:type="spellStart"/>
+      <w:r>
+        <w:t>resumé</w:t>
+      </w:r>
+      <w:proofErr w:type="spellEnd"/>
+      <w:r>
+        <w:t xml:space="preserve"> et </w:t>
+      </w:r>
+      <w:proofErr w:type="spellStart"/>
+      <w:r>
+        <w:t>interpretation</w:t>
+      </w:r>
+      <w:proofErr w:type="spellEnd"/>
+      <w:r>
+        <w:t xml:space="preserve"> commentair</w:t>
+      </w:r>
+      <w:r>
+        <w:t>e</w:t>
+      </w:r>
+      <w:r>
+        <w:t xml:space="preserve"> de ce rapport</w:t>
+      </w:r>
+      <w:r>
+        <w:t xml:space="preserve">, à la fin tu dois me donnez une conclusion comparative des activités s'il y a eu </w:t>
+      </w:r>
+      <w:proofErr w:type="spellStart"/>
+      <w:r>
+        <w:t>echec</w:t>
+      </w:r>
+      <w:proofErr w:type="spellEnd"/>
+      <w:r>
+        <w:t xml:space="preserve"> ou perte ou encore j'ai bien </w:t>
+      </w:r>
+      <w:proofErr w:type="gramStart"/>
+      <w:r>
+        <w:t>calibrer</w:t>
+      </w:r>
+      <w:proofErr w:type="gramEnd"/>
+      <w:r>
+        <w:t xml:space="preserve"> les </w:t>
+      </w:r>
+      <w:proofErr w:type="spellStart"/>
+      <w:r>
+        <w:t>depenses</w:t>
+      </w:r>
+      <w:proofErr w:type="spellEnd"/>
+      <w:r>
+        <w:t xml:space="preserve"> par rapport aux ventes. </w:t>
       </w:r>
     </w:p>
     <w:p>
@@ -452,104 +1035,130 @@
         </w:numPr>
       </w:pPr>
       <w:r>
-        <w:t xml:space="preserve">ce rapport doit contenir les entête de la boutique, le logo et toutes les information. </w:t>
-      </w:r>
-    </w:p>
-    <w:p>
-      <w:pPr>
-        <w:pStyle w:val="NormalWeb"/>
+        <w:lastRenderedPageBreak/>
+        <w:t xml:space="preserve">Il y a une possibilité que le lien publié via </w:t>
+      </w:r>
+      <w:proofErr w:type="spellStart"/>
+      <w:r>
+        <w:t>netlify</w:t>
+      </w:r>
+      <w:proofErr w:type="spellEnd"/>
+      <w:r>
+        <w:t>, que l’application</w:t>
+      </w:r>
+      <w:r>
+        <w:t xml:space="preserve"> soit installable en cliquant sur le navigateur</w:t>
+      </w:r>
+    </w:p>
+    <w:p>
+      <w:pPr>
+        <w:pStyle w:val="Paragraphedeliste"/>
+      </w:pPr>
+    </w:p>
+    <w:p>
+      <w:pPr>
+        <w:pStyle w:val="Paragraphedeliste"/>
+      </w:pPr>
+    </w:p>
+    <w:p>
+      <w:r>
+        <w:t xml:space="preserve">Affichage de </w:t>
+      </w:r>
+      <w:proofErr w:type="spellStart"/>
+      <w:r>
+        <w:t>fenetre</w:t>
+      </w:r>
+      <w:proofErr w:type="spellEnd"/>
+      <w:r>
+        <w:t xml:space="preserve"> par profil :</w:t>
+      </w:r>
+    </w:p>
+    <w:p>
+      <w:pPr>
+        <w:pStyle w:val="Paragraphedeliste"/>
         <w:numPr>
           <w:ilvl w:val="0"/>
           <w:numId w:val="1"/>
         </w:numPr>
-      </w:pPr>
-      <w:r>
-        <w:t xml:space="preserve">aussi dans le resumé et interpretation commentair, à la fin tu dois me donnez une conclusion comparative des activités s'il y a eu echec ou perte ou encore j'ai bien calibrer les depenses par rapport aux ventes. </w:t>
-      </w:r>
-    </w:p>
-    <w:p>
-      <w:pPr>
-        <w:pStyle w:val="NormalWeb"/>
+        <w:rPr>
+          <w:highlight w:val="yellow"/>
+        </w:rPr>
+      </w:pPr>
+      <w:r>
+        <w:rPr>
+          <w:highlight w:val="yellow"/>
+        </w:rPr>
+        <w:t xml:space="preserve">Que seul </w:t>
+      </w:r>
+      <w:r>
+        <w:rPr>
+          <w:highlight w:val="yellow"/>
+        </w:rPr>
+        <w:t>super-admin puisse voir la valeur du stock dans stock actuel,</w:t>
+      </w:r>
+      <w:r>
+        <w:rPr>
+          <w:highlight w:val="yellow"/>
+        </w:rPr>
+        <w:t xml:space="preserve"> ta table historique, utilisateur</w:t>
+      </w:r>
+    </w:p>
+    <w:p>
+      <w:pPr>
+        <w:pStyle w:val="Paragraphedeliste"/>
         <w:numPr>
           <w:ilvl w:val="0"/>
           <w:numId w:val="1"/>
         </w:numPr>
       </w:pPr>
-      <w:r>
-        <w:lastRenderedPageBreak/>
-        <w:t>Il y a une possibilité que le lien publié via netlify, que l’application</w:t>
-      </w:r>
-      <w:r>
-        <w:t xml:space="preserve"> soit installable en cliquant sur le navigateur</w:t>
-      </w:r>
-    </w:p>
-    <w:p>
-      <w:pPr>
-        <w:pStyle w:val="Paragraphedeliste"/>
-      </w:pPr>
-    </w:p>
-    <w:p>
-      <w:pPr>
-        <w:pStyle w:val="Paragraphedeliste"/>
-      </w:pPr>
-    </w:p>
-    <w:p>
-      <w:r>
-        <w:t>Affichage de fenetre par profil :</w:t>
-      </w:r>
-    </w:p>
-    <w:p>
-      <w:pPr>
-        <w:pStyle w:val="Paragraphedeliste"/>
-        <w:numPr>
-          <w:ilvl w:val="0"/>
-          <w:numId w:val="1"/>
-        </w:numPr>
-        <w:rPr>
-          <w:highlight w:val="yellow"/>
-        </w:rPr>
-      </w:pPr>
-      <w:r>
-        <w:rPr>
-          <w:highlight w:val="yellow"/>
-        </w:rPr>
-        <w:t xml:space="preserve">Que seul </w:t>
-      </w:r>
-      <w:r>
-        <w:rPr>
-          <w:highlight w:val="yellow"/>
-        </w:rPr>
-        <w:t>super-admin puisse voir la valeur du stock dans stock actuel,</w:t>
-      </w:r>
-      <w:r>
-        <w:rPr>
-          <w:highlight w:val="yellow"/>
-        </w:rPr>
-        <w:t xml:space="preserve"> ta table historique, utilisateur</w:t>
-      </w:r>
-    </w:p>
-    <w:p>
-      <w:pPr>
-        <w:pStyle w:val="Paragraphedeliste"/>
-        <w:numPr>
-          <w:ilvl w:val="0"/>
-          <w:numId w:val="1"/>
-        </w:numPr>
-      </w:pPr>
+      <w:proofErr w:type="gramStart"/>
       <w:r>
         <w:t>La tablea</w:t>
       </w:r>
       <w:r>
-        <w:t>u qui montre les details de toutes les ventes et services fait durant une periode</w:t>
-      </w:r>
-      <w:r>
-        <w:t>, les grafiques, les montants donc tous</w:t>
+        <w:t>u</w:t>
+      </w:r>
+      <w:proofErr w:type="gramEnd"/>
+      <w:r>
+        <w:t xml:space="preserve"> qui montre les </w:t>
+      </w:r>
+      <w:proofErr w:type="spellStart"/>
+      <w:r>
+        <w:t>details</w:t>
+      </w:r>
+      <w:proofErr w:type="spellEnd"/>
+      <w:r>
+        <w:t xml:space="preserve"> de toutes les ventes et services fait durant une </w:t>
+      </w:r>
+      <w:proofErr w:type="spellStart"/>
+      <w:r>
+        <w:t>periode</w:t>
+      </w:r>
+      <w:proofErr w:type="spellEnd"/>
+      <w:r>
+        <w:t xml:space="preserve">, les </w:t>
+      </w:r>
+      <w:proofErr w:type="spellStart"/>
+      <w:r>
+        <w:t>grafiques</w:t>
+      </w:r>
+      <w:proofErr w:type="spellEnd"/>
+      <w:r>
+        <w:t>, les montants donc tous</w:t>
       </w:r>
       <w:r>
         <w:t>,</w:t>
       </w:r>
       <w:r>
-        <w:t xml:space="preserve"> ce qu’un simple Admnistrateur ne peut pas voir. </w:t>
+        <w:t xml:space="preserve"> ce qu’un simple </w:t>
+      </w:r>
+      <w:proofErr w:type="spellStart"/>
+      <w:r>
+        <w:t>Admnistrateur</w:t>
+      </w:r>
+      <w:proofErr w:type="spellEnd"/>
+      <w:r>
+        <w:t xml:space="preserve"> ne peut pas voir. </w:t>
       </w:r>
     </w:p>
     <w:p/>
@@ -563,8 +1172,21 @@
         </w:numPr>
       </w:pPr>
       <w:r>
-        <w:t>A la fin Deployer sur Netlify</w:t>
-      </w:r>
+        <w:t xml:space="preserve">A la fin </w:t>
+      </w:r>
+      <w:proofErr w:type="spellStart"/>
+      <w:r>
+        <w:t>Deployer</w:t>
+      </w:r>
+      <w:proofErr w:type="spellEnd"/>
+      <w:r>
+        <w:t xml:space="preserve"> sur </w:t>
+      </w:r>
+      <w:proofErr w:type="spellStart"/>
+      <w:r>
+        <w:t>Netlify</w:t>
+      </w:r>
+      <w:proofErr w:type="spellEnd"/>
     </w:p>
     <w:p>
       <w:pPr>
@@ -590,8 +1212,45 @@
         </w:numPr>
         <w:shd w:val="clear" w:color="auto" w:fill="B4C6E7" w:themeFill="accent1" w:themeFillTint="66"/>
       </w:pPr>
-      <w:r>
-        <w:t>supabase-schema.sql, supabase-auth-migration.sql, supabase-audit-traceability-migration.sql exécutés</w:t>
+      <w:proofErr w:type="spellStart"/>
+      <w:r>
+        <w:t>supabase-schema.sql</w:t>
+      </w:r>
+      <w:proofErr w:type="spellEnd"/>
+      <w:r>
+        <w:t xml:space="preserve">, </w:t>
+      </w:r>
+      <w:proofErr w:type="spellStart"/>
+      <w:r>
+        <w:t>supabase-auth-migration.sql</w:t>
+      </w:r>
+      <w:proofErr w:type="spellEnd"/>
+      <w:r>
+        <w:t xml:space="preserve">, </w:t>
+      </w:r>
+      <w:proofErr w:type="spellStart"/>
+      <w:r>
+        <w:t>supabase</w:t>
+      </w:r>
+      <w:proofErr w:type="spellEnd"/>
+      <w:r>
+        <w:t>-audit-</w:t>
+      </w:r>
+      <w:proofErr w:type="spellStart"/>
+      <w:r>
+        <w:t>traceability</w:t>
+      </w:r>
+      <w:proofErr w:type="spellEnd"/>
+      <w:r>
+        <w:t>-</w:t>
+      </w:r>
+      <w:proofErr w:type="spellStart"/>
+      <w:r>
+        <w:t>migration.sql</w:t>
+      </w:r>
+      <w:proofErr w:type="spellEnd"/>
+      <w:r>
+        <w:t xml:space="preserve"> exécutés</w:t>
       </w:r>
     </w:p>
     <w:p>
@@ -602,8 +1261,63 @@
         </w:numPr>
         <w:shd w:val="clear" w:color="auto" w:fill="B4C6E7" w:themeFill="accent1" w:themeFillTint="66"/>
       </w:pPr>
-      <w:r>
-        <w:t>la fonction touch_last_login() corrigée contient bien where public.users.auth_user_id = auth.uid()</w:t>
+      <w:proofErr w:type="gramStart"/>
+      <w:r>
+        <w:t>la</w:t>
+      </w:r>
+      <w:proofErr w:type="gramEnd"/>
+      <w:r>
+        <w:t xml:space="preserve"> fonction </w:t>
+      </w:r>
+      <w:proofErr w:type="spellStart"/>
+      <w:r>
+        <w:t>touch_last_</w:t>
+      </w:r>
+      <w:proofErr w:type="gramStart"/>
+      <w:r>
+        <w:t>login</w:t>
+      </w:r>
+      <w:proofErr w:type="spellEnd"/>
+      <w:r>
+        <w:t>(</w:t>
+      </w:r>
+      <w:proofErr w:type="gramEnd"/>
+      <w:r>
+        <w:t xml:space="preserve">) corrigée contient bien </w:t>
+      </w:r>
+      <w:proofErr w:type="spellStart"/>
+      <w:r>
+        <w:t>where</w:t>
+      </w:r>
+      <w:proofErr w:type="spellEnd"/>
+      <w:r>
+        <w:t xml:space="preserve"> </w:t>
+      </w:r>
+      <w:proofErr w:type="spellStart"/>
+      <w:proofErr w:type="gramStart"/>
+      <w:r>
+        <w:t>public.users</w:t>
+      </w:r>
+      <w:proofErr w:type="gramEnd"/>
+      <w:r>
+        <w:t>.auth_user_id</w:t>
+      </w:r>
+      <w:proofErr w:type="spellEnd"/>
+      <w:r>
+        <w:t xml:space="preserve"> = </w:t>
+      </w:r>
+      <w:proofErr w:type="spellStart"/>
+      <w:proofErr w:type="gramStart"/>
+      <w:r>
+        <w:t>auth.uid</w:t>
+      </w:r>
+      <w:proofErr w:type="spellEnd"/>
+      <w:r>
+        <w:t>(</w:t>
+      </w:r>
+      <w:proofErr w:type="gramEnd"/>
+      <w:r>
+        <w:t>)</w:t>
       </w:r>
     </w:p>
     <w:p>
@@ -614,9 +1328,37 @@
         </w:numPr>
         <w:shd w:val="clear" w:color="auto" w:fill="B4C6E7" w:themeFill="accent1" w:themeFillTint="66"/>
       </w:pPr>
-      <w:r>
-        <w:t>la table public.users contient ton utilisateur avec le même e-mail que dans Authentication &gt; Users</w:t>
-      </w:r>
+      <w:proofErr w:type="gramStart"/>
+      <w:r>
+        <w:t>la</w:t>
+      </w:r>
+      <w:proofErr w:type="gramEnd"/>
+      <w:r>
+        <w:t xml:space="preserve"> table </w:t>
+      </w:r>
+      <w:proofErr w:type="spellStart"/>
+      <w:proofErr w:type="gramStart"/>
+      <w:r>
+        <w:t>public.users</w:t>
+      </w:r>
+      <w:proofErr w:type="spellEnd"/>
+      <w:proofErr w:type="gramEnd"/>
+      <w:r>
+        <w:t xml:space="preserve"> contient ton utilisateur avec le même e-mail que dans </w:t>
+      </w:r>
+      <w:proofErr w:type="spellStart"/>
+      <w:r>
+        <w:t>Authentication</w:t>
+      </w:r>
+      <w:proofErr w:type="spellEnd"/>
+      <w:r>
+        <w:t xml:space="preserve"> &gt; </w:t>
+      </w:r>
+      <w:proofErr w:type="spellStart"/>
+      <w:r>
+        <w:t>Users</w:t>
+      </w:r>
+      <w:proofErr w:type="spellEnd"/>
     </w:p>
     <w:p>
       <w:pPr>
@@ -626,17 +1368,37 @@
         </w:numPr>
         <w:shd w:val="clear" w:color="auto" w:fill="B4C6E7" w:themeFill="accent1" w:themeFillTint="66"/>
       </w:pPr>
-      <w:r>
-        <w:t>ton utilisateur a role = 'Super admin' et active = true</w:t>
-      </w:r>
+      <w:proofErr w:type="gramStart"/>
+      <w:r>
+        <w:t>ton</w:t>
+      </w:r>
+      <w:proofErr w:type="gramEnd"/>
+      <w:r>
+        <w:t xml:space="preserve"> utilisateur a </w:t>
+      </w:r>
+      <w:proofErr w:type="spellStart"/>
+      <w:r>
+        <w:t>role</w:t>
+      </w:r>
+      <w:proofErr w:type="spellEnd"/>
+      <w:r>
+        <w:t xml:space="preserve"> = 'Super admin' et active = </w:t>
+      </w:r>
+      <w:proofErr w:type="spellStart"/>
+      <w:r>
+        <w:t>true</w:t>
+      </w:r>
+      <w:proofErr w:type="spellEnd"/>
     </w:p>
     <w:p>
       <w:pPr>
         <w:shd w:val="clear" w:color="auto" w:fill="B4C6E7" w:themeFill="accent1" w:themeFillTint="66"/>
       </w:pPr>
+      <w:proofErr w:type="spellStart"/>
       <w:r>
         <w:t>Netlify</w:t>
       </w:r>
+      <w:proofErr w:type="spellEnd"/>
     </w:p>
     <w:p>
       <w:pPr>
@@ -646,8 +1408,21 @@
         </w:numPr>
         <w:shd w:val="clear" w:color="auto" w:fill="B4C6E7" w:themeFill="accent1" w:themeFillTint="66"/>
       </w:pPr>
-      <w:r>
-        <w:t>le dernier commit poussé sur main apparaît bien sur GitHub</w:t>
+      <w:proofErr w:type="gramStart"/>
+      <w:r>
+        <w:t>le</w:t>
+      </w:r>
+      <w:proofErr w:type="gramEnd"/>
+      <w:r>
+        <w:t xml:space="preserve"> dernier commit </w:t>
+      </w:r>
+      <w:proofErr w:type="gramStart"/>
+      <w:r>
+        <w:t>poussé</w:t>
+      </w:r>
+      <w:proofErr w:type="gramEnd"/>
+      <w:r>
+        <w:t xml:space="preserve"> sur main apparaît bien sur GitHub</w:t>
       </w:r>
     </w:p>
     <w:p>
@@ -658,9 +1433,27 @@
         </w:numPr>
         <w:shd w:val="clear" w:color="auto" w:fill="B4C6E7" w:themeFill="accent1" w:themeFillTint="66"/>
       </w:pPr>
-      <w:r>
-        <w:t>le déploiement Netlify est passé en Published</w:t>
-      </w:r>
+      <w:proofErr w:type="gramStart"/>
+      <w:r>
+        <w:t>le</w:t>
+      </w:r>
+      <w:proofErr w:type="gramEnd"/>
+      <w:r>
+        <w:t xml:space="preserve"> déploiement </w:t>
+      </w:r>
+      <w:proofErr w:type="spellStart"/>
+      <w:r>
+        <w:t>Netlify</w:t>
+      </w:r>
+      <w:proofErr w:type="spellEnd"/>
+      <w:r>
+        <w:t xml:space="preserve"> est passé en </w:t>
+      </w:r>
+      <w:proofErr w:type="spellStart"/>
+      <w:r>
+        <w:t>Published</w:t>
+      </w:r>
+      <w:proofErr w:type="spellEnd"/>
     </w:p>
     <w:p>
       <w:pPr>
@@ -670,8 +1463,13 @@
         </w:numPr>
         <w:shd w:val="clear" w:color="auto" w:fill="B4C6E7" w:themeFill="accent1" w:themeFillTint="66"/>
       </w:pPr>
-      <w:r>
-        <w:t>les variables VITE_SUPABASE_URL et VITE_SUPABASE_ANON_KEY sont bien configurées</w:t>
+      <w:proofErr w:type="gramStart"/>
+      <w:r>
+        <w:t>les</w:t>
+      </w:r>
+      <w:proofErr w:type="gramEnd"/>
+      <w:r>
+        <w:t xml:space="preserve"> variables VITE_SUPABASE_URL et VITE_SUPABASE_ANON_KEY sont bien configurées</w:t>
       </w:r>
     </w:p>
     <w:p>
@@ -682,16 +1480,31 @@
         </w:numPr>
         <w:shd w:val="clear" w:color="auto" w:fill="B4C6E7" w:themeFill="accent1" w:themeFillTint="66"/>
       </w:pPr>
-      <w:r>
-        <w:t>la connexion web fonctionne avec ton compte Supabase</w:t>
-      </w:r>
+      <w:proofErr w:type="gramStart"/>
+      <w:r>
+        <w:t>la</w:t>
+      </w:r>
+      <w:proofErr w:type="gramEnd"/>
+      <w:r>
+        <w:t xml:space="preserve"> connexion web fonctionne avec ton compte </w:t>
+      </w:r>
+      <w:proofErr w:type="spellStart"/>
+      <w:r>
+        <w:t>Supabase</w:t>
+      </w:r>
+      <w:proofErr w:type="spellEnd"/>
     </w:p>
     <w:p>
       <w:pPr>
         <w:shd w:val="clear" w:color="auto" w:fill="B4C6E7" w:themeFill="accent1" w:themeFillTint="66"/>
       </w:pPr>
-      <w:r>
-        <w:t>desktop .exe</w:t>
+      <w:proofErr w:type="gramStart"/>
+      <w:r>
+        <w:t>desktop</w:t>
+      </w:r>
+      <w:proofErr w:type="gramEnd"/>
+      <w:r>
+        <w:t xml:space="preserve"> .exe</w:t>
       </w:r>
     </w:p>
     <w:p>
@@ -702,8 +1515,13 @@
         </w:numPr>
         <w:shd w:val="clear" w:color="auto" w:fill="B4C6E7" w:themeFill="accent1" w:themeFillTint="66"/>
       </w:pPr>
-      <w:r>
-        <w:t>un nouvel .exe a été reconstruit après les changements</w:t>
+      <w:proofErr w:type="gramStart"/>
+      <w:r>
+        <w:t>un</w:t>
+      </w:r>
+      <w:proofErr w:type="gramEnd"/>
+      <w:r>
+        <w:t xml:space="preserve"> nouvel .exe a été reconstruit après les changements</w:t>
       </w:r>
     </w:p>
     <w:p>
@@ -714,9 +1532,19 @@
         </w:numPr>
         <w:shd w:val="clear" w:color="auto" w:fill="B4C6E7" w:themeFill="accent1" w:themeFillTint="66"/>
       </w:pPr>
-      <w:r>
-        <w:t>avec internet, la connexion desktop fonctionne avec le compte Supabase</w:t>
-      </w:r>
+      <w:proofErr w:type="gramStart"/>
+      <w:r>
+        <w:t>avec</w:t>
+      </w:r>
+      <w:proofErr w:type="gramEnd"/>
+      <w:r>
+        <w:t xml:space="preserve"> internet, la connexion desktop fonctionne avec le compte </w:t>
+      </w:r>
+      <w:proofErr w:type="spellStart"/>
+      <w:r>
+        <w:t>Supabase</w:t>
+      </w:r>
+      <w:proofErr w:type="spellEnd"/>
     </w:p>
     <w:p>
       <w:pPr>
@@ -726,8 +1554,13 @@
         </w:numPr>
         <w:shd w:val="clear" w:color="auto" w:fill="B4C6E7" w:themeFill="accent1" w:themeFillTint="66"/>
       </w:pPr>
-      <w:r>
-        <w:t>après cette première connexion, le même compte peut se reconnecter hors ligne</w:t>
+      <w:proofErr w:type="gramStart"/>
+      <w:r>
+        <w:t>après</w:t>
+      </w:r>
+      <w:proofErr w:type="gramEnd"/>
+      <w:r>
+        <w:t xml:space="preserve"> cette première connexion, le même compte peut se reconnecter hors ligne</w:t>
       </w:r>
     </w:p>
     <w:p>
@@ -738,8 +1571,21 @@
         </w:numPr>
         <w:shd w:val="clear" w:color="auto" w:fill="B4C6E7" w:themeFill="accent1" w:themeFillTint="66"/>
       </w:pPr>
-      <w:r>
-        <w:t>la synchronisation desktop → Supabase fonctionne quand la connexion revient</w:t>
+      <w:proofErr w:type="gramStart"/>
+      <w:r>
+        <w:t>la</w:t>
+      </w:r>
+      <w:proofErr w:type="gramEnd"/>
+      <w:r>
+        <w:t xml:space="preserve"> synchronisation desktop → </w:t>
+      </w:r>
+      <w:proofErr w:type="spellStart"/>
+      <w:r>
+        <w:t>Supabase</w:t>
+      </w:r>
+      <w:proofErr w:type="spellEnd"/>
+      <w:r>
+        <w:t xml:space="preserve"> fonctionne quand la connexion revient</w:t>
       </w:r>
     </w:p>
     <w:p>
@@ -753,13 +1599,37 @@
     <w:p/>
     <w:p>
       <w:r>
-        <w:t>Alors la prochaine étape est simple: connecter ton dépôt GitHub à Netlify.</w:t>
+        <w:t xml:space="preserve">Alors la prochaine étape est </w:t>
+      </w:r>
+      <w:proofErr w:type="gramStart"/>
+      <w:r>
+        <w:t>simple:</w:t>
+      </w:r>
+      <w:proofErr w:type="gramEnd"/>
+      <w:r>
+        <w:t xml:space="preserve"> connecter ton dépôt GitHub à </w:t>
+      </w:r>
+      <w:proofErr w:type="spellStart"/>
+      <w:r>
+        <w:t>Netlify</w:t>
+      </w:r>
+      <w:proofErr w:type="spellEnd"/>
+      <w:r>
+        <w:t>.</w:t>
       </w:r>
     </w:p>
     <w:p>
       <w:r>
         <w:lastRenderedPageBreak/>
-        <w:t>Fais ceci dans Netlify :</w:t>
+        <w:t xml:space="preserve">Fais ceci dans </w:t>
+      </w:r>
+      <w:proofErr w:type="spellStart"/>
+      <w:r>
+        <w:t>Netlify</w:t>
+      </w:r>
+      <w:proofErr w:type="spellEnd"/>
+      <w:r>
+        <w:t xml:space="preserve"> :</w:t>
       </w:r>
     </w:p>
     <w:p>
@@ -781,8 +1651,21 @@
         </w:numPr>
       </w:pPr>
       <w:r>
-        <w:t>Import an existing project</w:t>
-      </w:r>
+        <w:t xml:space="preserve">Import an </w:t>
+      </w:r>
+      <w:proofErr w:type="spellStart"/>
+      <w:r>
+        <w:t>existing</w:t>
+      </w:r>
+      <w:proofErr w:type="spellEnd"/>
+      <w:r>
+        <w:t xml:space="preserve"> </w:t>
+      </w:r>
+      <w:proofErr w:type="spellStart"/>
+      <w:r>
+        <w:t>project</w:t>
+      </w:r>
+      <w:proofErr w:type="spellEnd"/>
     </w:p>
     <w:p>
       <w:pPr>
@@ -791,8 +1674,13 @@
           <w:numId w:val="5"/>
         </w:numPr>
       </w:pPr>
-      <w:r>
-        <w:t>connecte GitHub</w:t>
+      <w:proofErr w:type="gramStart"/>
+      <w:r>
+        <w:t>connecte</w:t>
+      </w:r>
+      <w:proofErr w:type="gramEnd"/>
+      <w:r>
+        <w:t xml:space="preserve"> GitHub</w:t>
       </w:r>
     </w:p>
     <w:p>
@@ -802,8 +1690,21 @@
           <w:numId w:val="5"/>
         </w:numPr>
       </w:pPr>
-      <w:r>
-        <w:t>choisis le dépôt walikaletoworldrt-hue/Gestion-papeterie</w:t>
+      <w:proofErr w:type="gramStart"/>
+      <w:r>
+        <w:t>choisis</w:t>
+      </w:r>
+      <w:proofErr w:type="gramEnd"/>
+      <w:r>
+        <w:t xml:space="preserve"> le dépôt </w:t>
+      </w:r>
+      <w:proofErr w:type="spellStart"/>
+      <w:r>
+        <w:t>walikaletoworldrt</w:t>
+      </w:r>
+      <w:proofErr w:type="spellEnd"/>
+      <w:r>
+        <w:t>-hue/Gestion-papeterie</w:t>
       </w:r>
     </w:p>
     <w:p>
@@ -813,8 +1714,13 @@
           <w:numId w:val="5"/>
         </w:numPr>
       </w:pPr>
-      <w:r>
-        <w:t>vérifie les réglages :</w:t>
+      <w:proofErr w:type="gramStart"/>
+      <w:r>
+        <w:t>vérifie</w:t>
+      </w:r>
+      <w:proofErr w:type="gramEnd"/>
+      <w:r>
+        <w:t xml:space="preserve"> les réglages :</w:t>
       </w:r>
     </w:p>
     <w:p>
@@ -831,8 +1737,46 @@
         <w:rPr>
           <w:lang w:val="en-US"/>
         </w:rPr>
-        <w:t>Build command : npm run build:renderer</w:t>
-      </w:r>
+        <w:t xml:space="preserve">Build </w:t>
+      </w:r>
+      <w:proofErr w:type="gramStart"/>
+      <w:r>
+        <w:rPr>
+          <w:lang w:val="en-US"/>
+        </w:rPr>
+        <w:t>command :</w:t>
+      </w:r>
+      <w:proofErr w:type="gramEnd"/>
+      <w:r>
+        <w:rPr>
+          <w:lang w:val="en-US"/>
+        </w:rPr>
+        <w:t xml:space="preserve"> </w:t>
+      </w:r>
+      <w:proofErr w:type="spellStart"/>
+      <w:r>
+        <w:rPr>
+          <w:lang w:val="en-US"/>
+        </w:rPr>
+        <w:t>npm</w:t>
+      </w:r>
+      <w:proofErr w:type="spellEnd"/>
+      <w:r>
+        <w:rPr>
+          <w:lang w:val="en-US"/>
+        </w:rPr>
+        <w:t xml:space="preserve"> run </w:t>
+      </w:r>
+      <w:proofErr w:type="spellStart"/>
+      <w:proofErr w:type="gramStart"/>
+      <w:r>
+        <w:rPr>
+          <w:lang w:val="en-US"/>
+        </w:rPr>
+        <w:t>build:renderer</w:t>
+      </w:r>
+      <w:proofErr w:type="spellEnd"/>
+      <w:proofErr w:type="gramEnd"/>
     </w:p>
     <w:p>
       <w:pPr>
@@ -841,9 +1785,19 @@
           <w:numId w:val="5"/>
         </w:numPr>
       </w:pPr>
-      <w:r>
-        <w:t>Publish directory : dist</w:t>
-      </w:r>
+      <w:proofErr w:type="spellStart"/>
+      <w:r>
+        <w:t>Publish</w:t>
+      </w:r>
+      <w:proofErr w:type="spellEnd"/>
+      <w:r>
+        <w:t xml:space="preserve"> directory : </w:t>
+      </w:r>
+      <w:proofErr w:type="spellStart"/>
+      <w:r>
+        <w:t>dist</w:t>
+      </w:r>
+      <w:proofErr w:type="spellEnd"/>
     </w:p>
     <w:p>
       <w:pPr>
@@ -863,8 +1817,13 @@
           <w:numId w:val="5"/>
         </w:numPr>
       </w:pPr>
-      <w:r>
-        <w:t>ajoute les variables d’environnement :</w:t>
+      <w:proofErr w:type="gramStart"/>
+      <w:r>
+        <w:t>ajoute</w:t>
+      </w:r>
+      <w:proofErr w:type="gramEnd"/>
+      <w:r>
+        <w:t xml:space="preserve"> les variables d’environnement :</w:t>
       </w:r>
     </w:p>
     <w:p>
@@ -896,8 +1855,13 @@
           <w:numId w:val="5"/>
         </w:numPr>
       </w:pPr>
-      <w:r>
-        <w:t>lance le déploiement</w:t>
+      <w:proofErr w:type="gramStart"/>
+      <w:r>
+        <w:t>lance</w:t>
+      </w:r>
+      <w:proofErr w:type="gramEnd"/>
+      <w:r>
+        <w:t xml:space="preserve"> le déploiement</w:t>
       </w:r>
     </w:p>
     <w:p>
@@ -906,11 +1870,133 @@
           <w:lang w:val="en-US"/>
         </w:rPr>
       </w:pPr>
+      <w:proofErr w:type="spellStart"/>
       <w:r>
         <w:rPr>
           <w:lang w:val="en-US"/>
         </w:rPr>
-        <w:t>Ces réglages sont déjà cohérents avec [netlify.toml (line 1)](C:/Users/User/OneDrive/Projet Code/Walikale to world App/netlify.toml:1) et [NETLIFY_DEPLOYMENT.md (line 1)](C:/Users/User/OneDrive/Projet Code/Walikale to world App/NETLIFY_DEPLOYMENT.md:1).</w:t>
+        <w:t>Ces</w:t>
+      </w:r>
+      <w:proofErr w:type="spellEnd"/>
+      <w:r>
+        <w:rPr>
+          <w:lang w:val="en-US"/>
+        </w:rPr>
+        <w:t xml:space="preserve"> </w:t>
+      </w:r>
+      <w:proofErr w:type="spellStart"/>
+      <w:r>
+        <w:rPr>
+          <w:lang w:val="en-US"/>
+        </w:rPr>
+        <w:t>réglages</w:t>
+      </w:r>
+      <w:proofErr w:type="spellEnd"/>
+      <w:r>
+        <w:rPr>
+          <w:lang w:val="en-US"/>
+        </w:rPr>
+        <w:t xml:space="preserve"> </w:t>
+      </w:r>
+      <w:proofErr w:type="spellStart"/>
+      <w:r>
+        <w:rPr>
+          <w:lang w:val="en-US"/>
+        </w:rPr>
+        <w:t>sont</w:t>
+      </w:r>
+      <w:proofErr w:type="spellEnd"/>
+      <w:r>
+        <w:rPr>
+          <w:lang w:val="en-US"/>
+        </w:rPr>
+        <w:t xml:space="preserve"> déjà </w:t>
+      </w:r>
+      <w:proofErr w:type="spellStart"/>
+      <w:r>
+        <w:rPr>
+          <w:lang w:val="en-US"/>
+        </w:rPr>
+        <w:t>cohérents</w:t>
+      </w:r>
+      <w:proofErr w:type="spellEnd"/>
+      <w:r>
+        <w:rPr>
+          <w:lang w:val="en-US"/>
+        </w:rPr>
+        <w:t xml:space="preserve"> avec [</w:t>
+      </w:r>
+      <w:proofErr w:type="spellStart"/>
+      <w:proofErr w:type="gramStart"/>
+      <w:r>
+        <w:rPr>
+          <w:lang w:val="en-US"/>
+        </w:rPr>
+        <w:t>netlify.toml</w:t>
+      </w:r>
+      <w:proofErr w:type="spellEnd"/>
+      <w:proofErr w:type="gramEnd"/>
+      <w:r>
+        <w:rPr>
+          <w:lang w:val="en-US"/>
+        </w:rPr>
+        <w:t xml:space="preserve"> (line 1</w:t>
+      </w:r>
+      <w:proofErr w:type="gramStart"/>
+      <w:r>
+        <w:rPr>
+          <w:lang w:val="en-US"/>
+        </w:rPr>
+        <w:t>)](</w:t>
+      </w:r>
+      <w:proofErr w:type="gramEnd"/>
+      <w:r>
+        <w:rPr>
+          <w:lang w:val="en-US"/>
+        </w:rPr>
+        <w:t>C:/Users/User/OneDrive/Projet Code/</w:t>
+      </w:r>
+      <w:proofErr w:type="spellStart"/>
+      <w:r>
+        <w:rPr>
+          <w:lang w:val="en-US"/>
+        </w:rPr>
+        <w:t>Walikale</w:t>
+      </w:r>
+      <w:proofErr w:type="spellEnd"/>
+      <w:r>
+        <w:rPr>
+          <w:lang w:val="en-US"/>
+        </w:rPr>
+        <w:t xml:space="preserve"> to world App/netlify.toml:1) et [NETLIFY_DEPLOYMENT.md (line 1</w:t>
+      </w:r>
+      <w:proofErr w:type="gramStart"/>
+      <w:r>
+        <w:rPr>
+          <w:lang w:val="en-US"/>
+        </w:rPr>
+        <w:t>)](</w:t>
+      </w:r>
+      <w:proofErr w:type="gramEnd"/>
+      <w:r>
+        <w:rPr>
+          <w:lang w:val="en-US"/>
+        </w:rPr>
+        <w:t>C:/Users/User/OneDrive/Projet Code/</w:t>
+      </w:r>
+      <w:proofErr w:type="spellStart"/>
+      <w:r>
+        <w:rPr>
+          <w:lang w:val="en-US"/>
+        </w:rPr>
+        <w:t>Walikale</w:t>
+      </w:r>
+      <w:proofErr w:type="spellEnd"/>
+      <w:r>
+        <w:rPr>
+          <w:lang w:val="en-US"/>
+        </w:rPr>
+        <w:t xml:space="preserve"> to world App/NETLIFY_DEPLOYMENT.md:1).</w:t>
       </w:r>
     </w:p>
     <w:p>
@@ -925,8 +2011,21 @@
           <w:numId w:val="6"/>
         </w:numPr>
       </w:pPr>
-      <w:r>
-        <w:t>sur Netlify, utilise bien les noms VITE_SUPABASE_URL et VITE_SUPABASE_ANON_KEY</w:t>
+      <w:proofErr w:type="gramStart"/>
+      <w:r>
+        <w:t>sur</w:t>
+      </w:r>
+      <w:proofErr w:type="gramEnd"/>
+      <w:r>
+        <w:t xml:space="preserve"> </w:t>
+      </w:r>
+      <w:proofErr w:type="spellStart"/>
+      <w:r>
+        <w:t>Netlify</w:t>
+      </w:r>
+      <w:proofErr w:type="spellEnd"/>
+      <w:r>
+        <w:t>, utilise bien les noms VITE_SUPABASE_URL et VITE_SUPABASE_ANON_KEY</w:t>
       </w:r>
     </w:p>
     <w:p>
@@ -936,8 +2035,13 @@
           <w:numId w:val="6"/>
         </w:numPr>
       </w:pPr>
-      <w:r>
-        <w:t>pas NEXT_PUBLIC_*, car ton app est en Vite</w:t>
+      <w:proofErr w:type="gramStart"/>
+      <w:r>
+        <w:t>pas</w:t>
+      </w:r>
+      <w:proofErr w:type="gramEnd"/>
+      <w:r>
+        <w:t xml:space="preserve"> NEXT_PUBLIC_*, car ton app est en Vite</w:t>
       </w:r>
     </w:p>
     <w:p>
@@ -952,9 +2056,27 @@
           <w:numId w:val="7"/>
         </w:numPr>
       </w:pPr>
-      <w:r>
-        <w:t>l’état du build Netlify</w:t>
-      </w:r>
+      <w:proofErr w:type="gramStart"/>
+      <w:r>
+        <w:t>l’état</w:t>
+      </w:r>
+      <w:proofErr w:type="gramEnd"/>
+      <w:r>
+        <w:t xml:space="preserve"> du </w:t>
+      </w:r>
+      <w:proofErr w:type="spellStart"/>
+      <w:r>
+        <w:t>build</w:t>
+      </w:r>
+      <w:proofErr w:type="spellEnd"/>
+      <w:r>
+        <w:t xml:space="preserve"> </w:t>
+      </w:r>
+      <w:proofErr w:type="spellStart"/>
+      <w:r>
+        <w:t>Netlify</w:t>
+      </w:r>
+      <w:proofErr w:type="spellEnd"/>
     </w:p>
     <w:p>
       <w:pPr>
@@ -963,8 +2085,13 @@
           <w:numId w:val="7"/>
         </w:numPr>
       </w:pPr>
-      <w:r>
-        <w:t>et si tu veux, l’URL du site déployé</w:t>
+      <w:proofErr w:type="gramStart"/>
+      <w:r>
+        <w:t>et</w:t>
+      </w:r>
+      <w:proofErr w:type="gramEnd"/>
+      <w:r>
+        <w:t xml:space="preserve"> si tu veux, l’URL du site déployé</w:t>
       </w:r>
     </w:p>
     <w:p>

</xml_diff>

<commit_message>
ajuste de mode de creation des utilisateurs
</commit_message>
<xml_diff>
--- a/Projet Application Papeterie walikale to world.docx
+++ b/Projet Application Papeterie walikale to world.docx
@@ -961,68 +961,122 @@
           <w:ilvl w:val="0"/>
           <w:numId w:val="1"/>
         </w:numPr>
-      </w:pPr>
-      <w:proofErr w:type="gramStart"/>
-      <w:r>
+        <w:rPr>
+          <w:highlight w:val="yellow"/>
+        </w:rPr>
+      </w:pPr>
+      <w:proofErr w:type="gramStart"/>
+      <w:r>
+        <w:rPr>
+          <w:highlight w:val="yellow"/>
+        </w:rPr>
         <w:t>aussi</w:t>
       </w:r>
       <w:proofErr w:type="gramEnd"/>
       <w:r>
+        <w:rPr>
+          <w:highlight w:val="yellow"/>
+        </w:rPr>
         <w:t xml:space="preserve"> dans </w:t>
       </w:r>
       <w:r>
+        <w:rPr>
+          <w:highlight w:val="yellow"/>
+        </w:rPr>
         <w:t>la zone</w:t>
       </w:r>
       <w:r>
+        <w:rPr>
+          <w:highlight w:val="yellow"/>
+        </w:rPr>
         <w:t xml:space="preserve"> </w:t>
       </w:r>
       <w:proofErr w:type="spellStart"/>
       <w:r>
+        <w:rPr>
+          <w:highlight w:val="yellow"/>
+        </w:rPr>
         <w:t>resumé</w:t>
       </w:r>
       <w:proofErr w:type="spellEnd"/>
       <w:r>
+        <w:rPr>
+          <w:highlight w:val="yellow"/>
+        </w:rPr>
         <w:t xml:space="preserve"> et </w:t>
       </w:r>
       <w:proofErr w:type="spellStart"/>
       <w:r>
+        <w:rPr>
+          <w:highlight w:val="yellow"/>
+        </w:rPr>
         <w:t>interpretation</w:t>
       </w:r>
       <w:proofErr w:type="spellEnd"/>
       <w:r>
+        <w:rPr>
+          <w:highlight w:val="yellow"/>
+        </w:rPr>
         <w:t xml:space="preserve"> commentair</w:t>
       </w:r>
       <w:r>
+        <w:rPr>
+          <w:highlight w:val="yellow"/>
+        </w:rPr>
         <w:t>e</w:t>
       </w:r>
       <w:r>
+        <w:rPr>
+          <w:highlight w:val="yellow"/>
+        </w:rPr>
         <w:t xml:space="preserve"> de ce rapport</w:t>
       </w:r>
       <w:r>
+        <w:rPr>
+          <w:highlight w:val="yellow"/>
+        </w:rPr>
         <w:t xml:space="preserve">, à la fin tu dois me donnez une conclusion comparative des activités s'il y a eu </w:t>
       </w:r>
       <w:proofErr w:type="spellStart"/>
       <w:r>
+        <w:rPr>
+          <w:highlight w:val="yellow"/>
+        </w:rPr>
         <w:t>echec</w:t>
       </w:r>
       <w:proofErr w:type="spellEnd"/>
       <w:r>
+        <w:rPr>
+          <w:highlight w:val="yellow"/>
+        </w:rPr>
         <w:t xml:space="preserve"> ou perte ou encore j'ai bien </w:t>
       </w:r>
       <w:proofErr w:type="gramStart"/>
       <w:r>
+        <w:rPr>
+          <w:highlight w:val="yellow"/>
+        </w:rPr>
         <w:t>calibrer</w:t>
       </w:r>
       <w:proofErr w:type="gramEnd"/>
       <w:r>
+        <w:rPr>
+          <w:highlight w:val="yellow"/>
+        </w:rPr>
         <w:t xml:space="preserve"> les </w:t>
       </w:r>
       <w:proofErr w:type="spellStart"/>
       <w:r>
+        <w:rPr>
+          <w:highlight w:val="yellow"/>
+        </w:rPr>
         <w:t>depenses</w:t>
       </w:r>
       <w:proofErr w:type="spellEnd"/>
       <w:r>
+        <w:rPr>
+          <w:highlight w:val="yellow"/>
+        </w:rPr>
         <w:t xml:space="preserve"> par rapport aux ventes. </w:t>
       </w:r>
     </w:p>

</xml_diff>

<commit_message>
les droits admin suite
</commit_message>
<xml_diff>
--- a/Projet Application Papeterie walikale to world.docx
+++ b/Projet Application Papeterie walikale to world.docx
@@ -4,7 +4,15 @@
   <w:body>
     <w:p>
       <w:r>
-        <w:t>Projet Papeterie walikale to world</w:t>
+        <w:t xml:space="preserve">Projet Papeterie </w:t>
+      </w:r>
+      <w:proofErr w:type="spellStart"/>
+      <w:r>
+        <w:t>walikale</w:t>
+      </w:r>
+      <w:proofErr w:type="spellEnd"/>
+      <w:r>
+        <w:t xml:space="preserve"> to world</w:t>
       </w:r>
     </w:p>
     <w:p>
@@ -21,8 +29,13 @@
         </w:numPr>
       </w:pPr>
       <w:r>
-        <w:t>Gestion vente papeterie y compris les depenses</w:t>
-      </w:r>
+        <w:t xml:space="preserve">Gestion vente papeterie y compris les </w:t>
+      </w:r>
+      <w:proofErr w:type="spellStart"/>
+      <w:r>
+        <w:t>depenses</w:t>
+      </w:r>
+      <w:proofErr w:type="spellEnd"/>
     </w:p>
     <w:p>
       <w:pPr>
@@ -33,8 +46,13 @@
         </w:numPr>
       </w:pPr>
       <w:r>
-        <w:t>Gestion du personnel (les salaires, primes)..</w:t>
-      </w:r>
+        <w:t>Gestion du personnel (les salaires, primes</w:t>
+      </w:r>
+      <w:proofErr w:type="gramStart"/>
+      <w:r>
+        <w:t>)..</w:t>
+      </w:r>
+      <w:proofErr w:type="gramEnd"/>
     </w:p>
     <w:p>
       <w:pPr>
@@ -44,7 +62,15 @@
         <w:t xml:space="preserve">L’application doit être en ligne pour permettre le suivi à distance, </w:t>
       </w:r>
       <w:r>
-        <w:t xml:space="preserve">mais aussi fonctionne en hors ligne aussi et synchronise une fois connecté à internet. </w:t>
+        <w:t xml:space="preserve">mais aussi fonctionne en hors ligne aussi et synchronise une fois </w:t>
+      </w:r>
+      <w:proofErr w:type="gramStart"/>
+      <w:r>
+        <w:t>connecté</w:t>
+      </w:r>
+      <w:proofErr w:type="gramEnd"/>
+      <w:r>
+        <w:t xml:space="preserve"> à internet. </w:t>
       </w:r>
     </w:p>
     <w:p>
@@ -86,13 +112,41 @@
         <w:rPr>
           <w:highlight w:val="yellow"/>
         </w:rPr>
-        <w:t>Ceux qui modifie en local puisse avoir la possibilité de travailler meme sans internet et synchroniser en cliquant sur le bouton synchroniser a</w:t>
-      </w:r>
-      <w:r>
-        <w:rPr>
-          <w:highlight w:val="yellow"/>
-        </w:rPr>
-        <w:t>fin que cela puisse pusher vers supabase.</w:t>
+        <w:t xml:space="preserve">Ceux qui modifie en local puisse avoir la possibilité de travailler </w:t>
+      </w:r>
+      <w:proofErr w:type="spellStart"/>
+      <w:r>
+        <w:rPr>
+          <w:highlight w:val="yellow"/>
+        </w:rPr>
+        <w:t>meme</w:t>
+      </w:r>
+      <w:proofErr w:type="spellEnd"/>
+      <w:r>
+        <w:rPr>
+          <w:highlight w:val="yellow"/>
+        </w:rPr>
+        <w:t xml:space="preserve"> sans internet et synchroniser en cliquant sur le bouton synchroniser a</w:t>
+      </w:r>
+      <w:r>
+        <w:rPr>
+          <w:highlight w:val="yellow"/>
+        </w:rPr>
+        <w:t xml:space="preserve">fin que cela puisse pusher vers </w:t>
+      </w:r>
+      <w:proofErr w:type="spellStart"/>
+      <w:r>
+        <w:rPr>
+          <w:highlight w:val="yellow"/>
+        </w:rPr>
+        <w:t>supabase</w:t>
+      </w:r>
+      <w:proofErr w:type="spellEnd"/>
+      <w:r>
+        <w:rPr>
+          <w:highlight w:val="yellow"/>
+        </w:rPr>
+        <w:t>.</w:t>
       </w:r>
       <w:r>
         <w:t xml:space="preserve"> </w:t>
@@ -143,7 +197,21 @@
         <w:rPr>
           <w:highlight w:val="yellow"/>
         </w:rPr>
-        <w:t>a fenetre d’approvisionnement</w:t>
+        <w:t xml:space="preserve">a </w:t>
+      </w:r>
+      <w:proofErr w:type="spellStart"/>
+      <w:r>
+        <w:rPr>
+          <w:highlight w:val="yellow"/>
+        </w:rPr>
+        <w:t>fenetre</w:t>
+      </w:r>
+      <w:proofErr w:type="spellEnd"/>
+      <w:r>
+        <w:rPr>
+          <w:highlight w:val="yellow"/>
+        </w:rPr>
+        <w:t xml:space="preserve"> d’approvisionnement</w:t>
       </w:r>
       <w:r>
         <w:rPr>
@@ -179,7 +247,21 @@
         <w:rPr>
           <w:highlight w:val="yellow"/>
         </w:rPr>
-        <w:t>Historique d’approvisionnement (pour avoir une trace de tous les approvisionnement fait)</w:t>
+        <w:t xml:space="preserve">Historique d’approvisionnement (pour avoir une trace de </w:t>
+      </w:r>
+      <w:proofErr w:type="gramStart"/>
+      <w:r>
+        <w:rPr>
+          <w:highlight w:val="yellow"/>
+        </w:rPr>
+        <w:t>tous les approvisionnement</w:t>
+      </w:r>
+      <w:proofErr w:type="gramEnd"/>
+      <w:r>
+        <w:rPr>
+          <w:highlight w:val="yellow"/>
+        </w:rPr>
+        <w:t xml:space="preserve"> fait)</w:t>
       </w:r>
     </w:p>
     <w:p>
@@ -197,20 +279,64 @@
         <w:rPr>
           <w:highlight w:val="yellow"/>
         </w:rPr>
-        <w:t>Enlever les 00 apres le chiffre, par exemple pour une produit vendu</w:t>
-      </w:r>
-      <w:r>
-        <w:rPr>
-          <w:highlight w:val="yellow"/>
-        </w:rPr>
-        <w:t xml:space="preserve"> à 500fc, mettez seulement 500FC et 500.00FC. aussi la quantité d’approvisionnement, laissez la case vide et ne mettez pas 0 </w:t>
-      </w:r>
-      <w:r>
-        <w:rPr>
-          <w:highlight w:val="yellow"/>
-        </w:rPr>
-        <w:t>au prealable</w:t>
-      </w:r>
+        <w:t xml:space="preserve">Enlever les 00 </w:t>
+      </w:r>
+      <w:proofErr w:type="spellStart"/>
+      <w:r>
+        <w:rPr>
+          <w:highlight w:val="yellow"/>
+        </w:rPr>
+        <w:t>apres</w:t>
+      </w:r>
+      <w:proofErr w:type="spellEnd"/>
+      <w:r>
+        <w:rPr>
+          <w:highlight w:val="yellow"/>
+        </w:rPr>
+        <w:t xml:space="preserve"> le chiffre, par exemple pour </w:t>
+      </w:r>
+      <w:proofErr w:type="gramStart"/>
+      <w:r>
+        <w:rPr>
+          <w:highlight w:val="yellow"/>
+        </w:rPr>
+        <w:t>une produit vendu</w:t>
+      </w:r>
+      <w:proofErr w:type="gramEnd"/>
+      <w:r>
+        <w:rPr>
+          <w:highlight w:val="yellow"/>
+        </w:rPr>
+        <w:t xml:space="preserve"> à 500fc, mettez seulement 500FC et 500.00FC. </w:t>
+      </w:r>
+      <w:proofErr w:type="gramStart"/>
+      <w:r>
+        <w:rPr>
+          <w:highlight w:val="yellow"/>
+        </w:rPr>
+        <w:t>aussi</w:t>
+      </w:r>
+      <w:proofErr w:type="gramEnd"/>
+      <w:r>
+        <w:rPr>
+          <w:highlight w:val="yellow"/>
+        </w:rPr>
+        <w:t xml:space="preserve"> la quantité d’approvisionnement, laissez la case vide et ne mettez pas 0 </w:t>
+      </w:r>
+      <w:r>
+        <w:rPr>
+          <w:highlight w:val="yellow"/>
+        </w:rPr>
+        <w:t xml:space="preserve">au </w:t>
+      </w:r>
+      <w:proofErr w:type="spellStart"/>
+      <w:r>
+        <w:rPr>
+          <w:highlight w:val="yellow"/>
+        </w:rPr>
+        <w:t>prealable</w:t>
+      </w:r>
+      <w:proofErr w:type="spellEnd"/>
       <w:r>
         <w:rPr>
           <w:highlight w:val="yellow"/>
@@ -269,7 +395,21 @@
         <w:rPr>
           <w:highlight w:val="yellow"/>
         </w:rPr>
-        <w:t xml:space="preserve">Dans la table produit, mettre cette fenetre comme le formulaire d’approvisionnement, </w:t>
+        <w:t xml:space="preserve">Dans la table produit, mettre cette </w:t>
+      </w:r>
+      <w:proofErr w:type="spellStart"/>
+      <w:r>
+        <w:rPr>
+          <w:highlight w:val="yellow"/>
+        </w:rPr>
+        <w:t>fenetre</w:t>
+      </w:r>
+      <w:proofErr w:type="spellEnd"/>
+      <w:r>
+        <w:rPr>
+          <w:highlight w:val="yellow"/>
+        </w:rPr>
+        <w:t xml:space="preserve"> comme le formulaire d’approvisionnement, </w:t>
       </w:r>
     </w:p>
     <w:p>
@@ -287,25 +427,123 @@
         <w:rPr>
           <w:highlight w:val="yellow"/>
         </w:rPr>
-        <w:t>La fenetre de depenses engagées</w:t>
-      </w:r>
-      <w:r>
-        <w:rPr>
-          <w:highlight w:val="yellow"/>
-        </w:rPr>
-        <w:t xml:space="preserve"> (elle doit avoir le detail, nature de la depense, montant, date,</w:t>
-      </w:r>
-      <w:r>
-        <w:rPr>
-          <w:highlight w:val="yellow"/>
-        </w:rPr>
-        <w:t xml:space="preserve"> quelle utilisateur, qui a approuvé le decaissement de l’argent</w:t>
-      </w:r>
-      <w:r>
-        <w:rPr>
-          <w:highlight w:val="yellow"/>
-        </w:rPr>
-        <w:t>, la depense va servir à quoi</w:t>
+        <w:t xml:space="preserve">La </w:t>
+      </w:r>
+      <w:proofErr w:type="spellStart"/>
+      <w:r>
+        <w:rPr>
+          <w:highlight w:val="yellow"/>
+        </w:rPr>
+        <w:t>fenetre</w:t>
+      </w:r>
+      <w:proofErr w:type="spellEnd"/>
+      <w:r>
+        <w:rPr>
+          <w:highlight w:val="yellow"/>
+        </w:rPr>
+        <w:t xml:space="preserve"> de </w:t>
+      </w:r>
+      <w:proofErr w:type="spellStart"/>
+      <w:r>
+        <w:rPr>
+          <w:highlight w:val="yellow"/>
+        </w:rPr>
+        <w:t>depenses</w:t>
+      </w:r>
+      <w:proofErr w:type="spellEnd"/>
+      <w:r>
+        <w:rPr>
+          <w:highlight w:val="yellow"/>
+        </w:rPr>
+        <w:t xml:space="preserve"> engagées</w:t>
+      </w:r>
+      <w:r>
+        <w:rPr>
+          <w:highlight w:val="yellow"/>
+        </w:rPr>
+        <w:t xml:space="preserve"> (elle doit avoir le </w:t>
+      </w:r>
+      <w:proofErr w:type="spellStart"/>
+      <w:r>
+        <w:rPr>
+          <w:highlight w:val="yellow"/>
+        </w:rPr>
+        <w:t>detail</w:t>
+      </w:r>
+      <w:proofErr w:type="spellEnd"/>
+      <w:r>
+        <w:rPr>
+          <w:highlight w:val="yellow"/>
+        </w:rPr>
+        <w:t xml:space="preserve">, nature de la </w:t>
+      </w:r>
+      <w:proofErr w:type="spellStart"/>
+      <w:r>
+        <w:rPr>
+          <w:highlight w:val="yellow"/>
+        </w:rPr>
+        <w:t>depense</w:t>
+      </w:r>
+      <w:proofErr w:type="spellEnd"/>
+      <w:r>
+        <w:rPr>
+          <w:highlight w:val="yellow"/>
+        </w:rPr>
+        <w:t>, montant, date,</w:t>
+      </w:r>
+      <w:r>
+        <w:rPr>
+          <w:highlight w:val="yellow"/>
+        </w:rPr>
+        <w:t xml:space="preserve"> </w:t>
+      </w:r>
+      <w:proofErr w:type="gramStart"/>
+      <w:r>
+        <w:rPr>
+          <w:highlight w:val="yellow"/>
+        </w:rPr>
+        <w:t>quelle utilisateur</w:t>
+      </w:r>
+      <w:proofErr w:type="gramEnd"/>
+      <w:r>
+        <w:rPr>
+          <w:highlight w:val="yellow"/>
+        </w:rPr>
+        <w:t xml:space="preserve">, qui a approuvé le </w:t>
+      </w:r>
+      <w:proofErr w:type="spellStart"/>
+      <w:r>
+        <w:rPr>
+          <w:highlight w:val="yellow"/>
+        </w:rPr>
+        <w:t>decaissement</w:t>
+      </w:r>
+      <w:proofErr w:type="spellEnd"/>
+      <w:r>
+        <w:rPr>
+          <w:highlight w:val="yellow"/>
+        </w:rPr>
+        <w:t xml:space="preserve"> de l’argent</w:t>
+      </w:r>
+      <w:r>
+        <w:rPr>
+          <w:highlight w:val="yellow"/>
+        </w:rPr>
+        <w:t xml:space="preserve">, la </w:t>
+      </w:r>
+      <w:proofErr w:type="spellStart"/>
+      <w:r>
+        <w:rPr>
+          <w:highlight w:val="yellow"/>
+        </w:rPr>
+        <w:t>depense</w:t>
+      </w:r>
+      <w:proofErr w:type="spellEnd"/>
+      <w:r>
+        <w:rPr>
+          <w:highlight w:val="yellow"/>
+        </w:rPr>
+        <w:t xml:space="preserve"> va servir à quoi</w:t>
       </w:r>
       <w:r>
         <w:rPr>
@@ -317,7 +555,21 @@
         <w:rPr>
           <w:highlight w:val="yellow"/>
         </w:rPr>
-        <w:t xml:space="preserve">puisse avoir un impacte déjà sur le montant vendu. </w:t>
+        <w:t xml:space="preserve">puisse avoir un </w:t>
+      </w:r>
+      <w:proofErr w:type="spellStart"/>
+      <w:r>
+        <w:rPr>
+          <w:highlight w:val="yellow"/>
+        </w:rPr>
+        <w:t>impacte</w:t>
+      </w:r>
+      <w:proofErr w:type="spellEnd"/>
+      <w:r>
+        <w:rPr>
+          <w:highlight w:val="yellow"/>
+        </w:rPr>
+        <w:t xml:space="preserve"> déjà sur le montant vendu. </w:t>
       </w:r>
     </w:p>
     <w:p>
@@ -335,13 +587,41 @@
         <w:rPr>
           <w:highlight w:val="yellow"/>
         </w:rPr>
-        <w:t>Une possibilité d’avoir des graphiques triable par date juste pour savoir combien j’ai fait entrer</w:t>
-      </w:r>
-      <w:r>
-        <w:rPr>
-          <w:highlight w:val="yellow"/>
-        </w:rPr>
-        <w:t xml:space="preserve"> pendant telle periode.</w:t>
+        <w:t xml:space="preserve">Une possibilité d’avoir des graphiques </w:t>
+      </w:r>
+      <w:proofErr w:type="spellStart"/>
+      <w:r>
+        <w:rPr>
+          <w:highlight w:val="yellow"/>
+        </w:rPr>
+        <w:t>triable</w:t>
+      </w:r>
+      <w:proofErr w:type="spellEnd"/>
+      <w:r>
+        <w:rPr>
+          <w:highlight w:val="yellow"/>
+        </w:rPr>
+        <w:t xml:space="preserve"> par date juste pour savoir combien j’ai fait entrer</w:t>
+      </w:r>
+      <w:r>
+        <w:rPr>
+          <w:highlight w:val="yellow"/>
+        </w:rPr>
+        <w:t xml:space="preserve"> pendant telle </w:t>
+      </w:r>
+      <w:proofErr w:type="spellStart"/>
+      <w:r>
+        <w:rPr>
+          <w:highlight w:val="yellow"/>
+        </w:rPr>
+        <w:t>periode</w:t>
+      </w:r>
+      <w:proofErr w:type="spellEnd"/>
+      <w:r>
+        <w:rPr>
+          <w:highlight w:val="yellow"/>
+        </w:rPr>
+        <w:t>.</w:t>
       </w:r>
     </w:p>
     <w:p>
@@ -359,31 +639,173 @@
         <w:rPr>
           <w:highlight w:val="yellow"/>
         </w:rPr>
-        <w:t>Dans la fenetre depense qu’il ait un bouton qui genere le rapport complet, combine de vente</w:t>
-      </w:r>
-      <w:r>
-        <w:rPr>
-          <w:highlight w:val="yellow"/>
-        </w:rPr>
-        <w:t xml:space="preserve"> par chaque produit, service fait, quelle depense avec ses details, et le solde</w:t>
-      </w:r>
-      <w:r>
-        <w:rPr>
-          <w:highlight w:val="yellow"/>
-        </w:rPr>
-        <w:t xml:space="preserve"> apres toutes les depenses</w:t>
-      </w:r>
+        <w:t xml:space="preserve">Dans la </w:t>
+      </w:r>
+      <w:proofErr w:type="spellStart"/>
+      <w:r>
+        <w:rPr>
+          <w:highlight w:val="yellow"/>
+        </w:rPr>
+        <w:t>fenetre</w:t>
+      </w:r>
+      <w:proofErr w:type="spellEnd"/>
+      <w:r>
+        <w:rPr>
+          <w:highlight w:val="yellow"/>
+        </w:rPr>
+        <w:t xml:space="preserve"> </w:t>
+      </w:r>
+      <w:proofErr w:type="spellStart"/>
+      <w:r>
+        <w:rPr>
+          <w:highlight w:val="yellow"/>
+        </w:rPr>
+        <w:t>depense</w:t>
+      </w:r>
+      <w:proofErr w:type="spellEnd"/>
+      <w:r>
+        <w:rPr>
+          <w:highlight w:val="yellow"/>
+        </w:rPr>
+        <w:t xml:space="preserve"> qu’il ait un bouton qui </w:t>
+      </w:r>
+      <w:proofErr w:type="spellStart"/>
+      <w:r>
+        <w:rPr>
+          <w:highlight w:val="yellow"/>
+        </w:rPr>
+        <w:t>genere</w:t>
+      </w:r>
+      <w:proofErr w:type="spellEnd"/>
+      <w:r>
+        <w:rPr>
+          <w:highlight w:val="yellow"/>
+        </w:rPr>
+        <w:t xml:space="preserve"> le rapport complet, combine de vente</w:t>
+      </w:r>
+      <w:r>
+        <w:rPr>
+          <w:highlight w:val="yellow"/>
+        </w:rPr>
+        <w:t xml:space="preserve"> par chaque produit, service fait, quelle </w:t>
+      </w:r>
+      <w:proofErr w:type="spellStart"/>
+      <w:r>
+        <w:rPr>
+          <w:highlight w:val="yellow"/>
+        </w:rPr>
+        <w:t>depense</w:t>
+      </w:r>
+      <w:proofErr w:type="spellEnd"/>
+      <w:r>
+        <w:rPr>
+          <w:highlight w:val="yellow"/>
+        </w:rPr>
+        <w:t xml:space="preserve"> avec ses </w:t>
+      </w:r>
+      <w:proofErr w:type="spellStart"/>
+      <w:r>
+        <w:rPr>
+          <w:highlight w:val="yellow"/>
+        </w:rPr>
+        <w:t>details</w:t>
+      </w:r>
+      <w:proofErr w:type="spellEnd"/>
+      <w:r>
+        <w:rPr>
+          <w:highlight w:val="yellow"/>
+        </w:rPr>
+        <w:t>, et le solde</w:t>
+      </w:r>
+      <w:r>
+        <w:rPr>
+          <w:highlight w:val="yellow"/>
+        </w:rPr>
+        <w:t xml:space="preserve"> </w:t>
+      </w:r>
+      <w:proofErr w:type="spellStart"/>
+      <w:r>
+        <w:rPr>
+          <w:highlight w:val="yellow"/>
+        </w:rPr>
+        <w:t>apres</w:t>
+      </w:r>
+      <w:proofErr w:type="spellEnd"/>
+      <w:r>
+        <w:rPr>
+          <w:highlight w:val="yellow"/>
+        </w:rPr>
+        <w:t xml:space="preserve"> toutes les </w:t>
+      </w:r>
+      <w:proofErr w:type="spellStart"/>
+      <w:r>
+        <w:rPr>
+          <w:highlight w:val="yellow"/>
+        </w:rPr>
+        <w:t>depenses</w:t>
+      </w:r>
+      <w:proofErr w:type="spellEnd"/>
       <w:r>
         <w:rPr>
           <w:highlight w:val="yellow"/>
         </w:rPr>
         <w:t xml:space="preserve"> faites. </w:t>
       </w:r>
-      <w:r>
-        <w:rPr>
-          <w:highlight w:val="yellow"/>
-        </w:rPr>
-        <w:t xml:space="preserve">qui montre toutes les actions faites (saisie impression, photocopie, scan, autre, vente fourniture, connexion internet, vente eau pure….) et que cela cree un total par service, si c’est saisie impression combien ? si c’est internet combien ?..., </w:t>
+      <w:proofErr w:type="gramStart"/>
+      <w:r>
+        <w:rPr>
+          <w:highlight w:val="yellow"/>
+        </w:rPr>
+        <w:t>qui</w:t>
+      </w:r>
+      <w:proofErr w:type="gramEnd"/>
+      <w:r>
+        <w:rPr>
+          <w:highlight w:val="yellow"/>
+        </w:rPr>
+        <w:t xml:space="preserve"> montre toutes les actions faites (saisie impression, photocopie, scan, autre, vente fourniture, connexion internet, vente eau </w:t>
+      </w:r>
+      <w:proofErr w:type="gramStart"/>
+      <w:r>
+        <w:rPr>
+          <w:highlight w:val="yellow"/>
+        </w:rPr>
+        <w:t>pure….</w:t>
+      </w:r>
+      <w:proofErr w:type="gramEnd"/>
+      <w:r>
+        <w:rPr>
+          <w:highlight w:val="yellow"/>
+        </w:rPr>
+        <w:t xml:space="preserve">) et que cela </w:t>
+      </w:r>
+      <w:proofErr w:type="spellStart"/>
+      <w:r>
+        <w:rPr>
+          <w:highlight w:val="yellow"/>
+        </w:rPr>
+        <w:t>cree</w:t>
+      </w:r>
+      <w:proofErr w:type="spellEnd"/>
+      <w:r>
+        <w:rPr>
+          <w:highlight w:val="yellow"/>
+        </w:rPr>
+        <w:t xml:space="preserve"> un total par service, si c’est saisie impression combien ? si c’est internet combien</w:t>
+      </w:r>
+      <w:proofErr w:type="gramStart"/>
+      <w:r>
+        <w:rPr>
+          <w:highlight w:val="yellow"/>
+        </w:rPr>
+        <w:t> ?...</w:t>
+      </w:r>
+      <w:proofErr w:type="gramEnd"/>
+      <w:r>
+        <w:rPr>
+          <w:highlight w:val="yellow"/>
+        </w:rPr>
+        <w:t xml:space="preserve">, </w:t>
       </w:r>
     </w:p>
     <w:p>
@@ -410,8 +832,21 @@
         </w:numPr>
       </w:pPr>
       <w:r>
-        <w:t>Dans la table historique approvisionnement je voulais savoir aussi l’utilisateur qui a faire la reappro</w:t>
-      </w:r>
+        <w:t xml:space="preserve">Dans la table historique approvisionnement je voulais savoir aussi l’utilisateur qui </w:t>
+      </w:r>
+      <w:proofErr w:type="spellStart"/>
+      <w:r>
+        <w:t>a</w:t>
+      </w:r>
+      <w:proofErr w:type="spellEnd"/>
+      <w:r>
+        <w:t xml:space="preserve"> faire la </w:t>
+      </w:r>
+      <w:proofErr w:type="spellStart"/>
+      <w:r>
+        <w:t>reappro</w:t>
+      </w:r>
+      <w:proofErr w:type="spellEnd"/>
     </w:p>
     <w:p>
       <w:pPr>
@@ -424,11 +859,19 @@
           <w:rFonts w:asciiTheme="minorHAnsi" w:hAnsiTheme="minorHAnsi" w:cstheme="minorHAnsi"/>
         </w:rPr>
       </w:pPr>
-      <w:r>
-        <w:rPr>
-          <w:rFonts w:asciiTheme="minorHAnsi" w:hAnsiTheme="minorHAnsi" w:cstheme="minorHAnsi"/>
-        </w:rPr>
-        <w:t xml:space="preserve">on va encore retravailler pour rendre propre la facture et pas trop encombrante, </w:t>
+      <w:proofErr w:type="gramStart"/>
+      <w:r>
+        <w:rPr>
+          <w:rFonts w:asciiTheme="minorHAnsi" w:hAnsiTheme="minorHAnsi" w:cstheme="minorHAnsi"/>
+        </w:rPr>
+        <w:t>on</w:t>
+      </w:r>
+      <w:proofErr w:type="gramEnd"/>
+      <w:r>
+        <w:rPr>
+          <w:rFonts w:asciiTheme="minorHAnsi" w:hAnsiTheme="minorHAnsi" w:cstheme="minorHAnsi"/>
+        </w:rPr>
+        <w:t xml:space="preserve"> va encore retravailler pour rendre propre la facture et pas trop encombrante, </w:t>
       </w:r>
     </w:p>
     <w:p>
@@ -442,11 +885,61 @@
           <w:rFonts w:asciiTheme="minorHAnsi" w:hAnsiTheme="minorHAnsi" w:cstheme="minorHAnsi"/>
         </w:rPr>
       </w:pPr>
-      <w:r>
-        <w:rPr>
-          <w:rFonts w:asciiTheme="minorHAnsi" w:hAnsiTheme="minorHAnsi" w:cstheme="minorHAnsi"/>
-        </w:rPr>
-        <w:t xml:space="preserve">aussi pour le raport financier des ventes et depense je ne veux pas avoir le nom de netlify en haut de la page et </w:t>
+      <w:proofErr w:type="gramStart"/>
+      <w:r>
+        <w:rPr>
+          <w:rFonts w:asciiTheme="minorHAnsi" w:hAnsiTheme="minorHAnsi" w:cstheme="minorHAnsi"/>
+        </w:rPr>
+        <w:t>aussi</w:t>
+      </w:r>
+      <w:proofErr w:type="gramEnd"/>
+      <w:r>
+        <w:rPr>
+          <w:rFonts w:asciiTheme="minorHAnsi" w:hAnsiTheme="minorHAnsi" w:cstheme="minorHAnsi"/>
+        </w:rPr>
+        <w:t xml:space="preserve"> pour le </w:t>
+      </w:r>
+      <w:proofErr w:type="spellStart"/>
+      <w:r>
+        <w:rPr>
+          <w:rFonts w:asciiTheme="minorHAnsi" w:hAnsiTheme="minorHAnsi" w:cstheme="minorHAnsi"/>
+        </w:rPr>
+        <w:t>raport</w:t>
+      </w:r>
+      <w:proofErr w:type="spellEnd"/>
+      <w:r>
+        <w:rPr>
+          <w:rFonts w:asciiTheme="minorHAnsi" w:hAnsiTheme="minorHAnsi" w:cstheme="minorHAnsi"/>
+        </w:rPr>
+        <w:t xml:space="preserve"> financier des ventes et </w:t>
+      </w:r>
+      <w:proofErr w:type="spellStart"/>
+      <w:r>
+        <w:rPr>
+          <w:rFonts w:asciiTheme="minorHAnsi" w:hAnsiTheme="minorHAnsi" w:cstheme="minorHAnsi"/>
+        </w:rPr>
+        <w:t>depense</w:t>
+      </w:r>
+      <w:proofErr w:type="spellEnd"/>
+      <w:r>
+        <w:rPr>
+          <w:rFonts w:asciiTheme="minorHAnsi" w:hAnsiTheme="minorHAnsi" w:cstheme="minorHAnsi"/>
+        </w:rPr>
+        <w:t xml:space="preserve"> je ne veux pas avoir le nom de </w:t>
+      </w:r>
+      <w:proofErr w:type="spellStart"/>
+      <w:r>
+        <w:rPr>
+          <w:rFonts w:asciiTheme="minorHAnsi" w:hAnsiTheme="minorHAnsi" w:cstheme="minorHAnsi"/>
+        </w:rPr>
+        <w:t>netlify</w:t>
+      </w:r>
+      <w:proofErr w:type="spellEnd"/>
+      <w:r>
+        <w:rPr>
+          <w:rFonts w:asciiTheme="minorHAnsi" w:hAnsiTheme="minorHAnsi" w:cstheme="minorHAnsi"/>
+        </w:rPr>
+        <w:t xml:space="preserve"> en haut de la page et </w:t>
       </w:r>
     </w:p>
     <w:p>
@@ -460,13 +953,47 @@
           <w:rFonts w:asciiTheme="minorHAnsi" w:hAnsiTheme="minorHAnsi" w:cstheme="minorHAnsi"/>
         </w:rPr>
       </w:pPr>
-      <w:r>
-        <w:rPr>
-          <w:rFonts w:asciiTheme="minorHAnsi" w:hAnsiTheme="minorHAnsi" w:cstheme="minorHAnsi"/>
-          <w:highlight w:val="yellow"/>
-        </w:rPr>
-        <w:t>ce rapport doit contenir les entête de la boutique, le logo et toutes les information</w:t>
-      </w:r>
+      <w:proofErr w:type="gramStart"/>
+      <w:r>
+        <w:rPr>
+          <w:rFonts w:asciiTheme="minorHAnsi" w:hAnsiTheme="minorHAnsi" w:cstheme="minorHAnsi"/>
+          <w:highlight w:val="yellow"/>
+        </w:rPr>
+        <w:t>ce</w:t>
+      </w:r>
+      <w:proofErr w:type="gramEnd"/>
+      <w:r>
+        <w:rPr>
+          <w:rFonts w:asciiTheme="minorHAnsi" w:hAnsiTheme="minorHAnsi" w:cstheme="minorHAnsi"/>
+          <w:highlight w:val="yellow"/>
+        </w:rPr>
+        <w:t xml:space="preserve"> rapport doit contenir </w:t>
+      </w:r>
+      <w:proofErr w:type="gramStart"/>
+      <w:r>
+        <w:rPr>
+          <w:rFonts w:asciiTheme="minorHAnsi" w:hAnsiTheme="minorHAnsi" w:cstheme="minorHAnsi"/>
+          <w:highlight w:val="yellow"/>
+        </w:rPr>
+        <w:t>les entête</w:t>
+      </w:r>
+      <w:proofErr w:type="gramEnd"/>
+      <w:r>
+        <w:rPr>
+          <w:rFonts w:asciiTheme="minorHAnsi" w:hAnsiTheme="minorHAnsi" w:cstheme="minorHAnsi"/>
+          <w:highlight w:val="yellow"/>
+        </w:rPr>
+        <w:t xml:space="preserve"> de la boutique, le logo et </w:t>
+      </w:r>
+      <w:proofErr w:type="gramStart"/>
+      <w:r>
+        <w:rPr>
+          <w:rFonts w:asciiTheme="minorHAnsi" w:hAnsiTheme="minorHAnsi" w:cstheme="minorHAnsi"/>
+          <w:highlight w:val="yellow"/>
+        </w:rPr>
+        <w:t>toutes les information</w:t>
+      </w:r>
+      <w:proofErr w:type="gramEnd"/>
       <w:r>
         <w:rPr>
           <w:rFonts w:asciiTheme="minorHAnsi" w:hAnsiTheme="minorHAnsi" w:cstheme="minorHAnsi"/>
@@ -486,12 +1013,21 @@
           <w:highlight w:val="yellow"/>
         </w:rPr>
       </w:pPr>
-      <w:r>
-        <w:rPr>
-          <w:rFonts w:asciiTheme="minorHAnsi" w:hAnsiTheme="minorHAnsi" w:cstheme="minorHAnsi"/>
-          <w:highlight w:val="yellow"/>
-        </w:rPr>
-        <w:t xml:space="preserve">aussi dans </w:t>
+      <w:proofErr w:type="gramStart"/>
+      <w:r>
+        <w:rPr>
+          <w:rFonts w:asciiTheme="minorHAnsi" w:hAnsiTheme="minorHAnsi" w:cstheme="minorHAnsi"/>
+          <w:highlight w:val="yellow"/>
+        </w:rPr>
+        <w:t>aussi</w:t>
+      </w:r>
+      <w:proofErr w:type="gramEnd"/>
+      <w:r>
+        <w:rPr>
+          <w:rFonts w:asciiTheme="minorHAnsi" w:hAnsiTheme="minorHAnsi" w:cstheme="minorHAnsi"/>
+          <w:highlight w:val="yellow"/>
+        </w:rPr>
+        <w:t xml:space="preserve"> dans </w:t>
       </w:r>
       <w:r>
         <w:rPr>
@@ -505,7 +1041,39 @@
           <w:rFonts w:asciiTheme="minorHAnsi" w:hAnsiTheme="minorHAnsi" w:cstheme="minorHAnsi"/>
           <w:highlight w:val="yellow"/>
         </w:rPr>
-        <w:t xml:space="preserve"> resumé et interpretation commentair</w:t>
+        <w:t xml:space="preserve"> </w:t>
+      </w:r>
+      <w:proofErr w:type="spellStart"/>
+      <w:r>
+        <w:rPr>
+          <w:rFonts w:asciiTheme="minorHAnsi" w:hAnsiTheme="minorHAnsi" w:cstheme="minorHAnsi"/>
+          <w:highlight w:val="yellow"/>
+        </w:rPr>
+        <w:t>resumé</w:t>
+      </w:r>
+      <w:proofErr w:type="spellEnd"/>
+      <w:r>
+        <w:rPr>
+          <w:rFonts w:asciiTheme="minorHAnsi" w:hAnsiTheme="minorHAnsi" w:cstheme="minorHAnsi"/>
+          <w:highlight w:val="yellow"/>
+        </w:rPr>
+        <w:t xml:space="preserve"> et </w:t>
+      </w:r>
+      <w:proofErr w:type="spellStart"/>
+      <w:r>
+        <w:rPr>
+          <w:rFonts w:asciiTheme="minorHAnsi" w:hAnsiTheme="minorHAnsi" w:cstheme="minorHAnsi"/>
+          <w:highlight w:val="yellow"/>
+        </w:rPr>
+        <w:t>interpretation</w:t>
+      </w:r>
+      <w:proofErr w:type="spellEnd"/>
+      <w:r>
+        <w:rPr>
+          <w:rFonts w:asciiTheme="minorHAnsi" w:hAnsiTheme="minorHAnsi" w:cstheme="minorHAnsi"/>
+          <w:highlight w:val="yellow"/>
+        </w:rPr>
+        <w:t xml:space="preserve"> commentair</w:t>
       </w:r>
       <w:r>
         <w:rPr>
@@ -526,7 +1094,55 @@
           <w:rFonts w:asciiTheme="minorHAnsi" w:hAnsiTheme="minorHAnsi" w:cstheme="minorHAnsi"/>
           <w:highlight w:val="yellow"/>
         </w:rPr>
-        <w:t xml:space="preserve">, à la fin tu dois me donnez une conclusion comparative des activités s'il y a eu echec ou perte ou encore j'ai bien calibrer les depenses par rapport aux ventes. </w:t>
+        <w:t xml:space="preserve">, à la fin tu dois me donnez une conclusion comparative des activités s'il y a eu </w:t>
+      </w:r>
+      <w:proofErr w:type="spellStart"/>
+      <w:r>
+        <w:rPr>
+          <w:rFonts w:asciiTheme="minorHAnsi" w:hAnsiTheme="minorHAnsi" w:cstheme="minorHAnsi"/>
+          <w:highlight w:val="yellow"/>
+        </w:rPr>
+        <w:t>echec</w:t>
+      </w:r>
+      <w:proofErr w:type="spellEnd"/>
+      <w:r>
+        <w:rPr>
+          <w:rFonts w:asciiTheme="minorHAnsi" w:hAnsiTheme="minorHAnsi" w:cstheme="minorHAnsi"/>
+          <w:highlight w:val="yellow"/>
+        </w:rPr>
+        <w:t xml:space="preserve"> ou perte ou encore j'ai bien </w:t>
+      </w:r>
+      <w:proofErr w:type="gramStart"/>
+      <w:r>
+        <w:rPr>
+          <w:rFonts w:asciiTheme="minorHAnsi" w:hAnsiTheme="minorHAnsi" w:cstheme="minorHAnsi"/>
+          <w:highlight w:val="yellow"/>
+        </w:rPr>
+        <w:t>calibrer</w:t>
+      </w:r>
+      <w:proofErr w:type="gramEnd"/>
+      <w:r>
+        <w:rPr>
+          <w:rFonts w:asciiTheme="minorHAnsi" w:hAnsiTheme="minorHAnsi" w:cstheme="minorHAnsi"/>
+          <w:highlight w:val="yellow"/>
+        </w:rPr>
+        <w:t xml:space="preserve"> les </w:t>
+      </w:r>
+      <w:proofErr w:type="spellStart"/>
+      <w:r>
+        <w:rPr>
+          <w:rFonts w:asciiTheme="minorHAnsi" w:hAnsiTheme="minorHAnsi" w:cstheme="minorHAnsi"/>
+          <w:highlight w:val="yellow"/>
+        </w:rPr>
+        <w:t>depenses</w:t>
+      </w:r>
+      <w:proofErr w:type="spellEnd"/>
+      <w:r>
+        <w:rPr>
+          <w:rFonts w:asciiTheme="minorHAnsi" w:hAnsiTheme="minorHAnsi" w:cstheme="minorHAnsi"/>
+          <w:highlight w:val="yellow"/>
+        </w:rPr>
+        <w:t xml:space="preserve"> par rapport aux ventes. </w:t>
       </w:r>
     </w:p>
     <w:p>
@@ -545,7 +1161,21 @@
           <w:rFonts w:asciiTheme="minorHAnsi" w:hAnsiTheme="minorHAnsi" w:cstheme="minorHAnsi"/>
         </w:rPr>
         <w:lastRenderedPageBreak/>
-        <w:t>Il y a une possibilité que le lien publié via netlify, que l’application</w:t>
+        <w:t xml:space="preserve">Il y a une possibilité que le lien publié via </w:t>
+      </w:r>
+      <w:proofErr w:type="spellStart"/>
+      <w:r>
+        <w:rPr>
+          <w:rFonts w:asciiTheme="minorHAnsi" w:hAnsiTheme="minorHAnsi" w:cstheme="minorHAnsi"/>
+        </w:rPr>
+        <w:t>netlify</w:t>
+      </w:r>
+      <w:proofErr w:type="spellEnd"/>
+      <w:r>
+        <w:rPr>
+          <w:rFonts w:asciiTheme="minorHAnsi" w:hAnsiTheme="minorHAnsi" w:cstheme="minorHAnsi"/>
+        </w:rPr>
+        <w:t>, que l’application</w:t>
       </w:r>
       <w:r>
         <w:rPr>
@@ -566,12 +1196,149 @@
           <w:highlight w:val="yellow"/>
         </w:rPr>
       </w:pPr>
-      <w:r>
-        <w:rPr>
-          <w:rFonts w:asciiTheme="minorHAnsi" w:hAnsiTheme="minorHAnsi" w:cstheme="minorHAnsi"/>
-          <w:highlight w:val="yellow"/>
-        </w:rPr>
-        <w:t>je voulais perfectionner l'action de backup et restauration. je peux venir faire une modification dans l'application pendant qu'elle est deja utlisé par un user, je serai obligé de desinstaller le .exe ancien pour installer le nouveau, là ses données deja enregistré seront peut etre perdu, comment faire pour faire une sauvegarde de toutes les données avant de desinstaller pour importer apres ? et que cela se mette bien automatique (toutes les ventes, produit, client et autres...)</w:t>
+      <w:proofErr w:type="gramStart"/>
+      <w:r>
+        <w:rPr>
+          <w:rFonts w:asciiTheme="minorHAnsi" w:hAnsiTheme="minorHAnsi" w:cstheme="minorHAnsi"/>
+          <w:highlight w:val="yellow"/>
+        </w:rPr>
+        <w:t>je</w:t>
+      </w:r>
+      <w:proofErr w:type="gramEnd"/>
+      <w:r>
+        <w:rPr>
+          <w:rFonts w:asciiTheme="minorHAnsi" w:hAnsiTheme="minorHAnsi" w:cstheme="minorHAnsi"/>
+          <w:highlight w:val="yellow"/>
+        </w:rPr>
+        <w:t xml:space="preserve"> voulais perfectionner l'action de backup et restauration. </w:t>
+      </w:r>
+      <w:proofErr w:type="gramStart"/>
+      <w:r>
+        <w:rPr>
+          <w:rFonts w:asciiTheme="minorHAnsi" w:hAnsiTheme="minorHAnsi" w:cstheme="minorHAnsi"/>
+          <w:highlight w:val="yellow"/>
+        </w:rPr>
+        <w:t>je</w:t>
+      </w:r>
+      <w:proofErr w:type="gramEnd"/>
+      <w:r>
+        <w:rPr>
+          <w:rFonts w:asciiTheme="minorHAnsi" w:hAnsiTheme="minorHAnsi" w:cstheme="minorHAnsi"/>
+          <w:highlight w:val="yellow"/>
+        </w:rPr>
+        <w:t xml:space="preserve"> peux venir faire une modification dans l'application pendant qu'elle est </w:t>
+      </w:r>
+      <w:proofErr w:type="spellStart"/>
+      <w:r>
+        <w:rPr>
+          <w:rFonts w:asciiTheme="minorHAnsi" w:hAnsiTheme="minorHAnsi" w:cstheme="minorHAnsi"/>
+          <w:highlight w:val="yellow"/>
+        </w:rPr>
+        <w:t>deja</w:t>
+      </w:r>
+      <w:proofErr w:type="spellEnd"/>
+      <w:r>
+        <w:rPr>
+          <w:rFonts w:asciiTheme="minorHAnsi" w:hAnsiTheme="minorHAnsi" w:cstheme="minorHAnsi"/>
+          <w:highlight w:val="yellow"/>
+        </w:rPr>
+        <w:t xml:space="preserve"> </w:t>
+      </w:r>
+      <w:proofErr w:type="spellStart"/>
+      <w:r>
+        <w:rPr>
+          <w:rFonts w:asciiTheme="minorHAnsi" w:hAnsiTheme="minorHAnsi" w:cstheme="minorHAnsi"/>
+          <w:highlight w:val="yellow"/>
+        </w:rPr>
+        <w:t>utlisé</w:t>
+      </w:r>
+      <w:proofErr w:type="spellEnd"/>
+      <w:r>
+        <w:rPr>
+          <w:rFonts w:asciiTheme="minorHAnsi" w:hAnsiTheme="minorHAnsi" w:cstheme="minorHAnsi"/>
+          <w:highlight w:val="yellow"/>
+        </w:rPr>
+        <w:t xml:space="preserve"> par un user, je serai obligé de </w:t>
+      </w:r>
+      <w:proofErr w:type="spellStart"/>
+      <w:r>
+        <w:rPr>
+          <w:rFonts w:asciiTheme="minorHAnsi" w:hAnsiTheme="minorHAnsi" w:cstheme="minorHAnsi"/>
+          <w:highlight w:val="yellow"/>
+        </w:rPr>
+        <w:t>desinstaller</w:t>
+      </w:r>
+      <w:proofErr w:type="spellEnd"/>
+      <w:r>
+        <w:rPr>
+          <w:rFonts w:asciiTheme="minorHAnsi" w:hAnsiTheme="minorHAnsi" w:cstheme="minorHAnsi"/>
+          <w:highlight w:val="yellow"/>
+        </w:rPr>
+        <w:t xml:space="preserve"> le .exe ancien pour installer le nouveau, là ses données </w:t>
+      </w:r>
+      <w:proofErr w:type="spellStart"/>
+      <w:r>
+        <w:rPr>
+          <w:rFonts w:asciiTheme="minorHAnsi" w:hAnsiTheme="minorHAnsi" w:cstheme="minorHAnsi"/>
+          <w:highlight w:val="yellow"/>
+        </w:rPr>
+        <w:t>deja</w:t>
+      </w:r>
+      <w:proofErr w:type="spellEnd"/>
+      <w:r>
+        <w:rPr>
+          <w:rFonts w:asciiTheme="minorHAnsi" w:hAnsiTheme="minorHAnsi" w:cstheme="minorHAnsi"/>
+          <w:highlight w:val="yellow"/>
+        </w:rPr>
+        <w:t xml:space="preserve"> enregistré seront peut </w:t>
+      </w:r>
+      <w:proofErr w:type="spellStart"/>
+      <w:r>
+        <w:rPr>
+          <w:rFonts w:asciiTheme="minorHAnsi" w:hAnsiTheme="minorHAnsi" w:cstheme="minorHAnsi"/>
+          <w:highlight w:val="yellow"/>
+        </w:rPr>
+        <w:t>etre</w:t>
+      </w:r>
+      <w:proofErr w:type="spellEnd"/>
+      <w:r>
+        <w:rPr>
+          <w:rFonts w:asciiTheme="minorHAnsi" w:hAnsiTheme="minorHAnsi" w:cstheme="minorHAnsi"/>
+          <w:highlight w:val="yellow"/>
+        </w:rPr>
+        <w:t xml:space="preserve"> perdu, comment faire pour faire une sauvegarde de toutes les données avant de </w:t>
+      </w:r>
+      <w:proofErr w:type="spellStart"/>
+      <w:r>
+        <w:rPr>
+          <w:rFonts w:asciiTheme="minorHAnsi" w:hAnsiTheme="minorHAnsi" w:cstheme="minorHAnsi"/>
+          <w:highlight w:val="yellow"/>
+        </w:rPr>
+        <w:t>desinstaller</w:t>
+      </w:r>
+      <w:proofErr w:type="spellEnd"/>
+      <w:r>
+        <w:rPr>
+          <w:rFonts w:asciiTheme="minorHAnsi" w:hAnsiTheme="minorHAnsi" w:cstheme="minorHAnsi"/>
+          <w:highlight w:val="yellow"/>
+        </w:rPr>
+        <w:t xml:space="preserve"> pour importer </w:t>
+      </w:r>
+      <w:proofErr w:type="spellStart"/>
+      <w:r>
+        <w:rPr>
+          <w:rFonts w:asciiTheme="minorHAnsi" w:hAnsiTheme="minorHAnsi" w:cstheme="minorHAnsi"/>
+          <w:highlight w:val="yellow"/>
+        </w:rPr>
+        <w:t>apres</w:t>
+      </w:r>
+      <w:proofErr w:type="spellEnd"/>
+      <w:r>
+        <w:rPr>
+          <w:rFonts w:asciiTheme="minorHAnsi" w:hAnsiTheme="minorHAnsi" w:cstheme="minorHAnsi"/>
+          <w:highlight w:val="yellow"/>
+        </w:rPr>
+        <w:t xml:space="preserve"> ? et que cela se mette bien automatique (toutes les ventes, produit, client et autres...)</w:t>
       </w:r>
     </w:p>
     <w:p>
@@ -586,12 +1353,37 @@
           <w:highlight w:val="yellow"/>
         </w:rPr>
       </w:pPr>
-      <w:r>
-        <w:rPr>
-          <w:rFonts w:asciiTheme="minorHAnsi" w:hAnsiTheme="minorHAnsi" w:cstheme="minorHAnsi"/>
-          <w:highlight w:val="yellow"/>
-        </w:rPr>
-        <w:t>un administrateur ne peux faire toute action de suppression</w:t>
+      <w:proofErr w:type="gramStart"/>
+      <w:r>
+        <w:rPr>
+          <w:rFonts w:asciiTheme="minorHAnsi" w:hAnsiTheme="minorHAnsi" w:cstheme="minorHAnsi"/>
+          <w:highlight w:val="yellow"/>
+        </w:rPr>
+        <w:t>un</w:t>
+      </w:r>
+      <w:proofErr w:type="gramEnd"/>
+      <w:r>
+        <w:rPr>
+          <w:rFonts w:asciiTheme="minorHAnsi" w:hAnsiTheme="minorHAnsi" w:cstheme="minorHAnsi"/>
+          <w:highlight w:val="yellow"/>
+        </w:rPr>
+        <w:t xml:space="preserve"> administrateur ne </w:t>
+      </w:r>
+      <w:proofErr w:type="gramStart"/>
+      <w:r>
+        <w:rPr>
+          <w:rFonts w:asciiTheme="minorHAnsi" w:hAnsiTheme="minorHAnsi" w:cstheme="minorHAnsi"/>
+          <w:highlight w:val="yellow"/>
+        </w:rPr>
+        <w:t>peux</w:t>
+      </w:r>
+      <w:proofErr w:type="gramEnd"/>
+      <w:r>
+        <w:rPr>
+          <w:rFonts w:asciiTheme="minorHAnsi" w:hAnsiTheme="minorHAnsi" w:cstheme="minorHAnsi"/>
+          <w:highlight w:val="yellow"/>
+        </w:rPr>
+        <w:t xml:space="preserve"> faire toute action de suppression</w:t>
       </w:r>
       <w:r>
         <w:rPr>
@@ -605,7 +1397,15 @@
           <w:rFonts w:asciiTheme="minorHAnsi" w:hAnsiTheme="minorHAnsi" w:cstheme="minorHAnsi"/>
           <w:highlight w:val="yellow"/>
         </w:rPr>
-        <w:t>(pro</w:t>
+        <w:t>(</w:t>
+      </w:r>
+      <w:proofErr w:type="spellStart"/>
+      <w:r>
+        <w:rPr>
+          <w:rFonts w:asciiTheme="minorHAnsi" w:hAnsiTheme="minorHAnsi" w:cstheme="minorHAnsi"/>
+          <w:highlight w:val="yellow"/>
+        </w:rPr>
+        <w:t>pro</w:t>
       </w:r>
       <w:ins w:id="0" w:author="Microsoft Word" w:date="2026-08-16T18:51:00Z" w16du:dateUtc="2026-08-16T16:51:00Z">
         <w:r>
@@ -613,7 +1413,15 @@
             <w:rFonts w:asciiTheme="minorHAnsi" w:hAnsiTheme="minorHAnsi" w:cstheme="minorHAnsi"/>
             <w:highlight w:val="yellow"/>
           </w:rPr>
-          <w:t>ni modification</w:t>
+          <w:t>ni</w:t>
+        </w:r>
+        <w:proofErr w:type="spellEnd"/>
+        <w:r>
+          <w:rPr>
+            <w:rFonts w:asciiTheme="minorHAnsi" w:hAnsiTheme="minorHAnsi" w:cstheme="minorHAnsi"/>
+            <w:highlight w:val="yellow"/>
+          </w:rPr>
+          <w:t xml:space="preserve"> modification</w:t>
         </w:r>
         <w:r>
           <w:rPr>
@@ -627,7 +1435,23 @@
             <w:rFonts w:asciiTheme="minorHAnsi" w:hAnsiTheme="minorHAnsi" w:cstheme="minorHAnsi"/>
             <w:highlight w:val="yellow"/>
           </w:rPr>
-          <w:t>duit, vente,….)</w:t>
+          <w:t xml:space="preserve">duit, </w:t>
+        </w:r>
+        <w:proofErr w:type="gramStart"/>
+        <w:r>
+          <w:rPr>
+            <w:rFonts w:asciiTheme="minorHAnsi" w:hAnsiTheme="minorHAnsi" w:cstheme="minorHAnsi"/>
+            <w:highlight w:val="yellow"/>
+          </w:rPr>
+          <w:t>vente,…</w:t>
+        </w:r>
+        <w:proofErr w:type="gramEnd"/>
+        <w:r>
+          <w:rPr>
+            <w:rFonts w:asciiTheme="minorHAnsi" w:hAnsiTheme="minorHAnsi" w:cstheme="minorHAnsi"/>
+            <w:highlight w:val="yellow"/>
+          </w:rPr>
+          <w:t>.)</w:t>
         </w:r>
       </w:ins>
     </w:p>
@@ -643,6 +1467,7 @@
           <w:highlight w:val="yellow"/>
         </w:rPr>
       </w:pPr>
+      <w:proofErr w:type="gramStart"/>
       <w:r>
         <w:rPr>
           <w:rFonts w:asciiTheme="minorHAnsi" w:hAnsiTheme="minorHAnsi" w:cstheme="minorHAnsi"/>
@@ -657,6 +1482,7 @@
         </w:rPr>
         <w:t>s</w:t>
       </w:r>
+      <w:proofErr w:type="gramEnd"/>
       <w:r>
         <w:rPr>
           <w:rFonts w:asciiTheme="minorHAnsi" w:hAnsiTheme="minorHAnsi" w:cstheme="minorHAnsi"/>
@@ -690,7 +1516,39 @@
           <w:rFonts w:asciiTheme="minorHAnsi" w:hAnsiTheme="minorHAnsi" w:cstheme="minorHAnsi"/>
           <w:highlight w:val="yellow"/>
         </w:rPr>
-        <w:t>vent quand à eux être modifié par les admin, qu’il y ait une possibilité de modifier la description ou le prix.</w:t>
+        <w:t xml:space="preserve">vent </w:t>
+      </w:r>
+      <w:proofErr w:type="gramStart"/>
+      <w:r>
+        <w:rPr>
+          <w:rFonts w:asciiTheme="minorHAnsi" w:hAnsiTheme="minorHAnsi" w:cstheme="minorHAnsi"/>
+          <w:highlight w:val="yellow"/>
+        </w:rPr>
+        <w:t>quand</w:t>
+      </w:r>
+      <w:proofErr w:type="gramEnd"/>
+      <w:r>
+        <w:rPr>
+          <w:rFonts w:asciiTheme="minorHAnsi" w:hAnsiTheme="minorHAnsi" w:cstheme="minorHAnsi"/>
+          <w:highlight w:val="yellow"/>
+        </w:rPr>
+        <w:t xml:space="preserve"> à eux être modifié par </w:t>
+      </w:r>
+      <w:proofErr w:type="gramStart"/>
+      <w:r>
+        <w:rPr>
+          <w:rFonts w:asciiTheme="minorHAnsi" w:hAnsiTheme="minorHAnsi" w:cstheme="minorHAnsi"/>
+          <w:highlight w:val="yellow"/>
+        </w:rPr>
+        <w:t>les admin</w:t>
+      </w:r>
+      <w:proofErr w:type="gramEnd"/>
+      <w:r>
+        <w:rPr>
+          <w:rFonts w:asciiTheme="minorHAnsi" w:hAnsiTheme="minorHAnsi" w:cstheme="minorHAnsi"/>
+          <w:highlight w:val="yellow"/>
+        </w:rPr>
+        <w:t>, qu’il y ait une possibilité de modifier la description ou le prix.</w:t>
       </w:r>
     </w:p>
     <w:p>
@@ -714,7 +1572,21 @@
         <w:rPr>
           <w:rFonts w:asciiTheme="minorHAnsi" w:hAnsiTheme="minorHAnsi" w:cstheme="minorHAnsi"/>
         </w:rPr>
-        <w:t>es clients ou modifier, seulement le superadmin peut le faire.</w:t>
+        <w:t xml:space="preserve">es clients ou modifier, seulement le </w:t>
+      </w:r>
+      <w:proofErr w:type="spellStart"/>
+      <w:r>
+        <w:rPr>
+          <w:rFonts w:asciiTheme="minorHAnsi" w:hAnsiTheme="minorHAnsi" w:cstheme="minorHAnsi"/>
+        </w:rPr>
+        <w:t>superadmin</w:t>
+      </w:r>
+      <w:proofErr w:type="spellEnd"/>
+      <w:r>
+        <w:rPr>
+          <w:rFonts w:asciiTheme="minorHAnsi" w:hAnsiTheme="minorHAnsi" w:cstheme="minorHAnsi"/>
+        </w:rPr>
+        <w:t xml:space="preserve"> peut le faire.</w:t>
       </w:r>
     </w:p>
     <w:p>
@@ -726,29 +1598,34 @@
         </w:numPr>
         <w:rPr>
           <w:rFonts w:asciiTheme="minorHAnsi" w:hAnsiTheme="minorHAnsi" w:cstheme="minorHAnsi"/>
-        </w:rPr>
-      </w:pPr>
-      <w:r>
-        <w:rPr>
-          <w:rFonts w:asciiTheme="minorHAnsi" w:hAnsiTheme="minorHAnsi" w:cstheme="minorHAnsi"/>
+          <w:highlight w:val="yellow"/>
+        </w:rPr>
+      </w:pPr>
+      <w:r>
+        <w:rPr>
+          <w:rFonts w:asciiTheme="minorHAnsi" w:hAnsiTheme="minorHAnsi" w:cstheme="minorHAnsi"/>
+          <w:highlight w:val="yellow"/>
         </w:rPr>
         <w:t>Un admin</w:t>
       </w:r>
       <w:r>
         <w:rPr>
           <w:rFonts w:asciiTheme="minorHAnsi" w:hAnsiTheme="minorHAnsi" w:cstheme="minorHAnsi"/>
+          <w:highlight w:val="yellow"/>
         </w:rPr>
         <w:t>istrateur</w:t>
       </w:r>
       <w:r>
         <w:rPr>
           <w:rFonts w:asciiTheme="minorHAnsi" w:hAnsiTheme="minorHAnsi" w:cstheme="minorHAnsi"/>
+          <w:highlight w:val="yellow"/>
         </w:rPr>
         <w:t xml:space="preserve"> peut ajouter dans approvisionnement mais ne peux pas supprimer ni modifi</w:t>
       </w:r>
       <w:r>
         <w:rPr>
           <w:rFonts w:asciiTheme="minorHAnsi" w:hAnsiTheme="minorHAnsi" w:cstheme="minorHAnsi"/>
+          <w:highlight w:val="yellow"/>
         </w:rPr>
         <w:t>er</w:t>
       </w:r>
@@ -765,7 +1642,15 @@
     </w:p>
     <w:p>
       <w:r>
-        <w:t>Affichage de fenetre par profil :</w:t>
+        <w:t xml:space="preserve">Affichage de </w:t>
+      </w:r>
+      <w:proofErr w:type="spellStart"/>
+      <w:r>
+        <w:t>fenetre</w:t>
+      </w:r>
+      <w:proofErr w:type="spellEnd"/>
+      <w:r>
+        <w:t xml:space="preserve"> par profil :</w:t>
       </w:r>
     </w:p>
     <w:p>
@@ -806,20 +1691,54 @@
           <w:numId w:val="1"/>
         </w:numPr>
       </w:pPr>
+      <w:proofErr w:type="gramStart"/>
       <w:r>
         <w:t>La tablea</w:t>
       </w:r>
       <w:r>
-        <w:t>u qui montre les details de toutes les ventes et services fait durant une periode</w:t>
-      </w:r>
-      <w:r>
-        <w:t>, les grafiques, les montants donc tous</w:t>
+        <w:t>u</w:t>
+      </w:r>
+      <w:proofErr w:type="gramEnd"/>
+      <w:r>
+        <w:t xml:space="preserve"> qui montre les </w:t>
+      </w:r>
+      <w:proofErr w:type="spellStart"/>
+      <w:r>
+        <w:t>details</w:t>
+      </w:r>
+      <w:proofErr w:type="spellEnd"/>
+      <w:r>
+        <w:t xml:space="preserve"> de toutes les ventes et services fait durant une </w:t>
+      </w:r>
+      <w:proofErr w:type="spellStart"/>
+      <w:r>
+        <w:t>periode</w:t>
+      </w:r>
+      <w:proofErr w:type="spellEnd"/>
+      <w:r>
+        <w:t xml:space="preserve">, les </w:t>
+      </w:r>
+      <w:proofErr w:type="spellStart"/>
+      <w:r>
+        <w:t>grafiques</w:t>
+      </w:r>
+      <w:proofErr w:type="spellEnd"/>
+      <w:r>
+        <w:t>, les montants donc tous</w:t>
       </w:r>
       <w:r>
         <w:t>,</w:t>
       </w:r>
       <w:r>
-        <w:t xml:space="preserve"> ce qu’un simple Admnistrateur ne peut pas voir. </w:t>
+        <w:t xml:space="preserve"> ce qu’un simple </w:t>
+      </w:r>
+      <w:proofErr w:type="spellStart"/>
+      <w:r>
+        <w:t>Admnistrateur</w:t>
+      </w:r>
+      <w:proofErr w:type="spellEnd"/>
+      <w:r>
+        <w:t xml:space="preserve"> ne peut pas voir. </w:t>
       </w:r>
     </w:p>
     <w:p/>
@@ -833,8 +1752,21 @@
         </w:numPr>
       </w:pPr>
       <w:r>
-        <w:t>A la fin Deployer sur Netlify</w:t>
-      </w:r>
+        <w:t xml:space="preserve">A la fin </w:t>
+      </w:r>
+      <w:proofErr w:type="spellStart"/>
+      <w:r>
+        <w:t>Deployer</w:t>
+      </w:r>
+      <w:proofErr w:type="spellEnd"/>
+      <w:r>
+        <w:t xml:space="preserve"> sur </w:t>
+      </w:r>
+      <w:proofErr w:type="spellStart"/>
+      <w:r>
+        <w:t>Netlify</w:t>
+      </w:r>
+      <w:proofErr w:type="spellEnd"/>
     </w:p>
     <w:p>
       <w:pPr>
@@ -860,8 +1792,45 @@
         </w:numPr>
         <w:shd w:val="clear" w:color="auto" w:fill="B4C6E7" w:themeFill="accent1" w:themeFillTint="66"/>
       </w:pPr>
-      <w:r>
-        <w:t>supabase-schema.sql, supabase-auth-migration.sql, supabase-audit-traceability-migration.sql exécutés</w:t>
+      <w:proofErr w:type="spellStart"/>
+      <w:r>
+        <w:t>supabase-schema.sql</w:t>
+      </w:r>
+      <w:proofErr w:type="spellEnd"/>
+      <w:r>
+        <w:t xml:space="preserve">, </w:t>
+      </w:r>
+      <w:proofErr w:type="spellStart"/>
+      <w:r>
+        <w:t>supabase-auth-migration.sql</w:t>
+      </w:r>
+      <w:proofErr w:type="spellEnd"/>
+      <w:r>
+        <w:t xml:space="preserve">, </w:t>
+      </w:r>
+      <w:proofErr w:type="spellStart"/>
+      <w:r>
+        <w:t>supabase</w:t>
+      </w:r>
+      <w:proofErr w:type="spellEnd"/>
+      <w:r>
+        <w:t>-audit-</w:t>
+      </w:r>
+      <w:proofErr w:type="spellStart"/>
+      <w:r>
+        <w:t>traceability</w:t>
+      </w:r>
+      <w:proofErr w:type="spellEnd"/>
+      <w:r>
+        <w:t>-</w:t>
+      </w:r>
+      <w:proofErr w:type="spellStart"/>
+      <w:r>
+        <w:t>migration.sql</w:t>
+      </w:r>
+      <w:proofErr w:type="spellEnd"/>
+      <w:r>
+        <w:t xml:space="preserve"> exécutés</w:t>
       </w:r>
     </w:p>
     <w:p>
@@ -872,8 +1841,63 @@
         </w:numPr>
         <w:shd w:val="clear" w:color="auto" w:fill="B4C6E7" w:themeFill="accent1" w:themeFillTint="66"/>
       </w:pPr>
-      <w:r>
-        <w:t>la fonction touch_last_login() corrigée contient bien where public.users.auth_user_id = auth.uid()</w:t>
+      <w:proofErr w:type="gramStart"/>
+      <w:r>
+        <w:t>la</w:t>
+      </w:r>
+      <w:proofErr w:type="gramEnd"/>
+      <w:r>
+        <w:t xml:space="preserve"> fonction </w:t>
+      </w:r>
+      <w:proofErr w:type="spellStart"/>
+      <w:r>
+        <w:t>touch_last_</w:t>
+      </w:r>
+      <w:proofErr w:type="gramStart"/>
+      <w:r>
+        <w:t>login</w:t>
+      </w:r>
+      <w:proofErr w:type="spellEnd"/>
+      <w:r>
+        <w:t>(</w:t>
+      </w:r>
+      <w:proofErr w:type="gramEnd"/>
+      <w:r>
+        <w:t xml:space="preserve">) corrigée contient bien </w:t>
+      </w:r>
+      <w:proofErr w:type="spellStart"/>
+      <w:r>
+        <w:t>where</w:t>
+      </w:r>
+      <w:proofErr w:type="spellEnd"/>
+      <w:r>
+        <w:t xml:space="preserve"> </w:t>
+      </w:r>
+      <w:proofErr w:type="spellStart"/>
+      <w:proofErr w:type="gramStart"/>
+      <w:r>
+        <w:t>public.users</w:t>
+      </w:r>
+      <w:proofErr w:type="gramEnd"/>
+      <w:r>
+        <w:t>.auth_user_id</w:t>
+      </w:r>
+      <w:proofErr w:type="spellEnd"/>
+      <w:r>
+        <w:t xml:space="preserve"> = </w:t>
+      </w:r>
+      <w:proofErr w:type="spellStart"/>
+      <w:proofErr w:type="gramStart"/>
+      <w:r>
+        <w:t>auth.uid</w:t>
+      </w:r>
+      <w:proofErr w:type="spellEnd"/>
+      <w:r>
+        <w:t>(</w:t>
+      </w:r>
+      <w:proofErr w:type="gramEnd"/>
+      <w:r>
+        <w:t>)</w:t>
       </w:r>
     </w:p>
     <w:p>
@@ -884,9 +1908,37 @@
         </w:numPr>
         <w:shd w:val="clear" w:color="auto" w:fill="B4C6E7" w:themeFill="accent1" w:themeFillTint="66"/>
       </w:pPr>
-      <w:r>
-        <w:t>la table public.users contient ton utilisateur avec le même e-mail que dans Authentication &gt; Users</w:t>
-      </w:r>
+      <w:proofErr w:type="gramStart"/>
+      <w:r>
+        <w:t>la</w:t>
+      </w:r>
+      <w:proofErr w:type="gramEnd"/>
+      <w:r>
+        <w:t xml:space="preserve"> table </w:t>
+      </w:r>
+      <w:proofErr w:type="spellStart"/>
+      <w:proofErr w:type="gramStart"/>
+      <w:r>
+        <w:t>public.users</w:t>
+      </w:r>
+      <w:proofErr w:type="spellEnd"/>
+      <w:proofErr w:type="gramEnd"/>
+      <w:r>
+        <w:t xml:space="preserve"> contient ton utilisateur avec le même e-mail que dans </w:t>
+      </w:r>
+      <w:proofErr w:type="spellStart"/>
+      <w:r>
+        <w:t>Authentication</w:t>
+      </w:r>
+      <w:proofErr w:type="spellEnd"/>
+      <w:r>
+        <w:t xml:space="preserve"> &gt; </w:t>
+      </w:r>
+      <w:proofErr w:type="spellStart"/>
+      <w:r>
+        <w:t>Users</w:t>
+      </w:r>
+      <w:proofErr w:type="spellEnd"/>
     </w:p>
     <w:p>
       <w:pPr>
@@ -896,17 +1948,37 @@
         </w:numPr>
         <w:shd w:val="clear" w:color="auto" w:fill="B4C6E7" w:themeFill="accent1" w:themeFillTint="66"/>
       </w:pPr>
-      <w:r>
-        <w:t>ton utilisateur a role = 'Super admin' et active = true</w:t>
-      </w:r>
+      <w:proofErr w:type="gramStart"/>
+      <w:r>
+        <w:t>ton</w:t>
+      </w:r>
+      <w:proofErr w:type="gramEnd"/>
+      <w:r>
+        <w:t xml:space="preserve"> utilisateur a </w:t>
+      </w:r>
+      <w:proofErr w:type="spellStart"/>
+      <w:r>
+        <w:t>role</w:t>
+      </w:r>
+      <w:proofErr w:type="spellEnd"/>
+      <w:r>
+        <w:t xml:space="preserve"> = 'Super admin' et active = </w:t>
+      </w:r>
+      <w:proofErr w:type="spellStart"/>
+      <w:r>
+        <w:t>true</w:t>
+      </w:r>
+      <w:proofErr w:type="spellEnd"/>
     </w:p>
     <w:p>
       <w:pPr>
         <w:shd w:val="clear" w:color="auto" w:fill="B4C6E7" w:themeFill="accent1" w:themeFillTint="66"/>
       </w:pPr>
+      <w:proofErr w:type="spellStart"/>
       <w:r>
         <w:t>Netlify</w:t>
       </w:r>
+      <w:proofErr w:type="spellEnd"/>
     </w:p>
     <w:p>
       <w:pPr>
@@ -916,8 +1988,21 @@
         </w:numPr>
         <w:shd w:val="clear" w:color="auto" w:fill="B4C6E7" w:themeFill="accent1" w:themeFillTint="66"/>
       </w:pPr>
-      <w:r>
-        <w:t>le dernier commit poussé sur main apparaît bien sur GitHub</w:t>
+      <w:proofErr w:type="gramStart"/>
+      <w:r>
+        <w:t>le</w:t>
+      </w:r>
+      <w:proofErr w:type="gramEnd"/>
+      <w:r>
+        <w:t xml:space="preserve"> dernier commit </w:t>
+      </w:r>
+      <w:proofErr w:type="gramStart"/>
+      <w:r>
+        <w:t>poussé</w:t>
+      </w:r>
+      <w:proofErr w:type="gramEnd"/>
+      <w:r>
+        <w:t xml:space="preserve"> sur main apparaît bien sur GitHub</w:t>
       </w:r>
     </w:p>
     <w:p>
@@ -928,9 +2013,27 @@
         </w:numPr>
         <w:shd w:val="clear" w:color="auto" w:fill="B4C6E7" w:themeFill="accent1" w:themeFillTint="66"/>
       </w:pPr>
-      <w:r>
-        <w:t>le déploiement Netlify est passé en Published</w:t>
-      </w:r>
+      <w:proofErr w:type="gramStart"/>
+      <w:r>
+        <w:t>le</w:t>
+      </w:r>
+      <w:proofErr w:type="gramEnd"/>
+      <w:r>
+        <w:t xml:space="preserve"> déploiement </w:t>
+      </w:r>
+      <w:proofErr w:type="spellStart"/>
+      <w:r>
+        <w:t>Netlify</w:t>
+      </w:r>
+      <w:proofErr w:type="spellEnd"/>
+      <w:r>
+        <w:t xml:space="preserve"> est passé en </w:t>
+      </w:r>
+      <w:proofErr w:type="spellStart"/>
+      <w:r>
+        <w:t>Published</w:t>
+      </w:r>
+      <w:proofErr w:type="spellEnd"/>
     </w:p>
     <w:p>
       <w:pPr>
@@ -940,8 +2043,13 @@
         </w:numPr>
         <w:shd w:val="clear" w:color="auto" w:fill="B4C6E7" w:themeFill="accent1" w:themeFillTint="66"/>
       </w:pPr>
-      <w:r>
-        <w:t>les variables VITE_SUPABASE_URL et VITE_SUPABASE_ANON_KEY sont bien configurées</w:t>
+      <w:proofErr w:type="gramStart"/>
+      <w:r>
+        <w:t>les</w:t>
+      </w:r>
+      <w:proofErr w:type="gramEnd"/>
+      <w:r>
+        <w:t xml:space="preserve"> variables VITE_SUPABASE_URL et VITE_SUPABASE_ANON_KEY sont bien configurées</w:t>
       </w:r>
     </w:p>
     <w:p>
@@ -952,17 +2060,32 @@
         </w:numPr>
         <w:shd w:val="clear" w:color="auto" w:fill="B4C6E7" w:themeFill="accent1" w:themeFillTint="66"/>
       </w:pPr>
+      <w:proofErr w:type="gramStart"/>
       <w:r>
         <w:lastRenderedPageBreak/>
-        <w:t>la connexion web fonctionne avec ton compte Supabase</w:t>
-      </w:r>
+        <w:t>la</w:t>
+      </w:r>
+      <w:proofErr w:type="gramEnd"/>
+      <w:r>
+        <w:t xml:space="preserve"> connexion web fonctionne avec ton compte </w:t>
+      </w:r>
+      <w:proofErr w:type="spellStart"/>
+      <w:r>
+        <w:t>Supabase</w:t>
+      </w:r>
+      <w:proofErr w:type="spellEnd"/>
     </w:p>
     <w:p>
       <w:pPr>
         <w:shd w:val="clear" w:color="auto" w:fill="B4C6E7" w:themeFill="accent1" w:themeFillTint="66"/>
       </w:pPr>
-      <w:r>
-        <w:t>desktop .exe</w:t>
+      <w:proofErr w:type="gramStart"/>
+      <w:r>
+        <w:t>desktop</w:t>
+      </w:r>
+      <w:proofErr w:type="gramEnd"/>
+      <w:r>
+        <w:t xml:space="preserve"> .exe</w:t>
       </w:r>
     </w:p>
     <w:p>
@@ -973,8 +2096,13 @@
         </w:numPr>
         <w:shd w:val="clear" w:color="auto" w:fill="B4C6E7" w:themeFill="accent1" w:themeFillTint="66"/>
       </w:pPr>
-      <w:r>
-        <w:t>un nouvel .exe a été reconstruit après les changements</w:t>
+      <w:proofErr w:type="gramStart"/>
+      <w:r>
+        <w:t>un</w:t>
+      </w:r>
+      <w:proofErr w:type="gramEnd"/>
+      <w:r>
+        <w:t xml:space="preserve"> nouvel .exe a été reconstruit après les changements</w:t>
       </w:r>
     </w:p>
     <w:p>
@@ -985,9 +2113,19 @@
         </w:numPr>
         <w:shd w:val="clear" w:color="auto" w:fill="B4C6E7" w:themeFill="accent1" w:themeFillTint="66"/>
       </w:pPr>
-      <w:r>
-        <w:t>avec internet, la connexion desktop fonctionne avec le compte Supabase</w:t>
-      </w:r>
+      <w:proofErr w:type="gramStart"/>
+      <w:r>
+        <w:t>avec</w:t>
+      </w:r>
+      <w:proofErr w:type="gramEnd"/>
+      <w:r>
+        <w:t xml:space="preserve"> internet, la connexion desktop fonctionne avec le compte </w:t>
+      </w:r>
+      <w:proofErr w:type="spellStart"/>
+      <w:r>
+        <w:t>Supabase</w:t>
+      </w:r>
+      <w:proofErr w:type="spellEnd"/>
     </w:p>
     <w:p>
       <w:pPr>
@@ -997,8 +2135,13 @@
         </w:numPr>
         <w:shd w:val="clear" w:color="auto" w:fill="B4C6E7" w:themeFill="accent1" w:themeFillTint="66"/>
       </w:pPr>
-      <w:r>
-        <w:t>après cette première connexion, le même compte peut se reconnecter hors ligne</w:t>
+      <w:proofErr w:type="gramStart"/>
+      <w:r>
+        <w:t>après</w:t>
+      </w:r>
+      <w:proofErr w:type="gramEnd"/>
+      <w:r>
+        <w:t xml:space="preserve"> cette première connexion, le même compte peut se reconnecter hors ligne</w:t>
       </w:r>
     </w:p>
     <w:p>
@@ -1009,8 +2152,21 @@
         </w:numPr>
         <w:shd w:val="clear" w:color="auto" w:fill="B4C6E7" w:themeFill="accent1" w:themeFillTint="66"/>
       </w:pPr>
-      <w:r>
-        <w:t>la synchronisation desktop → Supabase fonctionne quand la connexion revient</w:t>
+      <w:proofErr w:type="gramStart"/>
+      <w:r>
+        <w:t>la</w:t>
+      </w:r>
+      <w:proofErr w:type="gramEnd"/>
+      <w:r>
+        <w:t xml:space="preserve"> synchronisation desktop → </w:t>
+      </w:r>
+      <w:proofErr w:type="spellStart"/>
+      <w:r>
+        <w:t>Supabase</w:t>
+      </w:r>
+      <w:proofErr w:type="spellEnd"/>
+      <w:r>
+        <w:t xml:space="preserve"> fonctionne quand la connexion revient</w:t>
       </w:r>
     </w:p>
     <w:p>
@@ -1024,12 +2180,36 @@
     <w:p/>
     <w:p>
       <w:r>
-        <w:t>Alors la prochaine étape est simple: connecter ton dépôt GitHub à Netlify.</w:t>
-      </w:r>
-    </w:p>
-    <w:p>
-      <w:r>
-        <w:t>Fais ceci dans Netlify :</w:t>
+        <w:t xml:space="preserve">Alors la prochaine étape est </w:t>
+      </w:r>
+      <w:proofErr w:type="gramStart"/>
+      <w:r>
+        <w:t>simple:</w:t>
+      </w:r>
+      <w:proofErr w:type="gramEnd"/>
+      <w:r>
+        <w:t xml:space="preserve"> connecter ton dépôt GitHub à </w:t>
+      </w:r>
+      <w:proofErr w:type="spellStart"/>
+      <w:r>
+        <w:t>Netlify</w:t>
+      </w:r>
+      <w:proofErr w:type="spellEnd"/>
+      <w:r>
+        <w:t>.</w:t>
+      </w:r>
+    </w:p>
+    <w:p>
+      <w:r>
+        <w:t xml:space="preserve">Fais ceci dans </w:t>
+      </w:r>
+      <w:proofErr w:type="spellStart"/>
+      <w:r>
+        <w:t>Netlify</w:t>
+      </w:r>
+      <w:proofErr w:type="spellEnd"/>
+      <w:r>
+        <w:t xml:space="preserve"> :</w:t>
       </w:r>
     </w:p>
     <w:p>
@@ -1051,8 +2231,21 @@
         </w:numPr>
       </w:pPr>
       <w:r>
-        <w:t>Import an existing project</w:t>
-      </w:r>
+        <w:t xml:space="preserve">Import an </w:t>
+      </w:r>
+      <w:proofErr w:type="spellStart"/>
+      <w:r>
+        <w:t>existing</w:t>
+      </w:r>
+      <w:proofErr w:type="spellEnd"/>
+      <w:r>
+        <w:t xml:space="preserve"> </w:t>
+      </w:r>
+      <w:proofErr w:type="spellStart"/>
+      <w:r>
+        <w:t>project</w:t>
+      </w:r>
+      <w:proofErr w:type="spellEnd"/>
     </w:p>
     <w:p>
       <w:pPr>
@@ -1061,8 +2254,13 @@
           <w:numId w:val="5"/>
         </w:numPr>
       </w:pPr>
-      <w:r>
-        <w:t>connecte GitHub</w:t>
+      <w:proofErr w:type="gramStart"/>
+      <w:r>
+        <w:t>connecte</w:t>
+      </w:r>
+      <w:proofErr w:type="gramEnd"/>
+      <w:r>
+        <w:t xml:space="preserve"> GitHub</w:t>
       </w:r>
     </w:p>
     <w:p>
@@ -1072,8 +2270,21 @@
           <w:numId w:val="5"/>
         </w:numPr>
       </w:pPr>
-      <w:r>
-        <w:t>choisis le dépôt walikaletoworldrt-hue/Gestion-papeterie</w:t>
+      <w:proofErr w:type="gramStart"/>
+      <w:r>
+        <w:t>choisis</w:t>
+      </w:r>
+      <w:proofErr w:type="gramEnd"/>
+      <w:r>
+        <w:t xml:space="preserve"> le dépôt </w:t>
+      </w:r>
+      <w:proofErr w:type="spellStart"/>
+      <w:r>
+        <w:t>walikaletoworldrt</w:t>
+      </w:r>
+      <w:proofErr w:type="spellEnd"/>
+      <w:r>
+        <w:t>-hue/Gestion-papeterie</w:t>
       </w:r>
     </w:p>
     <w:p>
@@ -1083,8 +2294,13 @@
           <w:numId w:val="5"/>
         </w:numPr>
       </w:pPr>
-      <w:r>
-        <w:t>vérifie les réglages :</w:t>
+      <w:proofErr w:type="gramStart"/>
+      <w:r>
+        <w:t>vérifie</w:t>
+      </w:r>
+      <w:proofErr w:type="gramEnd"/>
+      <w:r>
+        <w:t xml:space="preserve"> les réglages :</w:t>
       </w:r>
     </w:p>
     <w:p>
@@ -1101,8 +2317,46 @@
         <w:rPr>
           <w:lang w:val="en-US"/>
         </w:rPr>
-        <w:t>Build command : npm run build:renderer</w:t>
-      </w:r>
+        <w:t xml:space="preserve">Build </w:t>
+      </w:r>
+      <w:proofErr w:type="gramStart"/>
+      <w:r>
+        <w:rPr>
+          <w:lang w:val="en-US"/>
+        </w:rPr>
+        <w:t>command :</w:t>
+      </w:r>
+      <w:proofErr w:type="gramEnd"/>
+      <w:r>
+        <w:rPr>
+          <w:lang w:val="en-US"/>
+        </w:rPr>
+        <w:t xml:space="preserve"> </w:t>
+      </w:r>
+      <w:proofErr w:type="spellStart"/>
+      <w:r>
+        <w:rPr>
+          <w:lang w:val="en-US"/>
+        </w:rPr>
+        <w:t>npm</w:t>
+      </w:r>
+      <w:proofErr w:type="spellEnd"/>
+      <w:r>
+        <w:rPr>
+          <w:lang w:val="en-US"/>
+        </w:rPr>
+        <w:t xml:space="preserve"> run </w:t>
+      </w:r>
+      <w:proofErr w:type="spellStart"/>
+      <w:proofErr w:type="gramStart"/>
+      <w:r>
+        <w:rPr>
+          <w:lang w:val="en-US"/>
+        </w:rPr>
+        <w:t>build:renderer</w:t>
+      </w:r>
+      <w:proofErr w:type="spellEnd"/>
+      <w:proofErr w:type="gramEnd"/>
     </w:p>
     <w:p>
       <w:pPr>
@@ -1111,9 +2365,19 @@
           <w:numId w:val="5"/>
         </w:numPr>
       </w:pPr>
-      <w:r>
-        <w:t>Publish directory : dist</w:t>
-      </w:r>
+      <w:proofErr w:type="spellStart"/>
+      <w:r>
+        <w:t>Publish</w:t>
+      </w:r>
+      <w:proofErr w:type="spellEnd"/>
+      <w:r>
+        <w:t xml:space="preserve"> directory : </w:t>
+      </w:r>
+      <w:proofErr w:type="spellStart"/>
+      <w:r>
+        <w:t>dist</w:t>
+      </w:r>
+      <w:proofErr w:type="spellEnd"/>
     </w:p>
     <w:p>
       <w:pPr>
@@ -1133,8 +2397,13 @@
           <w:numId w:val="5"/>
         </w:numPr>
       </w:pPr>
-      <w:r>
-        <w:t>ajoute les variables d’environnement :</w:t>
+      <w:proofErr w:type="gramStart"/>
+      <w:r>
+        <w:t>ajoute</w:t>
+      </w:r>
+      <w:proofErr w:type="gramEnd"/>
+      <w:r>
+        <w:t xml:space="preserve"> les variables d’environnement :</w:t>
       </w:r>
     </w:p>
     <w:p>
@@ -1166,8 +2435,13 @@
           <w:numId w:val="5"/>
         </w:numPr>
       </w:pPr>
-      <w:r>
-        <w:t>lance le déploiement</w:t>
+      <w:proofErr w:type="gramStart"/>
+      <w:r>
+        <w:t>lance</w:t>
+      </w:r>
+      <w:proofErr w:type="gramEnd"/>
+      <w:r>
+        <w:t xml:space="preserve"> le déploiement</w:t>
       </w:r>
     </w:p>
     <w:p>
@@ -1176,11 +2450,133 @@
           <w:lang w:val="en-US"/>
         </w:rPr>
       </w:pPr>
+      <w:proofErr w:type="spellStart"/>
       <w:r>
         <w:rPr>
           <w:lang w:val="en-US"/>
         </w:rPr>
-        <w:t>Ces réglages sont déjà cohérents avec [netlify.toml (line 1)](C:/Users/User/OneDrive/Projet Code/Walikale to world App/netlify.toml:1) et [NETLIFY_DEPLOYMENT.md (line 1)](C:/Users/User/OneDrive/Projet Code/Walikale to world App/NETLIFY_DEPLOYMENT.md:1).</w:t>
+        <w:t>Ces</w:t>
+      </w:r>
+      <w:proofErr w:type="spellEnd"/>
+      <w:r>
+        <w:rPr>
+          <w:lang w:val="en-US"/>
+        </w:rPr>
+        <w:t xml:space="preserve"> </w:t>
+      </w:r>
+      <w:proofErr w:type="spellStart"/>
+      <w:r>
+        <w:rPr>
+          <w:lang w:val="en-US"/>
+        </w:rPr>
+        <w:t>réglages</w:t>
+      </w:r>
+      <w:proofErr w:type="spellEnd"/>
+      <w:r>
+        <w:rPr>
+          <w:lang w:val="en-US"/>
+        </w:rPr>
+        <w:t xml:space="preserve"> </w:t>
+      </w:r>
+      <w:proofErr w:type="spellStart"/>
+      <w:r>
+        <w:rPr>
+          <w:lang w:val="en-US"/>
+        </w:rPr>
+        <w:t>sont</w:t>
+      </w:r>
+      <w:proofErr w:type="spellEnd"/>
+      <w:r>
+        <w:rPr>
+          <w:lang w:val="en-US"/>
+        </w:rPr>
+        <w:t xml:space="preserve"> déjà </w:t>
+      </w:r>
+      <w:proofErr w:type="spellStart"/>
+      <w:r>
+        <w:rPr>
+          <w:lang w:val="en-US"/>
+        </w:rPr>
+        <w:t>cohérents</w:t>
+      </w:r>
+      <w:proofErr w:type="spellEnd"/>
+      <w:r>
+        <w:rPr>
+          <w:lang w:val="en-US"/>
+        </w:rPr>
+        <w:t xml:space="preserve"> avec [</w:t>
+      </w:r>
+      <w:proofErr w:type="spellStart"/>
+      <w:proofErr w:type="gramStart"/>
+      <w:r>
+        <w:rPr>
+          <w:lang w:val="en-US"/>
+        </w:rPr>
+        <w:t>netlify.toml</w:t>
+      </w:r>
+      <w:proofErr w:type="spellEnd"/>
+      <w:proofErr w:type="gramEnd"/>
+      <w:r>
+        <w:rPr>
+          <w:lang w:val="en-US"/>
+        </w:rPr>
+        <w:t xml:space="preserve"> (line 1</w:t>
+      </w:r>
+      <w:proofErr w:type="gramStart"/>
+      <w:r>
+        <w:rPr>
+          <w:lang w:val="en-US"/>
+        </w:rPr>
+        <w:t>)](</w:t>
+      </w:r>
+      <w:proofErr w:type="gramEnd"/>
+      <w:r>
+        <w:rPr>
+          <w:lang w:val="en-US"/>
+        </w:rPr>
+        <w:t>C:/Users/User/OneDrive/Projet Code/</w:t>
+      </w:r>
+      <w:proofErr w:type="spellStart"/>
+      <w:r>
+        <w:rPr>
+          <w:lang w:val="en-US"/>
+        </w:rPr>
+        <w:t>Walikale</w:t>
+      </w:r>
+      <w:proofErr w:type="spellEnd"/>
+      <w:r>
+        <w:rPr>
+          <w:lang w:val="en-US"/>
+        </w:rPr>
+        <w:t xml:space="preserve"> to world App/netlify.toml:1) et [NETLIFY_DEPLOYMENT.md (line 1</w:t>
+      </w:r>
+      <w:proofErr w:type="gramStart"/>
+      <w:r>
+        <w:rPr>
+          <w:lang w:val="en-US"/>
+        </w:rPr>
+        <w:t>)](</w:t>
+      </w:r>
+      <w:proofErr w:type="gramEnd"/>
+      <w:r>
+        <w:rPr>
+          <w:lang w:val="en-US"/>
+        </w:rPr>
+        <w:t>C:/Users/User/OneDrive/Projet Code/</w:t>
+      </w:r>
+      <w:proofErr w:type="spellStart"/>
+      <w:r>
+        <w:rPr>
+          <w:lang w:val="en-US"/>
+        </w:rPr>
+        <w:t>Walikale</w:t>
+      </w:r>
+      <w:proofErr w:type="spellEnd"/>
+      <w:r>
+        <w:rPr>
+          <w:lang w:val="en-US"/>
+        </w:rPr>
+        <w:t xml:space="preserve"> to world App/NETLIFY_DEPLOYMENT.md:1).</w:t>
       </w:r>
     </w:p>
     <w:p>
@@ -1195,8 +2591,21 @@
           <w:numId w:val="6"/>
         </w:numPr>
       </w:pPr>
-      <w:r>
-        <w:t>sur Netlify, utilise bien les noms VITE_SUPABASE_URL et VITE_SUPABASE_ANON_KEY</w:t>
+      <w:proofErr w:type="gramStart"/>
+      <w:r>
+        <w:t>sur</w:t>
+      </w:r>
+      <w:proofErr w:type="gramEnd"/>
+      <w:r>
+        <w:t xml:space="preserve"> </w:t>
+      </w:r>
+      <w:proofErr w:type="spellStart"/>
+      <w:r>
+        <w:t>Netlify</w:t>
+      </w:r>
+      <w:proofErr w:type="spellEnd"/>
+      <w:r>
+        <w:t>, utilise bien les noms VITE_SUPABASE_URL et VITE_SUPABASE_ANON_KEY</w:t>
       </w:r>
     </w:p>
     <w:p>
@@ -1206,8 +2615,13 @@
           <w:numId w:val="6"/>
         </w:numPr>
       </w:pPr>
-      <w:r>
-        <w:t>pas NEXT_PUBLIC_*, car ton app est en Vite</w:t>
+      <w:proofErr w:type="gramStart"/>
+      <w:r>
+        <w:t>pas</w:t>
+      </w:r>
+      <w:proofErr w:type="gramEnd"/>
+      <w:r>
+        <w:t xml:space="preserve"> NEXT_PUBLIC_*, car ton app est en Vite</w:t>
       </w:r>
     </w:p>
     <w:p>
@@ -1222,9 +2636,27 @@
           <w:numId w:val="7"/>
         </w:numPr>
       </w:pPr>
-      <w:r>
-        <w:t>l’état du build Netlify</w:t>
-      </w:r>
+      <w:proofErr w:type="gramStart"/>
+      <w:r>
+        <w:t>l’état</w:t>
+      </w:r>
+      <w:proofErr w:type="gramEnd"/>
+      <w:r>
+        <w:t xml:space="preserve"> du </w:t>
+      </w:r>
+      <w:proofErr w:type="spellStart"/>
+      <w:r>
+        <w:t>build</w:t>
+      </w:r>
+      <w:proofErr w:type="spellEnd"/>
+      <w:r>
+        <w:t xml:space="preserve"> </w:t>
+      </w:r>
+      <w:proofErr w:type="spellStart"/>
+      <w:r>
+        <w:t>Netlify</w:t>
+      </w:r>
+      <w:proofErr w:type="spellEnd"/>
     </w:p>
     <w:p>
       <w:pPr>
@@ -1233,8 +2665,13 @@
           <w:numId w:val="7"/>
         </w:numPr>
       </w:pPr>
-      <w:r>
-        <w:t>et si tu veux, l’URL du site déployé</w:t>
+      <w:proofErr w:type="gramStart"/>
+      <w:r>
+        <w:t>et</w:t>
+      </w:r>
+      <w:proofErr w:type="gramEnd"/>
+      <w:r>
+        <w:t xml:space="preserve"> si tu veux, l’URL du site déployé</w:t>
       </w:r>
     </w:p>
     <w:p>

</xml_diff>

<commit_message>
filtrer, vider les logs, historiques
</commit_message>
<xml_diff>
--- a/Projet Application Papeterie walikale to world.docx
+++ b/Projet Application Papeterie walikale to world.docx
@@ -1637,13 +1637,378 @@
     </w:p>
     <w:p>
       <w:pPr>
-        <w:pStyle w:val="Paragraphedeliste"/>
-      </w:pPr>
-    </w:p>
-    <w:p>
-      <w:pPr>
-        <w:pStyle w:val="Paragraphedeliste"/>
-      </w:pPr>
+        <w:pStyle w:val="NormalWeb"/>
+        <w:numPr>
+          <w:ilvl w:val="0"/>
+          <w:numId w:val="1"/>
+        </w:numPr>
+      </w:pPr>
+      <w:proofErr w:type="gramStart"/>
+      <w:r>
+        <w:t>dans</w:t>
+      </w:r>
+      <w:proofErr w:type="gramEnd"/>
+      <w:r>
+        <w:t xml:space="preserve"> les </w:t>
+      </w:r>
+      <w:proofErr w:type="spellStart"/>
+      <w:r>
+        <w:t>depenses</w:t>
+      </w:r>
+      <w:proofErr w:type="spellEnd"/>
+      <w:r>
+        <w:t xml:space="preserve"> à générer, je voulais avoir la possibilité de choisir les </w:t>
+      </w:r>
+      <w:proofErr w:type="spellStart"/>
+      <w:r>
+        <w:t>periodes</w:t>
+      </w:r>
+      <w:proofErr w:type="spellEnd"/>
+      <w:r>
+        <w:t xml:space="preserve"> parce que la </w:t>
+      </w:r>
+      <w:proofErr w:type="spellStart"/>
+      <w:r>
+        <w:t>depense</w:t>
+      </w:r>
+      <w:proofErr w:type="spellEnd"/>
+      <w:r>
+        <w:t xml:space="preserve"> </w:t>
+      </w:r>
+      <w:proofErr w:type="spellStart"/>
+      <w:r>
+        <w:t>encienne</w:t>
+      </w:r>
+      <w:proofErr w:type="spellEnd"/>
+      <w:r>
+        <w:t xml:space="preserve"> ne dois pas </w:t>
+      </w:r>
+      <w:proofErr w:type="gramStart"/>
+      <w:r>
+        <w:t>figuré</w:t>
+      </w:r>
+      <w:proofErr w:type="gramEnd"/>
+      <w:r>
+        <w:t xml:space="preserve"> dans le rapport du mois </w:t>
+      </w:r>
+      <w:proofErr w:type="spellStart"/>
+      <w:r>
+        <w:t>present</w:t>
+      </w:r>
+      <w:proofErr w:type="spellEnd"/>
+      <w:r>
+        <w:t>.</w:t>
+      </w:r>
+    </w:p>
+    <w:p>
+      <w:pPr>
+        <w:pStyle w:val="NormalWeb"/>
+        <w:numPr>
+          <w:ilvl w:val="0"/>
+          <w:numId w:val="1"/>
+        </w:numPr>
+        <w:rPr>
+          <w:color w:val="EE0000"/>
+          <w:highlight w:val="black"/>
+        </w:rPr>
+      </w:pPr>
+      <w:r>
+        <w:rPr>
+          <w:b/>
+          <w:bCs/>
+          <w:color w:val="EE0000"/>
+          <w:highlight w:val="black"/>
+        </w:rPr>
+        <w:t xml:space="preserve">Conflit </w:t>
+      </w:r>
+      <w:proofErr w:type="spellStart"/>
+      <w:r>
+        <w:rPr>
+          <w:b/>
+          <w:bCs/>
+          <w:color w:val="EE0000"/>
+          <w:highlight w:val="black"/>
+        </w:rPr>
+        <w:t>detecte</w:t>
+      </w:r>
+      <w:proofErr w:type="spellEnd"/>
+      <w:r>
+        <w:rPr>
+          <w:b/>
+          <w:bCs/>
+          <w:color w:val="EE0000"/>
+          <w:highlight w:val="black"/>
+        </w:rPr>
+        <w:t xml:space="preserve"> : le cloud et ce poste ont tous les deux des changements non synchronises.</w:t>
+      </w:r>
+    </w:p>
+    <w:p>
+      <w:pPr>
+        <w:spacing w:before="100" w:beforeAutospacing="1" w:after="100" w:afterAutospacing="1" w:line="240" w:lineRule="auto"/>
+        <w:rPr>
+          <w:rFonts w:ascii="Times New Roman" w:eastAsia="Times New Roman" w:hAnsi="Times New Roman" w:cs="Times New Roman"/>
+          <w:kern w:val="0"/>
+          <w:sz w:val="24"/>
+          <w:szCs w:val="24"/>
+          <w:lang w:eastAsia="fr-FR"/>
+          <w14:ligatures w14:val="none"/>
+        </w:rPr>
+      </w:pPr>
+      <w:r>
+        <w:rPr>
+          <w:rFonts w:ascii="Times New Roman" w:eastAsia="Times New Roman" w:hAnsi="Times New Roman" w:cs="Times New Roman"/>
+          <w:kern w:val="0"/>
+          <w:sz w:val="24"/>
+          <w:szCs w:val="24"/>
+          <w:lang w:eastAsia="fr-FR"/>
+          <w14:ligatures w14:val="none"/>
+        </w:rPr>
+        <w:t>A</w:t>
+      </w:r>
+      <w:r>
+        <w:rPr>
+          <w:rFonts w:ascii="Times New Roman" w:eastAsia="Times New Roman" w:hAnsi="Times New Roman" w:cs="Times New Roman"/>
+          <w:kern w:val="0"/>
+          <w:sz w:val="24"/>
+          <w:szCs w:val="24"/>
+          <w:lang w:eastAsia="fr-FR"/>
+          <w14:ligatures w14:val="none"/>
+        </w:rPr>
+        <w:t>jouter ensuite :</w:t>
+      </w:r>
+    </w:p>
+    <w:p>
+      <w:pPr>
+        <w:numPr>
+          <w:ilvl w:val="0"/>
+          <w:numId w:val="1"/>
+        </w:numPr>
+        <w:spacing w:before="100" w:beforeAutospacing="1" w:after="100" w:afterAutospacing="1" w:line="240" w:lineRule="auto"/>
+        <w:rPr>
+          <w:rFonts w:ascii="Times New Roman" w:eastAsia="Times New Roman" w:hAnsi="Times New Roman" w:cs="Times New Roman"/>
+          <w:kern w:val="0"/>
+          <w:sz w:val="24"/>
+          <w:szCs w:val="24"/>
+          <w:lang w:eastAsia="fr-FR"/>
+          <w14:ligatures w14:val="none"/>
+        </w:rPr>
+      </w:pPr>
+      <w:r>
+        <w:rPr>
+          <w:rFonts w:ascii="Times New Roman" w:eastAsia="Times New Roman" w:hAnsi="Times New Roman" w:cs="Times New Roman"/>
+          <w:kern w:val="0"/>
+          <w:sz w:val="24"/>
+          <w:szCs w:val="24"/>
+          <w:lang w:eastAsia="fr-FR"/>
+          <w14:ligatures w14:val="none"/>
+        </w:rPr>
+        <w:t>U</w:t>
+      </w:r>
+      <w:r>
+        <w:rPr>
+          <w:rFonts w:ascii="Times New Roman" w:eastAsia="Times New Roman" w:hAnsi="Times New Roman" w:cs="Times New Roman"/>
+          <w:kern w:val="0"/>
+          <w:sz w:val="24"/>
+          <w:szCs w:val="24"/>
+          <w:lang w:eastAsia="fr-FR"/>
+          <w14:ligatures w14:val="none"/>
+        </w:rPr>
+        <w:t xml:space="preserve">n </w:t>
+      </w:r>
+      <w:r>
+        <w:rPr>
+          <w:rFonts w:ascii="Courier New" w:eastAsia="Times New Roman" w:hAnsi="Courier New" w:cs="Courier New"/>
+          <w:kern w:val="0"/>
+          <w:sz w:val="20"/>
+          <w:szCs w:val="20"/>
+          <w:lang w:eastAsia="fr-FR"/>
+          <w14:ligatures w14:val="none"/>
+        </w:rPr>
+        <w:t>nettoyage automatique</w:t>
+      </w:r>
+      <w:r>
+        <w:rPr>
+          <w:rFonts w:ascii="Times New Roman" w:eastAsia="Times New Roman" w:hAnsi="Times New Roman" w:cs="Times New Roman"/>
+          <w:kern w:val="0"/>
+          <w:sz w:val="24"/>
+          <w:szCs w:val="24"/>
+          <w:lang w:eastAsia="fr-FR"/>
+          <w14:ligatures w14:val="none"/>
+        </w:rPr>
+        <w:t xml:space="preserve"> des anciens logs</w:t>
+      </w:r>
+    </w:p>
+    <w:p>
+      <w:pPr>
+        <w:numPr>
+          <w:ilvl w:val="0"/>
+          <w:numId w:val="1"/>
+        </w:numPr>
+        <w:spacing w:before="100" w:beforeAutospacing="1" w:after="100" w:afterAutospacing="1" w:line="240" w:lineRule="auto"/>
+        <w:rPr>
+          <w:rFonts w:ascii="Times New Roman" w:eastAsia="Times New Roman" w:hAnsi="Times New Roman" w:cs="Times New Roman"/>
+          <w:kern w:val="0"/>
+          <w:sz w:val="24"/>
+          <w:szCs w:val="24"/>
+          <w:lang w:eastAsia="fr-FR"/>
+          <w14:ligatures w14:val="none"/>
+        </w:rPr>
+      </w:pPr>
+      <w:r>
+        <w:rPr>
+          <w:rFonts w:ascii="Times New Roman" w:eastAsia="Times New Roman" w:hAnsi="Times New Roman" w:cs="Times New Roman"/>
+          <w:kern w:val="0"/>
+          <w:sz w:val="24"/>
+          <w:szCs w:val="24"/>
+          <w:lang w:eastAsia="fr-FR"/>
+          <w14:ligatures w14:val="none"/>
+        </w:rPr>
+        <w:t>U</w:t>
+      </w:r>
+      <w:r>
+        <w:rPr>
+          <w:rFonts w:ascii="Times New Roman" w:eastAsia="Times New Roman" w:hAnsi="Times New Roman" w:cs="Times New Roman"/>
+          <w:kern w:val="0"/>
+          <w:sz w:val="24"/>
+          <w:szCs w:val="24"/>
+          <w:lang w:eastAsia="fr-FR"/>
+          <w14:ligatures w14:val="none"/>
+        </w:rPr>
+        <w:t xml:space="preserve">n </w:t>
+      </w:r>
+      <w:r>
+        <w:rPr>
+          <w:rFonts w:ascii="Courier New" w:eastAsia="Times New Roman" w:hAnsi="Courier New" w:cs="Courier New"/>
+          <w:kern w:val="0"/>
+          <w:sz w:val="20"/>
+          <w:szCs w:val="20"/>
+          <w:lang w:eastAsia="fr-FR"/>
+          <w14:ligatures w14:val="none"/>
+        </w:rPr>
+        <w:t>archivage</w:t>
+      </w:r>
+      <w:r>
+        <w:rPr>
+          <w:rFonts w:ascii="Times New Roman" w:eastAsia="Times New Roman" w:hAnsi="Times New Roman" w:cs="Times New Roman"/>
+          <w:kern w:val="0"/>
+          <w:sz w:val="24"/>
+          <w:szCs w:val="24"/>
+          <w:lang w:eastAsia="fr-FR"/>
+          <w14:ligatures w14:val="none"/>
+        </w:rPr>
+        <w:t xml:space="preserve"> par période</w:t>
+      </w:r>
+    </w:p>
+    <w:p>
+      <w:pPr>
+        <w:numPr>
+          <w:ilvl w:val="0"/>
+          <w:numId w:val="1"/>
+        </w:numPr>
+        <w:spacing w:before="100" w:beforeAutospacing="1" w:after="100" w:afterAutospacing="1" w:line="240" w:lineRule="auto"/>
+        <w:rPr>
+          <w:rFonts w:ascii="Times New Roman" w:eastAsia="Times New Roman" w:hAnsi="Times New Roman" w:cs="Times New Roman"/>
+          <w:kern w:val="0"/>
+          <w:sz w:val="24"/>
+          <w:szCs w:val="24"/>
+          <w:lang w:eastAsia="fr-FR"/>
+          <w14:ligatures w14:val="none"/>
+        </w:rPr>
+      </w:pPr>
+      <w:r>
+        <w:rPr>
+          <w:rFonts w:ascii="Times New Roman" w:eastAsia="Times New Roman" w:hAnsi="Times New Roman" w:cs="Times New Roman"/>
+          <w:kern w:val="0"/>
+          <w:sz w:val="24"/>
+          <w:szCs w:val="24"/>
+          <w:lang w:eastAsia="fr-FR"/>
+          <w14:ligatures w14:val="none"/>
+        </w:rPr>
+        <w:t>U</w:t>
+      </w:r>
+      <w:r>
+        <w:rPr>
+          <w:rFonts w:ascii="Times New Roman" w:eastAsia="Times New Roman" w:hAnsi="Times New Roman" w:cs="Times New Roman"/>
+          <w:kern w:val="0"/>
+          <w:sz w:val="24"/>
+          <w:szCs w:val="24"/>
+          <w:lang w:eastAsia="fr-FR"/>
+          <w14:ligatures w14:val="none"/>
+        </w:rPr>
+        <w:t xml:space="preserve">ne option </w:t>
+      </w:r>
+      <w:r>
+        <w:rPr>
+          <w:rFonts w:ascii="Courier New" w:eastAsia="Times New Roman" w:hAnsi="Courier New" w:cs="Courier New"/>
+          <w:kern w:val="0"/>
+          <w:sz w:val="20"/>
+          <w:szCs w:val="20"/>
+          <w:lang w:eastAsia="fr-FR"/>
+          <w14:ligatures w14:val="none"/>
+        </w:rPr>
+        <w:t>sauvegarder puis vider l’historique ancien</w:t>
+      </w:r>
+    </w:p>
+    <w:p>
+      <w:pPr>
+        <w:numPr>
+          <w:ilvl w:val="0"/>
+          <w:numId w:val="1"/>
+        </w:numPr>
+        <w:spacing w:before="100" w:beforeAutospacing="1" w:after="100" w:afterAutospacing="1" w:line="240" w:lineRule="auto"/>
+        <w:rPr>
+          <w:rFonts w:ascii="Times New Roman" w:eastAsia="Times New Roman" w:hAnsi="Times New Roman" w:cs="Times New Roman"/>
+          <w:kern w:val="0"/>
+          <w:sz w:val="24"/>
+          <w:szCs w:val="24"/>
+          <w:lang w:eastAsia="fr-FR"/>
+          <w14:ligatures w14:val="none"/>
+        </w:rPr>
+      </w:pPr>
+      <w:r>
+        <w:rPr>
+          <w:rFonts w:ascii="Times New Roman" w:eastAsia="Times New Roman" w:hAnsi="Times New Roman" w:cs="Times New Roman"/>
+          <w:kern w:val="0"/>
+          <w:sz w:val="24"/>
+          <w:szCs w:val="24"/>
+          <w:lang w:eastAsia="fr-FR"/>
+          <w14:ligatures w14:val="none"/>
+        </w:rPr>
+        <w:t>U</w:t>
+      </w:r>
+      <w:r>
+        <w:rPr>
+          <w:rFonts w:ascii="Times New Roman" w:eastAsia="Times New Roman" w:hAnsi="Times New Roman" w:cs="Times New Roman"/>
+          <w:kern w:val="0"/>
+          <w:sz w:val="24"/>
+          <w:szCs w:val="24"/>
+          <w:lang w:eastAsia="fr-FR"/>
+          <w14:ligatures w14:val="none"/>
+        </w:rPr>
+        <w:t xml:space="preserve">ne règle comme : garder seulement les </w:t>
+      </w:r>
+      <w:r>
+        <w:rPr>
+          <w:rFonts w:ascii="Courier New" w:eastAsia="Times New Roman" w:hAnsi="Courier New" w:cs="Courier New"/>
+          <w:kern w:val="0"/>
+          <w:sz w:val="20"/>
+          <w:szCs w:val="20"/>
+          <w:lang w:eastAsia="fr-FR"/>
+          <w14:ligatures w14:val="none"/>
+        </w:rPr>
+        <w:t>12 derniers mois</w:t>
+      </w:r>
+      <w:r>
+        <w:rPr>
+          <w:rFonts w:ascii="Times New Roman" w:eastAsia="Times New Roman" w:hAnsi="Times New Roman" w:cs="Times New Roman"/>
+          <w:kern w:val="0"/>
+          <w:sz w:val="24"/>
+          <w:szCs w:val="24"/>
+          <w:lang w:eastAsia="fr-FR"/>
+          <w14:ligatures w14:val="none"/>
+        </w:rPr>
+        <w:t xml:space="preserve"> dans l’historique visible</w:t>
+      </w:r>
     </w:p>
     <w:p>
       <w:r>
@@ -1955,6 +2320,7 @@
       </w:pPr>
       <w:proofErr w:type="gramStart"/>
       <w:r>
+        <w:lastRenderedPageBreak/>
         <w:t>ton</w:t>
       </w:r>
       <w:proofErr w:type="gramEnd"/>
@@ -2067,7 +2433,6 @@
       </w:pPr>
       <w:proofErr w:type="gramStart"/>
       <w:r>
-        <w:lastRenderedPageBreak/>
         <w:t>la</w:t>
       </w:r>
       <w:proofErr w:type="gramEnd"/>
@@ -2622,6 +2987,7 @@
       </w:pPr>
       <w:proofErr w:type="gramStart"/>
       <w:r>
+        <w:lastRenderedPageBreak/>
         <w:t>pas</w:t>
       </w:r>
       <w:proofErr w:type="gramEnd"/>
@@ -3225,6 +3591,155 @@
     </w:lvl>
   </w:abstractNum>
   <w:abstractNum w:abstractNumId="4" w15:restartNumberingAfterBreak="0">
+    <w:nsid w:val="312E6516"/>
+    <w:multiLevelType w:val="multilevel"/>
+    <w:tmpl w:val="A38E272E"/>
+    <w:lvl w:ilvl="0">
+      <w:start w:val="1"/>
+      <w:numFmt w:val="bullet"/>
+      <w:lvlText w:val=""/>
+      <w:lvlJc w:val="left"/>
+      <w:pPr>
+        <w:tabs>
+          <w:tab w:val="num" w:pos="720"/>
+        </w:tabs>
+        <w:ind w:left="720" w:hanging="360"/>
+      </w:pPr>
+      <w:rPr>
+        <w:rFonts w:ascii="Symbol" w:hAnsi="Symbol" w:hint="default"/>
+        <w:sz w:val="20"/>
+      </w:rPr>
+    </w:lvl>
+    <w:lvl w:ilvl="1" w:tentative="1">
+      <w:start w:val="1"/>
+      <w:numFmt w:val="bullet"/>
+      <w:lvlText w:val="o"/>
+      <w:lvlJc w:val="left"/>
+      <w:pPr>
+        <w:tabs>
+          <w:tab w:val="num" w:pos="1440"/>
+        </w:tabs>
+        <w:ind w:left="1440" w:hanging="360"/>
+      </w:pPr>
+      <w:rPr>
+        <w:rFonts w:ascii="Courier New" w:hAnsi="Courier New" w:hint="default"/>
+        <w:sz w:val="20"/>
+      </w:rPr>
+    </w:lvl>
+    <w:lvl w:ilvl="2" w:tentative="1">
+      <w:start w:val="1"/>
+      <w:numFmt w:val="bullet"/>
+      <w:lvlText w:val=""/>
+      <w:lvlJc w:val="left"/>
+      <w:pPr>
+        <w:tabs>
+          <w:tab w:val="num" w:pos="2160"/>
+        </w:tabs>
+        <w:ind w:left="2160" w:hanging="360"/>
+      </w:pPr>
+      <w:rPr>
+        <w:rFonts w:ascii="Wingdings" w:hAnsi="Wingdings" w:hint="default"/>
+        <w:sz w:val="20"/>
+      </w:rPr>
+    </w:lvl>
+    <w:lvl w:ilvl="3" w:tentative="1">
+      <w:start w:val="1"/>
+      <w:numFmt w:val="bullet"/>
+      <w:lvlText w:val=""/>
+      <w:lvlJc w:val="left"/>
+      <w:pPr>
+        <w:tabs>
+          <w:tab w:val="num" w:pos="2880"/>
+        </w:tabs>
+        <w:ind w:left="2880" w:hanging="360"/>
+      </w:pPr>
+      <w:rPr>
+        <w:rFonts w:ascii="Wingdings" w:hAnsi="Wingdings" w:hint="default"/>
+        <w:sz w:val="20"/>
+      </w:rPr>
+    </w:lvl>
+    <w:lvl w:ilvl="4" w:tentative="1">
+      <w:start w:val="1"/>
+      <w:numFmt w:val="bullet"/>
+      <w:lvlText w:val=""/>
+      <w:lvlJc w:val="left"/>
+      <w:pPr>
+        <w:tabs>
+          <w:tab w:val="num" w:pos="3600"/>
+        </w:tabs>
+        <w:ind w:left="3600" w:hanging="360"/>
+      </w:pPr>
+      <w:rPr>
+        <w:rFonts w:ascii="Wingdings" w:hAnsi="Wingdings" w:hint="default"/>
+        <w:sz w:val="20"/>
+      </w:rPr>
+    </w:lvl>
+    <w:lvl w:ilvl="5" w:tentative="1">
+      <w:start w:val="1"/>
+      <w:numFmt w:val="bullet"/>
+      <w:lvlText w:val=""/>
+      <w:lvlJc w:val="left"/>
+      <w:pPr>
+        <w:tabs>
+          <w:tab w:val="num" w:pos="4320"/>
+        </w:tabs>
+        <w:ind w:left="4320" w:hanging="360"/>
+      </w:pPr>
+      <w:rPr>
+        <w:rFonts w:ascii="Wingdings" w:hAnsi="Wingdings" w:hint="default"/>
+        <w:sz w:val="20"/>
+      </w:rPr>
+    </w:lvl>
+    <w:lvl w:ilvl="6" w:tentative="1">
+      <w:start w:val="1"/>
+      <w:numFmt w:val="bullet"/>
+      <w:lvlText w:val=""/>
+      <w:lvlJc w:val="left"/>
+      <w:pPr>
+        <w:tabs>
+          <w:tab w:val="num" w:pos="5040"/>
+        </w:tabs>
+        <w:ind w:left="5040" w:hanging="360"/>
+      </w:pPr>
+      <w:rPr>
+        <w:rFonts w:ascii="Wingdings" w:hAnsi="Wingdings" w:hint="default"/>
+        <w:sz w:val="20"/>
+      </w:rPr>
+    </w:lvl>
+    <w:lvl w:ilvl="7" w:tentative="1">
+      <w:start w:val="1"/>
+      <w:numFmt w:val="bullet"/>
+      <w:lvlText w:val=""/>
+      <w:lvlJc w:val="left"/>
+      <w:pPr>
+        <w:tabs>
+          <w:tab w:val="num" w:pos="5760"/>
+        </w:tabs>
+        <w:ind w:left="5760" w:hanging="360"/>
+      </w:pPr>
+      <w:rPr>
+        <w:rFonts w:ascii="Wingdings" w:hAnsi="Wingdings" w:hint="default"/>
+        <w:sz w:val="20"/>
+      </w:rPr>
+    </w:lvl>
+    <w:lvl w:ilvl="8" w:tentative="1">
+      <w:start w:val="1"/>
+      <w:numFmt w:val="bullet"/>
+      <w:lvlText w:val=""/>
+      <w:lvlJc w:val="left"/>
+      <w:pPr>
+        <w:tabs>
+          <w:tab w:val="num" w:pos="6480"/>
+        </w:tabs>
+        <w:ind w:left="6480" w:hanging="360"/>
+      </w:pPr>
+      <w:rPr>
+        <w:rFonts w:ascii="Wingdings" w:hAnsi="Wingdings" w:hint="default"/>
+        <w:sz w:val="20"/>
+      </w:rPr>
+    </w:lvl>
+  </w:abstractNum>
+  <w:abstractNum w:abstractNumId="5" w15:restartNumberingAfterBreak="0">
     <w:nsid w:val="34BD630D"/>
     <w:multiLevelType w:val="multilevel"/>
     <w:tmpl w:val="6E52BB22"/>
@@ -3373,7 +3888,7 @@
       </w:rPr>
     </w:lvl>
   </w:abstractNum>
-  <w:abstractNum w:abstractNumId="5" w15:restartNumberingAfterBreak="0">
+  <w:abstractNum w:abstractNumId="6" w15:restartNumberingAfterBreak="0">
     <w:nsid w:val="4A240513"/>
     <w:multiLevelType w:val="multilevel"/>
     <w:tmpl w:val="ADEA96EA"/>
@@ -3522,7 +4037,7 @@
       </w:rPr>
     </w:lvl>
   </w:abstractNum>
-  <w:abstractNum w:abstractNumId="6" w15:restartNumberingAfterBreak="0">
+  <w:abstractNum w:abstractNumId="7" w15:restartNumberingAfterBreak="0">
     <w:nsid w:val="6F9F65E0"/>
     <w:multiLevelType w:val="multilevel"/>
     <w:tmpl w:val="0C0EF00C"/>
@@ -3675,7 +4190,7 @@
     <w:abstractNumId w:val="3"/>
   </w:num>
   <w:num w:numId="2" w16cid:durableId="119157286">
-    <w:abstractNumId w:val="5"/>
+    <w:abstractNumId w:val="6"/>
   </w:num>
   <w:num w:numId="3" w16cid:durableId="250356972">
     <w:abstractNumId w:val="2"/>
@@ -3687,10 +4202,13 @@
     <w:abstractNumId w:val="0"/>
   </w:num>
   <w:num w:numId="6" w16cid:durableId="1362778497">
-    <w:abstractNumId w:val="4"/>
+    <w:abstractNumId w:val="5"/>
   </w:num>
   <w:num w:numId="7" w16cid:durableId="1110861082">
-    <w:abstractNumId w:val="6"/>
+    <w:abstractNumId w:val="7"/>
+  </w:num>
+  <w:num w:numId="8" w16cid:durableId="1037046708">
+    <w:abstractNumId w:val="4"/>
   </w:num>
 </w:numbering>
 </file>
@@ -4298,7 +4816,6 @@
   <w:style w:type="character" w:default="1" w:styleId="Policepardfaut">
     <w:name w:val="Default Paragraph Font"/>
     <w:uiPriority w:val="1"/>
-    <w:semiHidden/>
     <w:unhideWhenUsed/>
   </w:style>
   <w:style w:type="table" w:default="1" w:styleId="TableauNormal">
@@ -4631,6 +5148,19 @@
       <w14:ligatures w14:val="none"/>
     </w:rPr>
   </w:style>
+  <w:style w:type="character" w:styleId="CodeHTML">
+    <w:name w:val="HTML Code"/>
+    <w:basedOn w:val="Policepardfaut"/>
+    <w:uiPriority w:val="99"/>
+    <w:semiHidden/>
+    <w:unhideWhenUsed/>
+    <w:rsid w:val="00074CCF"/>
+    <w:rPr>
+      <w:rFonts w:ascii="Courier New" w:eastAsia="Times New Roman" w:hAnsi="Courier New" w:cs="Courier New"/>
+      <w:sz w:val="20"/>
+      <w:szCs w:val="20"/>
+    </w:rPr>
+  </w:style>
 </w:styles>
 </file>
 

</xml_diff>

<commit_message>
les graphiques et bouton oeil
</commit_message>
<xml_diff>
--- a/Projet Application Papeterie walikale to world.docx
+++ b/Projet Application Papeterie walikale to world.docx
@@ -4,15 +4,7 @@
   <w:body>
     <w:p>
       <w:r>
-        <w:t xml:space="preserve">Projet Papeterie </w:t>
-      </w:r>
-      <w:proofErr w:type="spellStart"/>
-      <w:r>
-        <w:t>walikale</w:t>
-      </w:r>
-      <w:proofErr w:type="spellEnd"/>
-      <w:r>
-        <w:t xml:space="preserve"> to world</w:t>
+        <w:t>Projet Papeterie walikale to world</w:t>
       </w:r>
     </w:p>
     <w:p>
@@ -29,13 +21,8 @@
         </w:numPr>
       </w:pPr>
       <w:r>
-        <w:t xml:space="preserve">Gestion vente papeterie y compris les </w:t>
-      </w:r>
-      <w:proofErr w:type="spellStart"/>
-      <w:r>
-        <w:t>depenses</w:t>
-      </w:r>
-      <w:proofErr w:type="spellEnd"/>
+        <w:t>Gestion vente papeterie y compris les depenses</w:t>
+      </w:r>
     </w:p>
     <w:p>
       <w:pPr>
@@ -46,13 +33,8 @@
         </w:numPr>
       </w:pPr>
       <w:r>
-        <w:t>Gestion du personnel (les salaires, primes</w:t>
-      </w:r>
-      <w:proofErr w:type="gramStart"/>
-      <w:r>
-        <w:t>)..</w:t>
-      </w:r>
-      <w:proofErr w:type="gramEnd"/>
+        <w:t>Gestion du personnel (les salaires, primes)..</w:t>
+      </w:r>
     </w:p>
     <w:p>
       <w:pPr>
@@ -62,15 +44,7 @@
         <w:t xml:space="preserve">L’application doit être en ligne pour permettre le suivi à distance, </w:t>
       </w:r>
       <w:r>
-        <w:t xml:space="preserve">mais aussi fonctionne en hors ligne aussi et synchronise une fois </w:t>
-      </w:r>
-      <w:proofErr w:type="gramStart"/>
-      <w:r>
-        <w:t>connecté</w:t>
-      </w:r>
-      <w:proofErr w:type="gramEnd"/>
-      <w:r>
-        <w:t xml:space="preserve"> à internet. </w:t>
+        <w:t xml:space="preserve">mais aussi fonctionne en hors ligne aussi et synchronise une fois connecté à internet. </w:t>
       </w:r>
     </w:p>
     <w:p>
@@ -112,41 +86,13 @@
         <w:rPr>
           <w:highlight w:val="yellow"/>
         </w:rPr>
-        <w:t xml:space="preserve">Ceux qui modifie en local puisse avoir la possibilité de travailler </w:t>
-      </w:r>
-      <w:proofErr w:type="spellStart"/>
-      <w:r>
-        <w:rPr>
-          <w:highlight w:val="yellow"/>
-        </w:rPr>
-        <w:t>meme</w:t>
-      </w:r>
-      <w:proofErr w:type="spellEnd"/>
-      <w:r>
-        <w:rPr>
-          <w:highlight w:val="yellow"/>
-        </w:rPr>
-        <w:t xml:space="preserve"> sans internet et synchroniser en cliquant sur le bouton synchroniser a</w:t>
-      </w:r>
-      <w:r>
-        <w:rPr>
-          <w:highlight w:val="yellow"/>
-        </w:rPr>
-        <w:t xml:space="preserve">fin que cela puisse pusher vers </w:t>
-      </w:r>
-      <w:proofErr w:type="spellStart"/>
-      <w:r>
-        <w:rPr>
-          <w:highlight w:val="yellow"/>
-        </w:rPr>
-        <w:t>supabase</w:t>
-      </w:r>
-      <w:proofErr w:type="spellEnd"/>
-      <w:r>
-        <w:rPr>
-          <w:highlight w:val="yellow"/>
-        </w:rPr>
-        <w:t>.</w:t>
+        <w:t>Ceux qui modifie en local puisse avoir la possibilité de travailler meme sans internet et synchroniser en cliquant sur le bouton synchroniser a</w:t>
+      </w:r>
+      <w:r>
+        <w:rPr>
+          <w:highlight w:val="yellow"/>
+        </w:rPr>
+        <w:t>fin que cela puisse pusher vers supabase.</w:t>
       </w:r>
       <w:r>
         <w:t xml:space="preserve"> </w:t>
@@ -197,21 +143,7 @@
         <w:rPr>
           <w:highlight w:val="yellow"/>
         </w:rPr>
-        <w:t xml:space="preserve">a </w:t>
-      </w:r>
-      <w:proofErr w:type="spellStart"/>
-      <w:r>
-        <w:rPr>
-          <w:highlight w:val="yellow"/>
-        </w:rPr>
-        <w:t>fenetre</w:t>
-      </w:r>
-      <w:proofErr w:type="spellEnd"/>
-      <w:r>
-        <w:rPr>
-          <w:highlight w:val="yellow"/>
-        </w:rPr>
-        <w:t xml:space="preserve"> d’approvisionnement</w:t>
+        <w:t>a fenetre d’approvisionnement</w:t>
       </w:r>
       <w:r>
         <w:rPr>
@@ -247,21 +179,7 @@
         <w:rPr>
           <w:highlight w:val="yellow"/>
         </w:rPr>
-        <w:t xml:space="preserve">Historique d’approvisionnement (pour avoir une trace de </w:t>
-      </w:r>
-      <w:proofErr w:type="gramStart"/>
-      <w:r>
-        <w:rPr>
-          <w:highlight w:val="yellow"/>
-        </w:rPr>
-        <w:t>tous les approvisionnement</w:t>
-      </w:r>
-      <w:proofErr w:type="gramEnd"/>
-      <w:r>
-        <w:rPr>
-          <w:highlight w:val="yellow"/>
-        </w:rPr>
-        <w:t xml:space="preserve"> fait)</w:t>
+        <w:t>Historique d’approvisionnement (pour avoir une trace de tous les approvisionnement fait)</w:t>
       </w:r>
     </w:p>
     <w:p>
@@ -279,64 +197,20 @@
         <w:rPr>
           <w:highlight w:val="yellow"/>
         </w:rPr>
-        <w:t xml:space="preserve">Enlever les 00 </w:t>
-      </w:r>
-      <w:proofErr w:type="spellStart"/>
-      <w:r>
-        <w:rPr>
-          <w:highlight w:val="yellow"/>
-        </w:rPr>
-        <w:t>apres</w:t>
-      </w:r>
-      <w:proofErr w:type="spellEnd"/>
-      <w:r>
-        <w:rPr>
-          <w:highlight w:val="yellow"/>
-        </w:rPr>
-        <w:t xml:space="preserve"> le chiffre, par exemple pour </w:t>
-      </w:r>
-      <w:proofErr w:type="gramStart"/>
-      <w:r>
-        <w:rPr>
-          <w:highlight w:val="yellow"/>
-        </w:rPr>
-        <w:t>une produit vendu</w:t>
-      </w:r>
-      <w:proofErr w:type="gramEnd"/>
-      <w:r>
-        <w:rPr>
-          <w:highlight w:val="yellow"/>
-        </w:rPr>
-        <w:t xml:space="preserve"> à 500fc, mettez seulement 500FC et 500.00FC. </w:t>
-      </w:r>
-      <w:proofErr w:type="gramStart"/>
-      <w:r>
-        <w:rPr>
-          <w:highlight w:val="yellow"/>
-        </w:rPr>
-        <w:t>aussi</w:t>
-      </w:r>
-      <w:proofErr w:type="gramEnd"/>
-      <w:r>
-        <w:rPr>
-          <w:highlight w:val="yellow"/>
-        </w:rPr>
-        <w:t xml:space="preserve"> la quantité d’approvisionnement, laissez la case vide et ne mettez pas 0 </w:t>
-      </w:r>
-      <w:r>
-        <w:rPr>
-          <w:highlight w:val="yellow"/>
-        </w:rPr>
-        <w:t xml:space="preserve">au </w:t>
-      </w:r>
-      <w:proofErr w:type="spellStart"/>
-      <w:r>
-        <w:rPr>
-          <w:highlight w:val="yellow"/>
-        </w:rPr>
-        <w:t>prealable</w:t>
-      </w:r>
-      <w:proofErr w:type="spellEnd"/>
+        <w:t>Enlever les 00 apres le chiffre, par exemple pour une produit vendu</w:t>
+      </w:r>
+      <w:r>
+        <w:rPr>
+          <w:highlight w:val="yellow"/>
+        </w:rPr>
+        <w:t xml:space="preserve"> à 500fc, mettez seulement 500FC et 500.00FC. aussi la quantité d’approvisionnement, laissez la case vide et ne mettez pas 0 </w:t>
+      </w:r>
+      <w:r>
+        <w:rPr>
+          <w:highlight w:val="yellow"/>
+        </w:rPr>
+        <w:t>au prealable</w:t>
+      </w:r>
       <w:r>
         <w:rPr>
           <w:highlight w:val="yellow"/>
@@ -395,21 +269,7 @@
         <w:rPr>
           <w:highlight w:val="yellow"/>
         </w:rPr>
-        <w:t xml:space="preserve">Dans la table produit, mettre cette </w:t>
-      </w:r>
-      <w:proofErr w:type="spellStart"/>
-      <w:r>
-        <w:rPr>
-          <w:highlight w:val="yellow"/>
-        </w:rPr>
-        <w:t>fenetre</w:t>
-      </w:r>
-      <w:proofErr w:type="spellEnd"/>
-      <w:r>
-        <w:rPr>
-          <w:highlight w:val="yellow"/>
-        </w:rPr>
-        <w:t xml:space="preserve"> comme le formulaire d’approvisionnement, </w:t>
+        <w:t xml:space="preserve">Dans la table produit, mettre cette fenetre comme le formulaire d’approvisionnement, </w:t>
       </w:r>
     </w:p>
     <w:p>
@@ -427,985 +287,325 @@
         <w:rPr>
           <w:highlight w:val="yellow"/>
         </w:rPr>
-        <w:t xml:space="preserve">La </w:t>
-      </w:r>
-      <w:proofErr w:type="spellStart"/>
-      <w:r>
-        <w:rPr>
-          <w:highlight w:val="yellow"/>
-        </w:rPr>
-        <w:t>fenetre</w:t>
-      </w:r>
-      <w:proofErr w:type="spellEnd"/>
-      <w:r>
-        <w:rPr>
-          <w:highlight w:val="yellow"/>
-        </w:rPr>
-        <w:t xml:space="preserve"> de </w:t>
-      </w:r>
-      <w:proofErr w:type="spellStart"/>
-      <w:r>
-        <w:rPr>
-          <w:highlight w:val="yellow"/>
-        </w:rPr>
-        <w:t>depenses</w:t>
-      </w:r>
-      <w:proofErr w:type="spellEnd"/>
-      <w:r>
-        <w:rPr>
-          <w:highlight w:val="yellow"/>
-        </w:rPr>
-        <w:t xml:space="preserve"> engagées</w:t>
-      </w:r>
-      <w:r>
-        <w:rPr>
-          <w:highlight w:val="yellow"/>
-        </w:rPr>
-        <w:t xml:space="preserve"> (elle doit avoir le </w:t>
-      </w:r>
-      <w:proofErr w:type="spellStart"/>
-      <w:r>
-        <w:rPr>
-          <w:highlight w:val="yellow"/>
-        </w:rPr>
-        <w:t>detail</w:t>
-      </w:r>
-      <w:proofErr w:type="spellEnd"/>
-      <w:r>
-        <w:rPr>
-          <w:highlight w:val="yellow"/>
-        </w:rPr>
-        <w:t xml:space="preserve">, nature de la </w:t>
-      </w:r>
-      <w:proofErr w:type="spellStart"/>
-      <w:r>
-        <w:rPr>
-          <w:highlight w:val="yellow"/>
-        </w:rPr>
-        <w:t>depense</w:t>
-      </w:r>
-      <w:proofErr w:type="spellEnd"/>
-      <w:r>
-        <w:rPr>
-          <w:highlight w:val="yellow"/>
-        </w:rPr>
-        <w:t>, montant, date,</w:t>
-      </w:r>
-      <w:r>
-        <w:rPr>
+        <w:t>La fenetre de depenses engagées</w:t>
+      </w:r>
+      <w:r>
+        <w:rPr>
+          <w:highlight w:val="yellow"/>
+        </w:rPr>
+        <w:t xml:space="preserve"> (elle doit avoir le detail, nature de la depense, montant, date,</w:t>
+      </w:r>
+      <w:r>
+        <w:rPr>
+          <w:highlight w:val="yellow"/>
+        </w:rPr>
+        <w:t xml:space="preserve"> quelle utilisateur, qui a approuvé le decaissement de l’argent</w:t>
+      </w:r>
+      <w:r>
+        <w:rPr>
+          <w:highlight w:val="yellow"/>
+        </w:rPr>
+        <w:t>, la depense va servir à quoi</w:t>
+      </w:r>
+      <w:r>
+        <w:rPr>
+          <w:highlight w:val="yellow"/>
+        </w:rPr>
+        <w:t xml:space="preserve">) et que cela </w:t>
+      </w:r>
+      <w:r>
+        <w:rPr>
+          <w:highlight w:val="yellow"/>
+        </w:rPr>
+        <w:t xml:space="preserve">puisse avoir un impacte déjà sur le montant vendu. </w:t>
+      </w:r>
+    </w:p>
+    <w:p>
+      <w:pPr>
+        <w:pStyle w:val="Paragraphedeliste"/>
+        <w:numPr>
+          <w:ilvl w:val="0"/>
+          <w:numId w:val="1"/>
+        </w:numPr>
+        <w:rPr>
+          <w:highlight w:val="yellow"/>
+        </w:rPr>
+      </w:pPr>
+      <w:r>
+        <w:rPr>
+          <w:highlight w:val="yellow"/>
+        </w:rPr>
+        <w:t>Une possibilité d’avoir des graphiques triable par date juste pour savoir combien j’ai fait entrer</w:t>
+      </w:r>
+      <w:r>
+        <w:rPr>
+          <w:highlight w:val="yellow"/>
+        </w:rPr>
+        <w:t xml:space="preserve"> pendant telle periode.</w:t>
+      </w:r>
+    </w:p>
+    <w:p>
+      <w:pPr>
+        <w:pStyle w:val="Paragraphedeliste"/>
+        <w:numPr>
+          <w:ilvl w:val="0"/>
+          <w:numId w:val="1"/>
+        </w:numPr>
+        <w:rPr>
+          <w:highlight w:val="yellow"/>
+        </w:rPr>
+      </w:pPr>
+      <w:r>
+        <w:rPr>
+          <w:highlight w:val="yellow"/>
+        </w:rPr>
+        <w:t>Dans la fenetre depense qu’il ait un bouton qui genere le rapport complet, combine de vente</w:t>
+      </w:r>
+      <w:r>
+        <w:rPr>
+          <w:highlight w:val="yellow"/>
+        </w:rPr>
+        <w:t xml:space="preserve"> par chaque produit, service fait, quelle depense avec ses details, et le solde</w:t>
+      </w:r>
+      <w:r>
+        <w:rPr>
+          <w:highlight w:val="yellow"/>
+        </w:rPr>
+        <w:t xml:space="preserve"> apres toutes les depenses</w:t>
+      </w:r>
+      <w:r>
+        <w:rPr>
+          <w:highlight w:val="yellow"/>
+        </w:rPr>
+        <w:t xml:space="preserve"> faites. </w:t>
+      </w:r>
+      <w:r>
+        <w:rPr>
+          <w:highlight w:val="yellow"/>
+        </w:rPr>
+        <w:t xml:space="preserve">qui montre toutes les actions faites (saisie impression, photocopie, scan, autre, vente fourniture, connexion internet, vente eau pure….) et que cela cree un total par service, si c’est saisie impression combien ? si c’est internet combien ?..., </w:t>
+      </w:r>
+    </w:p>
+    <w:p>
+      <w:pPr>
+        <w:pStyle w:val="Paragraphedeliste"/>
+        <w:numPr>
+          <w:ilvl w:val="0"/>
+          <w:numId w:val="1"/>
+        </w:numPr>
+      </w:pPr>
+      <w:r>
+        <w:rPr>
+          <w:highlight w:val="yellow"/>
+        </w:rPr>
+        <w:t>Bouton synchroniser ne fait aucune action</w:t>
+      </w:r>
+    </w:p>
+    <w:p>
+      <w:pPr>
+        <w:pStyle w:val="Paragraphedeliste"/>
+        <w:numPr>
+          <w:ilvl w:val="0"/>
+          <w:numId w:val="1"/>
+        </w:numPr>
+      </w:pPr>
+      <w:r>
+        <w:t>Dans la table historique approvisionnement je voulais savoir aussi l’utilisateur qui a faire la reappro</w:t>
+      </w:r>
+    </w:p>
+    <w:p>
+      <w:pPr>
+        <w:pStyle w:val="NormalWeb"/>
+        <w:numPr>
+          <w:ilvl w:val="0"/>
+          <w:numId w:val="1"/>
+        </w:numPr>
+        <w:rPr>
+          <w:rFonts w:asciiTheme="minorHAnsi" w:hAnsiTheme="minorHAnsi" w:cstheme="minorHAnsi"/>
+        </w:rPr>
+      </w:pPr>
+      <w:r>
+        <w:rPr>
+          <w:rFonts w:asciiTheme="minorHAnsi" w:hAnsiTheme="minorHAnsi" w:cstheme="minorHAnsi"/>
+        </w:rPr>
+        <w:t xml:space="preserve">on va encore retravailler pour rendre propre la facture et pas trop encombrante, </w:t>
+      </w:r>
+    </w:p>
+    <w:p>
+      <w:pPr>
+        <w:pStyle w:val="NormalWeb"/>
+        <w:numPr>
+          <w:ilvl w:val="0"/>
+          <w:numId w:val="1"/>
+        </w:numPr>
+        <w:rPr>
+          <w:rFonts w:asciiTheme="minorHAnsi" w:hAnsiTheme="minorHAnsi" w:cstheme="minorHAnsi"/>
+        </w:rPr>
+      </w:pPr>
+      <w:r>
+        <w:rPr>
+          <w:rFonts w:asciiTheme="minorHAnsi" w:hAnsiTheme="minorHAnsi" w:cstheme="minorHAnsi"/>
+        </w:rPr>
+        <w:t xml:space="preserve">aussi pour le raport financier des ventes et depense je ne veux pas avoir le nom de netlify en haut de la page et </w:t>
+      </w:r>
+    </w:p>
+    <w:p>
+      <w:pPr>
+        <w:pStyle w:val="NormalWeb"/>
+        <w:numPr>
+          <w:ilvl w:val="0"/>
+          <w:numId w:val="1"/>
+        </w:numPr>
+        <w:rPr>
+          <w:rFonts w:asciiTheme="minorHAnsi" w:hAnsiTheme="minorHAnsi" w:cstheme="minorHAnsi"/>
+        </w:rPr>
+      </w:pPr>
+      <w:r>
+        <w:rPr>
+          <w:rFonts w:asciiTheme="minorHAnsi" w:hAnsiTheme="minorHAnsi" w:cstheme="minorHAnsi"/>
+          <w:highlight w:val="yellow"/>
+        </w:rPr>
+        <w:t>ce rapport doit contenir les entête de la boutique, le logo et toutes les information</w:t>
+      </w:r>
+      <w:r>
+        <w:rPr>
+          <w:rFonts w:asciiTheme="minorHAnsi" w:hAnsiTheme="minorHAnsi" w:cstheme="minorHAnsi"/>
+        </w:rPr>
+        <w:t xml:space="preserve">. </w:t>
+      </w:r>
+    </w:p>
+    <w:p>
+      <w:pPr>
+        <w:pStyle w:val="NormalWeb"/>
+        <w:numPr>
+          <w:ilvl w:val="0"/>
+          <w:numId w:val="1"/>
+        </w:numPr>
+        <w:rPr>
+          <w:rFonts w:asciiTheme="minorHAnsi" w:hAnsiTheme="minorHAnsi" w:cstheme="minorHAnsi"/>
+          <w:highlight w:val="yellow"/>
+        </w:rPr>
+      </w:pPr>
+      <w:r>
+        <w:rPr>
+          <w:rFonts w:asciiTheme="minorHAnsi" w:hAnsiTheme="minorHAnsi" w:cstheme="minorHAnsi"/>
+          <w:highlight w:val="yellow"/>
+        </w:rPr>
+        <w:t xml:space="preserve">aussi dans </w:t>
+      </w:r>
+      <w:r>
+        <w:rPr>
+          <w:rFonts w:asciiTheme="minorHAnsi" w:hAnsiTheme="minorHAnsi" w:cstheme="minorHAnsi"/>
+          <w:highlight w:val="yellow"/>
+        </w:rPr>
+        <w:t>la zone</w:t>
+      </w:r>
+      <w:r>
+        <w:rPr>
+          <w:rFonts w:asciiTheme="minorHAnsi" w:hAnsiTheme="minorHAnsi" w:cstheme="minorHAnsi"/>
+          <w:highlight w:val="yellow"/>
+        </w:rPr>
+        <w:t xml:space="preserve"> resumé et interpretation commentair</w:t>
+      </w:r>
+      <w:r>
+        <w:rPr>
+          <w:rFonts w:asciiTheme="minorHAnsi" w:hAnsiTheme="minorHAnsi" w:cstheme="minorHAnsi"/>
+          <w:highlight w:val="yellow"/>
+        </w:rPr>
+        <w:t>e</w:t>
+      </w:r>
+      <w:r>
+        <w:rPr>
+          <w:rFonts w:asciiTheme="minorHAnsi" w:hAnsiTheme="minorHAnsi" w:cstheme="minorHAnsi"/>
+          <w:highlight w:val="yellow"/>
+        </w:rPr>
+        <w:t xml:space="preserve"> de ce rapport</w:t>
+      </w:r>
+      <w:r>
+        <w:rPr>
+          <w:rFonts w:asciiTheme="minorHAnsi" w:hAnsiTheme="minorHAnsi" w:cstheme="minorHAnsi"/>
+          <w:highlight w:val="yellow"/>
+        </w:rPr>
+        <w:t xml:space="preserve">, à la fin tu dois me donnez une conclusion comparative des activités s'il y a eu echec ou perte ou encore j'ai bien calibrer les depenses par rapport aux ventes. </w:t>
+      </w:r>
+    </w:p>
+    <w:p>
+      <w:pPr>
+        <w:pStyle w:val="NormalWeb"/>
+        <w:numPr>
+          <w:ilvl w:val="0"/>
+          <w:numId w:val="1"/>
+        </w:numPr>
+        <w:rPr>
+          <w:rFonts w:asciiTheme="minorHAnsi" w:hAnsiTheme="minorHAnsi" w:cstheme="minorHAnsi"/>
+        </w:rPr>
+      </w:pPr>
+      <w:r>
+        <w:rPr>
+          <w:rFonts w:asciiTheme="minorHAnsi" w:hAnsiTheme="minorHAnsi" w:cstheme="minorHAnsi"/>
+        </w:rPr>
+        <w:lastRenderedPageBreak/>
+        <w:t>Il y a une possibilité que le lien publié via netlify, que l’application</w:t>
+      </w:r>
+      <w:r>
+        <w:rPr>
+          <w:rFonts w:asciiTheme="minorHAnsi" w:hAnsiTheme="minorHAnsi" w:cstheme="minorHAnsi"/>
+        </w:rPr>
+        <w:t xml:space="preserve"> soit installable en cliquant sur le navigateur</w:t>
+      </w:r>
+    </w:p>
+    <w:p>
+      <w:pPr>
+        <w:pStyle w:val="NormalWeb"/>
+        <w:numPr>
+          <w:ilvl w:val="0"/>
+          <w:numId w:val="1"/>
+        </w:numPr>
+        <w:rPr>
+          <w:rFonts w:asciiTheme="minorHAnsi" w:hAnsiTheme="minorHAnsi" w:cstheme="minorHAnsi"/>
+          <w:highlight w:val="yellow"/>
+        </w:rPr>
+      </w:pPr>
+      <w:r>
+        <w:rPr>
+          <w:rFonts w:asciiTheme="minorHAnsi" w:hAnsiTheme="minorHAnsi" w:cstheme="minorHAnsi"/>
+          <w:highlight w:val="yellow"/>
+        </w:rPr>
+        <w:t>je voulais perfectionner l'action de backup et restauration. je peux venir faire une modification dans l'application pendant qu'elle est deja utlisé par un user, je serai obligé de desinstaller le .exe ancien pour installer le nouveau, là ses données deja enregistré seront peut etre perdu, comment faire pour faire une sauvegarde de toutes les données avant de desinstaller pour importer apres ? et que cela se mette bien automatique (toutes les ventes, produit, client et autres...)</w:t>
+      </w:r>
+    </w:p>
+    <w:p>
+      <w:pPr>
+        <w:pStyle w:val="NormalWeb"/>
+        <w:numPr>
+          <w:ilvl w:val="0"/>
+          <w:numId w:val="1"/>
+        </w:numPr>
+        <w:rPr>
+          <w:rFonts w:asciiTheme="minorHAnsi" w:hAnsiTheme="minorHAnsi" w:cstheme="minorHAnsi"/>
+          <w:highlight w:val="yellow"/>
+        </w:rPr>
+      </w:pPr>
+      <w:r>
+        <w:rPr>
+          <w:rFonts w:asciiTheme="minorHAnsi" w:hAnsiTheme="minorHAnsi" w:cstheme="minorHAnsi"/>
+          <w:highlight w:val="yellow"/>
+        </w:rPr>
+        <w:t>un administrateur ne peux faire toute action de suppression</w:t>
+      </w:r>
+      <w:r>
+        <w:rPr>
+          <w:rFonts w:asciiTheme="minorHAnsi" w:hAnsiTheme="minorHAnsi" w:cstheme="minorHAnsi"/>
           <w:highlight w:val="yellow"/>
         </w:rPr>
         <w:t xml:space="preserve"> </w:t>
       </w:r>
-      <w:proofErr w:type="gramStart"/>
-      <w:r>
-        <w:rPr>
-          <w:highlight w:val="yellow"/>
-        </w:rPr>
-        <w:t>quelle utilisateur</w:t>
-      </w:r>
-      <w:proofErr w:type="gramEnd"/>
-      <w:r>
-        <w:rPr>
-          <w:highlight w:val="yellow"/>
-        </w:rPr>
-        <w:t xml:space="preserve">, qui a approuvé le </w:t>
-      </w:r>
-      <w:proofErr w:type="spellStart"/>
-      <w:r>
-        <w:rPr>
-          <w:highlight w:val="yellow"/>
-        </w:rPr>
-        <w:t>decaissement</w:t>
-      </w:r>
-      <w:proofErr w:type="spellEnd"/>
-      <w:r>
-        <w:rPr>
-          <w:highlight w:val="yellow"/>
-        </w:rPr>
-        <w:t xml:space="preserve"> de l’argent</w:t>
-      </w:r>
-      <w:r>
-        <w:rPr>
-          <w:highlight w:val="yellow"/>
-        </w:rPr>
-        <w:t xml:space="preserve">, la </w:t>
-      </w:r>
-      <w:proofErr w:type="spellStart"/>
-      <w:r>
-        <w:rPr>
-          <w:highlight w:val="yellow"/>
-        </w:rPr>
-        <w:t>depense</w:t>
-      </w:r>
-      <w:proofErr w:type="spellEnd"/>
-      <w:r>
-        <w:rPr>
-          <w:highlight w:val="yellow"/>
-        </w:rPr>
-        <w:t xml:space="preserve"> va servir à quoi</w:t>
-      </w:r>
-      <w:r>
-        <w:rPr>
-          <w:highlight w:val="yellow"/>
-        </w:rPr>
-        <w:t xml:space="preserve">) et que cela </w:t>
-      </w:r>
-      <w:r>
-        <w:rPr>
-          <w:highlight w:val="yellow"/>
-        </w:rPr>
-        <w:t xml:space="preserve">puisse avoir un </w:t>
-      </w:r>
-      <w:proofErr w:type="spellStart"/>
-      <w:r>
-        <w:rPr>
-          <w:highlight w:val="yellow"/>
-        </w:rPr>
-        <w:t>impacte</w:t>
-      </w:r>
-      <w:proofErr w:type="spellEnd"/>
-      <w:r>
-        <w:rPr>
-          <w:highlight w:val="yellow"/>
-        </w:rPr>
-        <w:t xml:space="preserve"> déjà sur le montant vendu. </w:t>
-      </w:r>
-    </w:p>
-    <w:p>
-      <w:pPr>
-        <w:pStyle w:val="Paragraphedeliste"/>
-        <w:numPr>
-          <w:ilvl w:val="0"/>
-          <w:numId w:val="1"/>
-        </w:numPr>
-        <w:rPr>
-          <w:highlight w:val="yellow"/>
-        </w:rPr>
-      </w:pPr>
-      <w:r>
-        <w:rPr>
-          <w:highlight w:val="yellow"/>
-        </w:rPr>
-        <w:t xml:space="preserve">Une possibilité d’avoir des graphiques </w:t>
-      </w:r>
-      <w:proofErr w:type="spellStart"/>
-      <w:r>
-        <w:rPr>
-          <w:highlight w:val="yellow"/>
-        </w:rPr>
-        <w:t>triable</w:t>
-      </w:r>
-      <w:proofErr w:type="spellEnd"/>
-      <w:r>
-        <w:rPr>
-          <w:highlight w:val="yellow"/>
-        </w:rPr>
-        <w:t xml:space="preserve"> par date juste pour savoir combien j’ai fait entrer</w:t>
-      </w:r>
-      <w:r>
-        <w:rPr>
-          <w:highlight w:val="yellow"/>
-        </w:rPr>
-        <w:t xml:space="preserve"> pendant telle </w:t>
-      </w:r>
-      <w:proofErr w:type="spellStart"/>
-      <w:r>
-        <w:rPr>
-          <w:highlight w:val="yellow"/>
-        </w:rPr>
-        <w:t>periode</w:t>
-      </w:r>
-      <w:proofErr w:type="spellEnd"/>
-      <w:r>
-        <w:rPr>
-          <w:highlight w:val="yellow"/>
-        </w:rPr>
-        <w:t>.</w:t>
-      </w:r>
-    </w:p>
-    <w:p>
-      <w:pPr>
-        <w:pStyle w:val="Paragraphedeliste"/>
-        <w:numPr>
-          <w:ilvl w:val="0"/>
-          <w:numId w:val="1"/>
-        </w:numPr>
-        <w:rPr>
-          <w:highlight w:val="yellow"/>
-        </w:rPr>
-      </w:pPr>
-      <w:r>
-        <w:rPr>
-          <w:highlight w:val="yellow"/>
-        </w:rPr>
-        <w:t xml:space="preserve">Dans la </w:t>
-      </w:r>
-      <w:proofErr w:type="spellStart"/>
-      <w:r>
-        <w:rPr>
-          <w:highlight w:val="yellow"/>
-        </w:rPr>
-        <w:t>fenetre</w:t>
-      </w:r>
-      <w:proofErr w:type="spellEnd"/>
-      <w:r>
-        <w:rPr>
-          <w:highlight w:val="yellow"/>
-        </w:rPr>
-        <w:t xml:space="preserve"> </w:t>
-      </w:r>
-      <w:proofErr w:type="spellStart"/>
-      <w:r>
-        <w:rPr>
-          <w:highlight w:val="yellow"/>
-        </w:rPr>
-        <w:t>depense</w:t>
-      </w:r>
-      <w:proofErr w:type="spellEnd"/>
-      <w:r>
-        <w:rPr>
-          <w:highlight w:val="yellow"/>
-        </w:rPr>
-        <w:t xml:space="preserve"> qu’il ait un bouton qui </w:t>
-      </w:r>
-      <w:proofErr w:type="spellStart"/>
-      <w:r>
-        <w:rPr>
-          <w:highlight w:val="yellow"/>
-        </w:rPr>
-        <w:t>genere</w:t>
-      </w:r>
-      <w:proofErr w:type="spellEnd"/>
-      <w:r>
-        <w:rPr>
-          <w:highlight w:val="yellow"/>
-        </w:rPr>
-        <w:t xml:space="preserve"> le rapport complet, combine de vente</w:t>
-      </w:r>
-      <w:r>
-        <w:rPr>
-          <w:highlight w:val="yellow"/>
-        </w:rPr>
-        <w:t xml:space="preserve"> par chaque produit, service fait, quelle </w:t>
-      </w:r>
-      <w:proofErr w:type="spellStart"/>
-      <w:r>
-        <w:rPr>
-          <w:highlight w:val="yellow"/>
-        </w:rPr>
-        <w:t>depense</w:t>
-      </w:r>
-      <w:proofErr w:type="spellEnd"/>
-      <w:r>
-        <w:rPr>
-          <w:highlight w:val="yellow"/>
-        </w:rPr>
-        <w:t xml:space="preserve"> avec ses </w:t>
-      </w:r>
-      <w:proofErr w:type="spellStart"/>
-      <w:r>
-        <w:rPr>
-          <w:highlight w:val="yellow"/>
-        </w:rPr>
-        <w:t>details</w:t>
-      </w:r>
-      <w:proofErr w:type="spellEnd"/>
-      <w:r>
-        <w:rPr>
-          <w:highlight w:val="yellow"/>
-        </w:rPr>
-        <w:t>, et le solde</w:t>
-      </w:r>
-      <w:r>
-        <w:rPr>
-          <w:highlight w:val="yellow"/>
-        </w:rPr>
-        <w:t xml:space="preserve"> </w:t>
-      </w:r>
-      <w:proofErr w:type="spellStart"/>
-      <w:r>
-        <w:rPr>
-          <w:highlight w:val="yellow"/>
-        </w:rPr>
-        <w:t>apres</w:t>
-      </w:r>
-      <w:proofErr w:type="spellEnd"/>
-      <w:r>
-        <w:rPr>
-          <w:highlight w:val="yellow"/>
-        </w:rPr>
-        <w:t xml:space="preserve"> toutes les </w:t>
-      </w:r>
-      <w:proofErr w:type="spellStart"/>
-      <w:r>
-        <w:rPr>
-          <w:highlight w:val="yellow"/>
-        </w:rPr>
-        <w:t>depenses</w:t>
-      </w:r>
-      <w:proofErr w:type="spellEnd"/>
-      <w:r>
-        <w:rPr>
-          <w:highlight w:val="yellow"/>
-        </w:rPr>
-        <w:t xml:space="preserve"> faites. </w:t>
-      </w:r>
-      <w:proofErr w:type="gramStart"/>
-      <w:r>
-        <w:rPr>
-          <w:highlight w:val="yellow"/>
-        </w:rPr>
-        <w:t>qui</w:t>
-      </w:r>
-      <w:proofErr w:type="gramEnd"/>
-      <w:r>
-        <w:rPr>
-          <w:highlight w:val="yellow"/>
-        </w:rPr>
-        <w:t xml:space="preserve"> montre toutes les actions faites (saisie impression, photocopie, scan, autre, vente fourniture, connexion internet, vente eau </w:t>
-      </w:r>
-      <w:proofErr w:type="gramStart"/>
-      <w:r>
-        <w:rPr>
-          <w:highlight w:val="yellow"/>
-        </w:rPr>
-        <w:t>pure….</w:t>
-      </w:r>
-      <w:proofErr w:type="gramEnd"/>
-      <w:r>
-        <w:rPr>
-          <w:highlight w:val="yellow"/>
-        </w:rPr>
-        <w:t xml:space="preserve">) et que cela </w:t>
-      </w:r>
-      <w:proofErr w:type="spellStart"/>
-      <w:r>
-        <w:rPr>
-          <w:highlight w:val="yellow"/>
-        </w:rPr>
-        <w:t>cree</w:t>
-      </w:r>
-      <w:proofErr w:type="spellEnd"/>
-      <w:r>
-        <w:rPr>
-          <w:highlight w:val="yellow"/>
-        </w:rPr>
-        <w:t xml:space="preserve"> un total par service, si c’est saisie impression combien ? si c’est internet combien</w:t>
-      </w:r>
-      <w:proofErr w:type="gramStart"/>
-      <w:r>
-        <w:rPr>
-          <w:highlight w:val="yellow"/>
-        </w:rPr>
-        <w:t> ?...</w:t>
-      </w:r>
-      <w:proofErr w:type="gramEnd"/>
-      <w:r>
-        <w:rPr>
-          <w:highlight w:val="yellow"/>
-        </w:rPr>
-        <w:t xml:space="preserve">, </w:t>
-      </w:r>
-    </w:p>
-    <w:p>
-      <w:pPr>
-        <w:pStyle w:val="Paragraphedeliste"/>
-        <w:numPr>
-          <w:ilvl w:val="0"/>
-          <w:numId w:val="1"/>
-        </w:numPr>
-      </w:pPr>
-      <w:r>
-        <w:rPr>
-          <w:highlight w:val="yellow"/>
-        </w:rPr>
-        <w:t>Bouton synchroniser ne fait aucune action</w:t>
-      </w:r>
-    </w:p>
-    <w:p>
-      <w:pPr>
-        <w:pStyle w:val="Paragraphedeliste"/>
-        <w:numPr>
-          <w:ilvl w:val="0"/>
-          <w:numId w:val="1"/>
-        </w:numPr>
-      </w:pPr>
-      <w:r>
-        <w:t xml:space="preserve">Dans la table historique approvisionnement je voulais savoir aussi l’utilisateur qui </w:t>
-      </w:r>
-      <w:proofErr w:type="spellStart"/>
-      <w:r>
-        <w:t>a</w:t>
-      </w:r>
-      <w:proofErr w:type="spellEnd"/>
-      <w:r>
-        <w:t xml:space="preserve"> faire la </w:t>
-      </w:r>
-      <w:proofErr w:type="spellStart"/>
-      <w:r>
-        <w:t>reappro</w:t>
-      </w:r>
-      <w:proofErr w:type="spellEnd"/>
-    </w:p>
-    <w:p>
-      <w:pPr>
-        <w:pStyle w:val="NormalWeb"/>
-        <w:numPr>
-          <w:ilvl w:val="0"/>
-          <w:numId w:val="1"/>
-        </w:numPr>
+      <w:r>
         <w:rPr>
           <w:rFonts w:asciiTheme="minorHAnsi" w:hAnsiTheme="minorHAnsi" w:cstheme="minorHAnsi"/>
-        </w:rPr>
-      </w:pPr>
-      <w:proofErr w:type="gramStart"/>
-      <w:r>
-        <w:rPr>
-          <w:rFonts w:asciiTheme="minorHAnsi" w:hAnsiTheme="minorHAnsi" w:cstheme="minorHAnsi"/>
-        </w:rPr>
-        <w:t>on</w:t>
-      </w:r>
-      <w:proofErr w:type="gramEnd"/>
-      <w:r>
-        <w:rPr>
-          <w:rFonts w:asciiTheme="minorHAnsi" w:hAnsiTheme="minorHAnsi" w:cstheme="minorHAnsi"/>
-        </w:rPr>
-        <w:t xml:space="preserve"> va encore retravailler pour rendre propre la facture et pas trop encombrante, </w:t>
-      </w:r>
-    </w:p>
-    <w:p>
-      <w:pPr>
-        <w:pStyle w:val="NormalWeb"/>
-        <w:numPr>
-          <w:ilvl w:val="0"/>
-          <w:numId w:val="1"/>
-        </w:numPr>
-        <w:rPr>
-          <w:rFonts w:asciiTheme="minorHAnsi" w:hAnsiTheme="minorHAnsi" w:cstheme="minorHAnsi"/>
-        </w:rPr>
-      </w:pPr>
-      <w:proofErr w:type="gramStart"/>
-      <w:r>
-        <w:rPr>
-          <w:rFonts w:asciiTheme="minorHAnsi" w:hAnsiTheme="minorHAnsi" w:cstheme="minorHAnsi"/>
-        </w:rPr>
-        <w:t>aussi</w:t>
-      </w:r>
-      <w:proofErr w:type="gramEnd"/>
-      <w:r>
-        <w:rPr>
-          <w:rFonts w:asciiTheme="minorHAnsi" w:hAnsiTheme="minorHAnsi" w:cstheme="minorHAnsi"/>
-        </w:rPr>
-        <w:t xml:space="preserve"> pour le </w:t>
-      </w:r>
-      <w:proofErr w:type="spellStart"/>
-      <w:r>
-        <w:rPr>
-          <w:rFonts w:asciiTheme="minorHAnsi" w:hAnsiTheme="minorHAnsi" w:cstheme="minorHAnsi"/>
-        </w:rPr>
-        <w:t>raport</w:t>
-      </w:r>
-      <w:proofErr w:type="spellEnd"/>
-      <w:r>
-        <w:rPr>
-          <w:rFonts w:asciiTheme="minorHAnsi" w:hAnsiTheme="minorHAnsi" w:cstheme="minorHAnsi"/>
-        </w:rPr>
-        <w:t xml:space="preserve"> financier des ventes et </w:t>
-      </w:r>
-      <w:proofErr w:type="spellStart"/>
-      <w:r>
-        <w:rPr>
-          <w:rFonts w:asciiTheme="minorHAnsi" w:hAnsiTheme="minorHAnsi" w:cstheme="minorHAnsi"/>
-        </w:rPr>
-        <w:t>depense</w:t>
-      </w:r>
-      <w:proofErr w:type="spellEnd"/>
-      <w:r>
-        <w:rPr>
-          <w:rFonts w:asciiTheme="minorHAnsi" w:hAnsiTheme="minorHAnsi" w:cstheme="minorHAnsi"/>
-        </w:rPr>
-        <w:t xml:space="preserve"> je ne veux pas avoir le nom de </w:t>
-      </w:r>
-      <w:proofErr w:type="spellStart"/>
-      <w:r>
-        <w:rPr>
-          <w:rFonts w:asciiTheme="minorHAnsi" w:hAnsiTheme="minorHAnsi" w:cstheme="minorHAnsi"/>
-        </w:rPr>
-        <w:t>netlify</w:t>
-      </w:r>
-      <w:proofErr w:type="spellEnd"/>
-      <w:r>
-        <w:rPr>
-          <w:rFonts w:asciiTheme="minorHAnsi" w:hAnsiTheme="minorHAnsi" w:cstheme="minorHAnsi"/>
-        </w:rPr>
-        <w:t xml:space="preserve"> en haut de la page et </w:t>
-      </w:r>
-    </w:p>
-    <w:p>
-      <w:pPr>
-        <w:pStyle w:val="NormalWeb"/>
-        <w:numPr>
-          <w:ilvl w:val="0"/>
-          <w:numId w:val="1"/>
-        </w:numPr>
-        <w:rPr>
-          <w:rFonts w:asciiTheme="minorHAnsi" w:hAnsiTheme="minorHAnsi" w:cstheme="minorHAnsi"/>
-        </w:rPr>
-      </w:pPr>
-      <w:proofErr w:type="gramStart"/>
-      <w:r>
-        <w:rPr>
-          <w:rFonts w:asciiTheme="minorHAnsi" w:hAnsiTheme="minorHAnsi" w:cstheme="minorHAnsi"/>
-          <w:highlight w:val="yellow"/>
-        </w:rPr>
-        <w:t>ce</w:t>
-      </w:r>
-      <w:proofErr w:type="gramEnd"/>
-      <w:r>
-        <w:rPr>
-          <w:rFonts w:asciiTheme="minorHAnsi" w:hAnsiTheme="minorHAnsi" w:cstheme="minorHAnsi"/>
-          <w:highlight w:val="yellow"/>
-        </w:rPr>
-        <w:t xml:space="preserve"> rapport doit contenir </w:t>
-      </w:r>
-      <w:proofErr w:type="gramStart"/>
-      <w:r>
-        <w:rPr>
-          <w:rFonts w:asciiTheme="minorHAnsi" w:hAnsiTheme="minorHAnsi" w:cstheme="minorHAnsi"/>
-          <w:highlight w:val="yellow"/>
-        </w:rPr>
-        <w:t>les entête</w:t>
-      </w:r>
-      <w:proofErr w:type="gramEnd"/>
-      <w:r>
-        <w:rPr>
-          <w:rFonts w:asciiTheme="minorHAnsi" w:hAnsiTheme="minorHAnsi" w:cstheme="minorHAnsi"/>
-          <w:highlight w:val="yellow"/>
-        </w:rPr>
-        <w:t xml:space="preserve"> de la boutique, le logo et </w:t>
-      </w:r>
-      <w:proofErr w:type="gramStart"/>
-      <w:r>
-        <w:rPr>
-          <w:rFonts w:asciiTheme="minorHAnsi" w:hAnsiTheme="minorHAnsi" w:cstheme="minorHAnsi"/>
-          <w:highlight w:val="yellow"/>
-        </w:rPr>
-        <w:t>toutes les information</w:t>
-      </w:r>
-      <w:proofErr w:type="gramEnd"/>
-      <w:r>
-        <w:rPr>
-          <w:rFonts w:asciiTheme="minorHAnsi" w:hAnsiTheme="minorHAnsi" w:cstheme="minorHAnsi"/>
-        </w:rPr>
-        <w:t xml:space="preserve">. </w:t>
-      </w:r>
-    </w:p>
-    <w:p>
-      <w:pPr>
-        <w:pStyle w:val="NormalWeb"/>
-        <w:numPr>
-          <w:ilvl w:val="0"/>
-          <w:numId w:val="1"/>
-        </w:numPr>
-        <w:rPr>
-          <w:rFonts w:asciiTheme="minorHAnsi" w:hAnsiTheme="minorHAnsi" w:cstheme="minorHAnsi"/>
-          <w:highlight w:val="yellow"/>
-        </w:rPr>
-      </w:pPr>
-      <w:proofErr w:type="gramStart"/>
-      <w:r>
-        <w:rPr>
-          <w:rFonts w:asciiTheme="minorHAnsi" w:hAnsiTheme="minorHAnsi" w:cstheme="minorHAnsi"/>
-          <w:highlight w:val="yellow"/>
-        </w:rPr>
-        <w:t>aussi</w:t>
-      </w:r>
-      <w:proofErr w:type="gramEnd"/>
-      <w:r>
-        <w:rPr>
-          <w:rFonts w:asciiTheme="minorHAnsi" w:hAnsiTheme="minorHAnsi" w:cstheme="minorHAnsi"/>
-          <w:highlight w:val="yellow"/>
-        </w:rPr>
-        <w:t xml:space="preserve"> dans </w:t>
-      </w:r>
-      <w:r>
-        <w:rPr>
-          <w:rFonts w:asciiTheme="minorHAnsi" w:hAnsiTheme="minorHAnsi" w:cstheme="minorHAnsi"/>
-          <w:highlight w:val="yellow"/>
-        </w:rPr>
-        <w:t>la zone</w:t>
-      </w:r>
-      <w:r>
-        <w:rPr>
-          <w:rFonts w:asciiTheme="minorHAnsi" w:hAnsiTheme="minorHAnsi" w:cstheme="minorHAnsi"/>
-          <w:highlight w:val="yellow"/>
-        </w:rPr>
-        <w:t xml:space="preserve"> </w:t>
-      </w:r>
-      <w:proofErr w:type="spellStart"/>
-      <w:r>
-        <w:rPr>
-          <w:rFonts w:asciiTheme="minorHAnsi" w:hAnsiTheme="minorHAnsi" w:cstheme="minorHAnsi"/>
-          <w:highlight w:val="yellow"/>
-        </w:rPr>
-        <w:t>resumé</w:t>
-      </w:r>
-      <w:proofErr w:type="spellEnd"/>
-      <w:r>
-        <w:rPr>
-          <w:rFonts w:asciiTheme="minorHAnsi" w:hAnsiTheme="minorHAnsi" w:cstheme="minorHAnsi"/>
-          <w:highlight w:val="yellow"/>
-        </w:rPr>
-        <w:t xml:space="preserve"> et </w:t>
-      </w:r>
-      <w:proofErr w:type="spellStart"/>
-      <w:r>
-        <w:rPr>
-          <w:rFonts w:asciiTheme="minorHAnsi" w:hAnsiTheme="minorHAnsi" w:cstheme="minorHAnsi"/>
-          <w:highlight w:val="yellow"/>
-        </w:rPr>
-        <w:t>interpretation</w:t>
-      </w:r>
-      <w:proofErr w:type="spellEnd"/>
-      <w:r>
-        <w:rPr>
-          <w:rFonts w:asciiTheme="minorHAnsi" w:hAnsiTheme="minorHAnsi" w:cstheme="minorHAnsi"/>
-          <w:highlight w:val="yellow"/>
-        </w:rPr>
-        <w:t xml:space="preserve"> commentair</w:t>
-      </w:r>
-      <w:r>
-        <w:rPr>
-          <w:rFonts w:asciiTheme="minorHAnsi" w:hAnsiTheme="minorHAnsi" w:cstheme="minorHAnsi"/>
-          <w:highlight w:val="yellow"/>
-        </w:rPr>
-        <w:t>e</w:t>
-      </w:r>
-      <w:r>
-        <w:rPr>
-          <w:rFonts w:asciiTheme="minorHAnsi" w:hAnsiTheme="minorHAnsi" w:cstheme="minorHAnsi"/>
-          <w:highlight w:val="yellow"/>
-        </w:rPr>
-        <w:t xml:space="preserve"> de ce rapport</w:t>
-      </w:r>
-      <w:r>
-        <w:rPr>
-          <w:rFonts w:asciiTheme="minorHAnsi" w:hAnsiTheme="minorHAnsi" w:cstheme="minorHAnsi"/>
-          <w:highlight w:val="yellow"/>
-        </w:rPr>
-        <w:t xml:space="preserve">, à la fin tu dois me donnez une conclusion comparative des activités s'il y a eu </w:t>
-      </w:r>
-      <w:proofErr w:type="spellStart"/>
-      <w:r>
-        <w:rPr>
-          <w:rFonts w:asciiTheme="minorHAnsi" w:hAnsiTheme="minorHAnsi" w:cstheme="minorHAnsi"/>
-          <w:highlight w:val="yellow"/>
-        </w:rPr>
-        <w:t>echec</w:t>
-      </w:r>
-      <w:proofErr w:type="spellEnd"/>
-      <w:r>
-        <w:rPr>
-          <w:rFonts w:asciiTheme="minorHAnsi" w:hAnsiTheme="minorHAnsi" w:cstheme="minorHAnsi"/>
-          <w:highlight w:val="yellow"/>
-        </w:rPr>
-        <w:t xml:space="preserve"> ou perte ou encore j'ai bien </w:t>
-      </w:r>
-      <w:proofErr w:type="gramStart"/>
-      <w:r>
-        <w:rPr>
-          <w:rFonts w:asciiTheme="minorHAnsi" w:hAnsiTheme="minorHAnsi" w:cstheme="minorHAnsi"/>
-          <w:highlight w:val="yellow"/>
-        </w:rPr>
-        <w:t>calibrer</w:t>
-      </w:r>
-      <w:proofErr w:type="gramEnd"/>
-      <w:r>
-        <w:rPr>
-          <w:rFonts w:asciiTheme="minorHAnsi" w:hAnsiTheme="minorHAnsi" w:cstheme="minorHAnsi"/>
-          <w:highlight w:val="yellow"/>
-        </w:rPr>
-        <w:t xml:space="preserve"> les </w:t>
-      </w:r>
-      <w:proofErr w:type="spellStart"/>
-      <w:r>
-        <w:rPr>
-          <w:rFonts w:asciiTheme="minorHAnsi" w:hAnsiTheme="minorHAnsi" w:cstheme="minorHAnsi"/>
-          <w:highlight w:val="yellow"/>
-        </w:rPr>
-        <w:t>depenses</w:t>
-      </w:r>
-      <w:proofErr w:type="spellEnd"/>
-      <w:r>
-        <w:rPr>
-          <w:rFonts w:asciiTheme="minorHAnsi" w:hAnsiTheme="minorHAnsi" w:cstheme="minorHAnsi"/>
-          <w:highlight w:val="yellow"/>
-        </w:rPr>
-        <w:t xml:space="preserve"> par rapport aux ventes. </w:t>
-      </w:r>
-    </w:p>
-    <w:p>
-      <w:pPr>
-        <w:pStyle w:val="NormalWeb"/>
-        <w:numPr>
-          <w:ilvl w:val="0"/>
-          <w:numId w:val="1"/>
-        </w:numPr>
-        <w:rPr>
-          <w:rFonts w:asciiTheme="minorHAnsi" w:hAnsiTheme="minorHAnsi" w:cstheme="minorHAnsi"/>
-        </w:rPr>
-      </w:pPr>
-      <w:r>
-        <w:rPr>
-          <w:rFonts w:asciiTheme="minorHAnsi" w:hAnsiTheme="minorHAnsi" w:cstheme="minorHAnsi"/>
-        </w:rPr>
-        <w:lastRenderedPageBreak/>
-        <w:t xml:space="preserve">Il y a une possibilité que le lien publié via </w:t>
-      </w:r>
-      <w:proofErr w:type="spellStart"/>
-      <w:r>
-        <w:rPr>
-          <w:rFonts w:asciiTheme="minorHAnsi" w:hAnsiTheme="minorHAnsi" w:cstheme="minorHAnsi"/>
-        </w:rPr>
-        <w:t>netlify</w:t>
-      </w:r>
-      <w:proofErr w:type="spellEnd"/>
-      <w:r>
-        <w:rPr>
-          <w:rFonts w:asciiTheme="minorHAnsi" w:hAnsiTheme="minorHAnsi" w:cstheme="minorHAnsi"/>
-        </w:rPr>
-        <w:t>, que l’application</w:t>
-      </w:r>
-      <w:r>
-        <w:rPr>
-          <w:rFonts w:asciiTheme="minorHAnsi" w:hAnsiTheme="minorHAnsi" w:cstheme="minorHAnsi"/>
-        </w:rPr>
-        <w:t xml:space="preserve"> soit installable en cliquant sur le navigateur</w:t>
-      </w:r>
-    </w:p>
-    <w:p>
-      <w:pPr>
-        <w:pStyle w:val="NormalWeb"/>
-        <w:numPr>
-          <w:ilvl w:val="0"/>
-          <w:numId w:val="1"/>
-        </w:numPr>
-        <w:rPr>
-          <w:rFonts w:asciiTheme="minorHAnsi" w:hAnsiTheme="minorHAnsi" w:cstheme="minorHAnsi"/>
-          <w:highlight w:val="yellow"/>
-        </w:rPr>
-      </w:pPr>
-      <w:proofErr w:type="gramStart"/>
-      <w:r>
-        <w:rPr>
-          <w:rFonts w:asciiTheme="minorHAnsi" w:hAnsiTheme="minorHAnsi" w:cstheme="minorHAnsi"/>
-          <w:highlight w:val="yellow"/>
-        </w:rPr>
-        <w:t>je</w:t>
-      </w:r>
-      <w:proofErr w:type="gramEnd"/>
-      <w:r>
-        <w:rPr>
-          <w:rFonts w:asciiTheme="minorHAnsi" w:hAnsiTheme="minorHAnsi" w:cstheme="minorHAnsi"/>
-          <w:highlight w:val="yellow"/>
-        </w:rPr>
-        <w:t xml:space="preserve"> voulais perfectionner l'action de backup et restauration. </w:t>
-      </w:r>
-      <w:proofErr w:type="gramStart"/>
-      <w:r>
-        <w:rPr>
-          <w:rFonts w:asciiTheme="minorHAnsi" w:hAnsiTheme="minorHAnsi" w:cstheme="minorHAnsi"/>
-          <w:highlight w:val="yellow"/>
-        </w:rPr>
-        <w:t>je</w:t>
-      </w:r>
-      <w:proofErr w:type="gramEnd"/>
-      <w:r>
-        <w:rPr>
-          <w:rFonts w:asciiTheme="minorHAnsi" w:hAnsiTheme="minorHAnsi" w:cstheme="minorHAnsi"/>
-          <w:highlight w:val="yellow"/>
-        </w:rPr>
-        <w:t xml:space="preserve"> peux venir faire une modification dans l'application pendant qu'elle est </w:t>
-      </w:r>
-      <w:proofErr w:type="spellStart"/>
-      <w:r>
-        <w:rPr>
-          <w:rFonts w:asciiTheme="minorHAnsi" w:hAnsiTheme="minorHAnsi" w:cstheme="minorHAnsi"/>
-          <w:highlight w:val="yellow"/>
-        </w:rPr>
-        <w:t>deja</w:t>
-      </w:r>
-      <w:proofErr w:type="spellEnd"/>
-      <w:r>
-        <w:rPr>
-          <w:rFonts w:asciiTheme="minorHAnsi" w:hAnsiTheme="minorHAnsi" w:cstheme="minorHAnsi"/>
-          <w:highlight w:val="yellow"/>
-        </w:rPr>
-        <w:t xml:space="preserve"> </w:t>
-      </w:r>
-      <w:proofErr w:type="spellStart"/>
-      <w:r>
-        <w:rPr>
-          <w:rFonts w:asciiTheme="minorHAnsi" w:hAnsiTheme="minorHAnsi" w:cstheme="minorHAnsi"/>
-          <w:highlight w:val="yellow"/>
-        </w:rPr>
-        <w:t>utlisé</w:t>
-      </w:r>
-      <w:proofErr w:type="spellEnd"/>
-      <w:r>
-        <w:rPr>
-          <w:rFonts w:asciiTheme="minorHAnsi" w:hAnsiTheme="minorHAnsi" w:cstheme="minorHAnsi"/>
-          <w:highlight w:val="yellow"/>
-        </w:rPr>
-        <w:t xml:space="preserve"> par un user, je serai obligé de </w:t>
-      </w:r>
-      <w:proofErr w:type="spellStart"/>
-      <w:r>
-        <w:rPr>
-          <w:rFonts w:asciiTheme="minorHAnsi" w:hAnsiTheme="minorHAnsi" w:cstheme="minorHAnsi"/>
-          <w:highlight w:val="yellow"/>
-        </w:rPr>
-        <w:t>desinstaller</w:t>
-      </w:r>
-      <w:proofErr w:type="spellEnd"/>
-      <w:r>
-        <w:rPr>
-          <w:rFonts w:asciiTheme="minorHAnsi" w:hAnsiTheme="minorHAnsi" w:cstheme="minorHAnsi"/>
-          <w:highlight w:val="yellow"/>
-        </w:rPr>
-        <w:t xml:space="preserve"> le .exe ancien pour installer le nouveau, là ses données </w:t>
-      </w:r>
-      <w:proofErr w:type="spellStart"/>
-      <w:r>
-        <w:rPr>
-          <w:rFonts w:asciiTheme="minorHAnsi" w:hAnsiTheme="minorHAnsi" w:cstheme="minorHAnsi"/>
-          <w:highlight w:val="yellow"/>
-        </w:rPr>
-        <w:t>deja</w:t>
-      </w:r>
-      <w:proofErr w:type="spellEnd"/>
-      <w:r>
-        <w:rPr>
-          <w:rFonts w:asciiTheme="minorHAnsi" w:hAnsiTheme="minorHAnsi" w:cstheme="minorHAnsi"/>
-          <w:highlight w:val="yellow"/>
-        </w:rPr>
-        <w:t xml:space="preserve"> enregistré seront peut </w:t>
-      </w:r>
-      <w:proofErr w:type="spellStart"/>
-      <w:r>
-        <w:rPr>
-          <w:rFonts w:asciiTheme="minorHAnsi" w:hAnsiTheme="minorHAnsi" w:cstheme="minorHAnsi"/>
-          <w:highlight w:val="yellow"/>
-        </w:rPr>
-        <w:t>etre</w:t>
-      </w:r>
-      <w:proofErr w:type="spellEnd"/>
-      <w:r>
-        <w:rPr>
-          <w:rFonts w:asciiTheme="minorHAnsi" w:hAnsiTheme="minorHAnsi" w:cstheme="minorHAnsi"/>
-          <w:highlight w:val="yellow"/>
-        </w:rPr>
-        <w:t xml:space="preserve"> perdu, comment faire pour faire une sauvegarde de toutes les données avant de </w:t>
-      </w:r>
-      <w:proofErr w:type="spellStart"/>
-      <w:r>
-        <w:rPr>
-          <w:rFonts w:asciiTheme="minorHAnsi" w:hAnsiTheme="minorHAnsi" w:cstheme="minorHAnsi"/>
-          <w:highlight w:val="yellow"/>
-        </w:rPr>
-        <w:t>desinstaller</w:t>
-      </w:r>
-      <w:proofErr w:type="spellEnd"/>
-      <w:r>
-        <w:rPr>
-          <w:rFonts w:asciiTheme="minorHAnsi" w:hAnsiTheme="minorHAnsi" w:cstheme="minorHAnsi"/>
-          <w:highlight w:val="yellow"/>
-        </w:rPr>
-        <w:t xml:space="preserve"> pour importer </w:t>
-      </w:r>
-      <w:proofErr w:type="spellStart"/>
-      <w:r>
-        <w:rPr>
-          <w:rFonts w:asciiTheme="minorHAnsi" w:hAnsiTheme="minorHAnsi" w:cstheme="minorHAnsi"/>
-          <w:highlight w:val="yellow"/>
-        </w:rPr>
-        <w:t>apres</w:t>
-      </w:r>
-      <w:proofErr w:type="spellEnd"/>
-      <w:r>
-        <w:rPr>
-          <w:rFonts w:asciiTheme="minorHAnsi" w:hAnsiTheme="minorHAnsi" w:cstheme="minorHAnsi"/>
-          <w:highlight w:val="yellow"/>
-        </w:rPr>
-        <w:t xml:space="preserve"> ? et que cela se mette bien automatique (toutes les ventes, produit, client et autres...)</w:t>
-      </w:r>
-    </w:p>
-    <w:p>
-      <w:pPr>
-        <w:pStyle w:val="NormalWeb"/>
-        <w:numPr>
-          <w:ilvl w:val="0"/>
-          <w:numId w:val="1"/>
-        </w:numPr>
-        <w:rPr>
-          <w:rFonts w:asciiTheme="minorHAnsi" w:hAnsiTheme="minorHAnsi" w:cstheme="minorHAnsi"/>
-          <w:highlight w:val="yellow"/>
-        </w:rPr>
-      </w:pPr>
-      <w:proofErr w:type="gramStart"/>
-      <w:r>
-        <w:rPr>
-          <w:rFonts w:asciiTheme="minorHAnsi" w:hAnsiTheme="minorHAnsi" w:cstheme="minorHAnsi"/>
-          <w:highlight w:val="yellow"/>
-        </w:rPr>
-        <w:t>un</w:t>
-      </w:r>
-      <w:proofErr w:type="gramEnd"/>
-      <w:r>
-        <w:rPr>
-          <w:rFonts w:asciiTheme="minorHAnsi" w:hAnsiTheme="minorHAnsi" w:cstheme="minorHAnsi"/>
-          <w:highlight w:val="yellow"/>
-        </w:rPr>
-        <w:t xml:space="preserve"> administrateur ne </w:t>
-      </w:r>
-      <w:proofErr w:type="gramStart"/>
-      <w:r>
-        <w:rPr>
-          <w:rFonts w:asciiTheme="minorHAnsi" w:hAnsiTheme="minorHAnsi" w:cstheme="minorHAnsi"/>
-          <w:highlight w:val="yellow"/>
-        </w:rPr>
-        <w:t>peux</w:t>
-      </w:r>
-      <w:proofErr w:type="gramEnd"/>
-      <w:r>
-        <w:rPr>
-          <w:rFonts w:asciiTheme="minorHAnsi" w:hAnsiTheme="minorHAnsi" w:cstheme="minorHAnsi"/>
-          <w:highlight w:val="yellow"/>
-        </w:rPr>
-        <w:t xml:space="preserve"> faire toute action de suppression</w:t>
-      </w:r>
-      <w:r>
-        <w:rPr>
-          <w:rFonts w:asciiTheme="minorHAnsi" w:hAnsiTheme="minorHAnsi" w:cstheme="minorHAnsi"/>
-          <w:highlight w:val="yellow"/>
-        </w:rPr>
-        <w:t xml:space="preserve"> </w:t>
-      </w:r>
-      <w:r>
-        <w:rPr>
-          <w:rFonts w:asciiTheme="minorHAnsi" w:hAnsiTheme="minorHAnsi" w:cstheme="minorHAnsi"/>
-          <w:highlight w:val="yellow"/>
-        </w:rPr>
-        <w:t>(</w:t>
-      </w:r>
-      <w:proofErr w:type="spellStart"/>
-      <w:r>
-        <w:rPr>
-          <w:rFonts w:asciiTheme="minorHAnsi" w:hAnsiTheme="minorHAnsi" w:cstheme="minorHAnsi"/>
-          <w:highlight w:val="yellow"/>
-        </w:rPr>
-        <w:t>pro</w:t>
+          <w:highlight w:val="yellow"/>
+        </w:rPr>
+        <w:t>(pro</w:t>
       </w:r>
       <w:ins w:id="0" w:author="Microsoft Word" w:date="2026-08-16T18:51:00Z" w16du:dateUtc="2026-08-16T16:51:00Z">
         <w:r>
@@ -1413,15 +613,7 @@
             <w:rFonts w:asciiTheme="minorHAnsi" w:hAnsiTheme="minorHAnsi" w:cstheme="minorHAnsi"/>
             <w:highlight w:val="yellow"/>
           </w:rPr>
-          <w:t>ni</w:t>
-        </w:r>
-        <w:proofErr w:type="spellEnd"/>
-        <w:r>
-          <w:rPr>
-            <w:rFonts w:asciiTheme="minorHAnsi" w:hAnsiTheme="minorHAnsi" w:cstheme="minorHAnsi"/>
-            <w:highlight w:val="yellow"/>
-          </w:rPr>
-          <w:t xml:space="preserve"> modification</w:t>
+          <w:t>ni modification</w:t>
         </w:r>
         <w:r>
           <w:rPr>
@@ -1435,23 +627,7 @@
             <w:rFonts w:asciiTheme="minorHAnsi" w:hAnsiTheme="minorHAnsi" w:cstheme="minorHAnsi"/>
             <w:highlight w:val="yellow"/>
           </w:rPr>
-          <w:t xml:space="preserve">duit, </w:t>
-        </w:r>
-        <w:proofErr w:type="gramStart"/>
-        <w:r>
-          <w:rPr>
-            <w:rFonts w:asciiTheme="minorHAnsi" w:hAnsiTheme="minorHAnsi" w:cstheme="minorHAnsi"/>
-            <w:highlight w:val="yellow"/>
-          </w:rPr>
-          <w:t>vente,…</w:t>
-        </w:r>
-        <w:proofErr w:type="gramEnd"/>
-        <w:r>
-          <w:rPr>
-            <w:rFonts w:asciiTheme="minorHAnsi" w:hAnsiTheme="minorHAnsi" w:cstheme="minorHAnsi"/>
-            <w:highlight w:val="yellow"/>
-          </w:rPr>
-          <w:t>.)</w:t>
+          <w:t>duit, vente,….)</w:t>
         </w:r>
       </w:ins>
     </w:p>
@@ -1467,7 +643,6 @@
           <w:highlight w:val="yellow"/>
         </w:rPr>
       </w:pPr>
-      <w:proofErr w:type="gramStart"/>
       <w:r>
         <w:rPr>
           <w:rFonts w:asciiTheme="minorHAnsi" w:hAnsiTheme="minorHAnsi" w:cstheme="minorHAnsi"/>
@@ -1482,7 +657,6 @@
         </w:rPr>
         <w:t>s</w:t>
       </w:r>
-      <w:proofErr w:type="gramEnd"/>
       <w:r>
         <w:rPr>
           <w:rFonts w:asciiTheme="minorHAnsi" w:hAnsiTheme="minorHAnsi" w:cstheme="minorHAnsi"/>
@@ -1516,39 +690,75 @@
           <w:rFonts w:asciiTheme="minorHAnsi" w:hAnsiTheme="minorHAnsi" w:cstheme="minorHAnsi"/>
           <w:highlight w:val="yellow"/>
         </w:rPr>
-        <w:t xml:space="preserve">vent </w:t>
-      </w:r>
-      <w:proofErr w:type="gramStart"/>
-      <w:r>
+        <w:t>vent quand à eux être modifié par les admin, qu’il y ait une possibilité de modifier la description ou le prix.</w:t>
+      </w:r>
+    </w:p>
+    <w:p>
+      <w:pPr>
+        <w:pStyle w:val="NormalWeb"/>
+        <w:numPr>
+          <w:ilvl w:val="0"/>
+          <w:numId w:val="1"/>
+        </w:numPr>
         <w:rPr>
           <w:rFonts w:asciiTheme="minorHAnsi" w:hAnsiTheme="minorHAnsi" w:cstheme="minorHAnsi"/>
           <w:highlight w:val="yellow"/>
         </w:rPr>
-        <w:t>quand</w:t>
-      </w:r>
-      <w:proofErr w:type="gramEnd"/>
+      </w:pPr>
       <w:r>
         <w:rPr>
           <w:rFonts w:asciiTheme="minorHAnsi" w:hAnsiTheme="minorHAnsi" w:cstheme="minorHAnsi"/>
           <w:highlight w:val="yellow"/>
         </w:rPr>
-        <w:t xml:space="preserve"> à eux être modifié par </w:t>
-      </w:r>
-      <w:proofErr w:type="gramStart"/>
+        <w:t>Ajoute une possibilité de supprimer l</w:t>
+      </w:r>
       <w:r>
         <w:rPr>
           <w:rFonts w:asciiTheme="minorHAnsi" w:hAnsiTheme="minorHAnsi" w:cstheme="minorHAnsi"/>
           <w:highlight w:val="yellow"/>
         </w:rPr>
-        <w:t>les admin</w:t>
-      </w:r>
-      <w:proofErr w:type="gramEnd"/>
-      <w:r>
+        <w:t>es clients ou modifier, seulement le superadmin peut le faire.</w:t>
+      </w:r>
+    </w:p>
+    <w:p>
+      <w:pPr>
+        <w:pStyle w:val="NormalWeb"/>
+        <w:numPr>
+          <w:ilvl w:val="0"/>
+          <w:numId w:val="1"/>
+        </w:numPr>
         <w:rPr>
           <w:rFonts w:asciiTheme="minorHAnsi" w:hAnsiTheme="minorHAnsi" w:cstheme="minorHAnsi"/>
           <w:highlight w:val="yellow"/>
         </w:rPr>
-        <w:t>, qu’il y ait une possibilité de modifier la description ou le prix.</w:t>
+      </w:pPr>
+      <w:r>
+        <w:rPr>
+          <w:rFonts w:asciiTheme="minorHAnsi" w:hAnsiTheme="minorHAnsi" w:cstheme="minorHAnsi"/>
+          <w:highlight w:val="yellow"/>
+        </w:rPr>
+        <w:t>Un admin</w:t>
+      </w:r>
+      <w:r>
+        <w:rPr>
+          <w:rFonts w:asciiTheme="minorHAnsi" w:hAnsiTheme="minorHAnsi" w:cstheme="minorHAnsi"/>
+          <w:highlight w:val="yellow"/>
+        </w:rPr>
+        <w:t>istrateur</w:t>
+      </w:r>
+      <w:r>
+        <w:rPr>
+          <w:rFonts w:asciiTheme="minorHAnsi" w:hAnsiTheme="minorHAnsi" w:cstheme="minorHAnsi"/>
+          <w:highlight w:val="yellow"/>
+        </w:rPr>
+        <w:t xml:space="preserve"> peut ajouter dans approvisionnement mais ne peux pas supprimer ni modifi</w:t>
+      </w:r>
+      <w:r>
+        <w:rPr>
+          <w:rFonts w:asciiTheme="minorHAnsi" w:hAnsiTheme="minorHAnsi" w:cstheme="minorHAnsi"/>
+          <w:highlight w:val="yellow"/>
+        </w:rPr>
+        <w:t>er</w:t>
       </w:r>
     </w:p>
     <w:p>
@@ -1559,187 +769,14 @@
           <w:numId w:val="1"/>
         </w:numPr>
         <w:rPr>
-          <w:rFonts w:asciiTheme="minorHAnsi" w:hAnsiTheme="minorHAnsi" w:cstheme="minorHAnsi"/>
-          <w:highlight w:val="yellow"/>
-        </w:rPr>
-      </w:pPr>
-      <w:r>
-        <w:rPr>
-          <w:rFonts w:asciiTheme="minorHAnsi" w:hAnsiTheme="minorHAnsi" w:cstheme="minorHAnsi"/>
-          <w:highlight w:val="yellow"/>
-        </w:rPr>
-        <w:t>Ajoute une possibilité de supprimer l</w:t>
-      </w:r>
-      <w:r>
-        <w:rPr>
-          <w:rFonts w:asciiTheme="minorHAnsi" w:hAnsiTheme="minorHAnsi" w:cstheme="minorHAnsi"/>
-          <w:highlight w:val="yellow"/>
-        </w:rPr>
-        <w:t xml:space="preserve">es clients ou modifier, seulement le </w:t>
-      </w:r>
-      <w:proofErr w:type="spellStart"/>
-      <w:r>
-        <w:rPr>
-          <w:rFonts w:asciiTheme="minorHAnsi" w:hAnsiTheme="minorHAnsi" w:cstheme="minorHAnsi"/>
-          <w:highlight w:val="yellow"/>
-        </w:rPr>
-        <w:t>superadmin</w:t>
-      </w:r>
-      <w:proofErr w:type="spellEnd"/>
-      <w:r>
-        <w:rPr>
-          <w:rFonts w:asciiTheme="minorHAnsi" w:hAnsiTheme="minorHAnsi" w:cstheme="minorHAnsi"/>
-          <w:highlight w:val="yellow"/>
-        </w:rPr>
-        <w:t xml:space="preserve"> peut le faire.</w:t>
-      </w:r>
-    </w:p>
-    <w:p>
-      <w:pPr>
-        <w:pStyle w:val="NormalWeb"/>
-        <w:numPr>
-          <w:ilvl w:val="0"/>
-          <w:numId w:val="1"/>
-        </w:numPr>
-        <w:rPr>
-          <w:rFonts w:asciiTheme="minorHAnsi" w:hAnsiTheme="minorHAnsi" w:cstheme="minorHAnsi"/>
-          <w:highlight w:val="yellow"/>
-        </w:rPr>
-      </w:pPr>
-      <w:r>
-        <w:rPr>
-          <w:rFonts w:asciiTheme="minorHAnsi" w:hAnsiTheme="minorHAnsi" w:cstheme="minorHAnsi"/>
-          <w:highlight w:val="yellow"/>
-        </w:rPr>
-        <w:t>Un admin</w:t>
-      </w:r>
-      <w:r>
-        <w:rPr>
-          <w:rFonts w:asciiTheme="minorHAnsi" w:hAnsiTheme="minorHAnsi" w:cstheme="minorHAnsi"/>
-          <w:highlight w:val="yellow"/>
-        </w:rPr>
-        <w:t>istrateur</w:t>
-      </w:r>
-      <w:r>
-        <w:rPr>
-          <w:rFonts w:asciiTheme="minorHAnsi" w:hAnsiTheme="minorHAnsi" w:cstheme="minorHAnsi"/>
-          <w:highlight w:val="yellow"/>
-        </w:rPr>
-        <w:t xml:space="preserve"> peut ajouter dans approvisionnement mais ne peux pas supprimer ni modifi</w:t>
-      </w:r>
-      <w:r>
-        <w:rPr>
-          <w:rFonts w:asciiTheme="minorHAnsi" w:hAnsiTheme="minorHAnsi" w:cstheme="minorHAnsi"/>
-          <w:highlight w:val="yellow"/>
-        </w:rPr>
-        <w:t>er</w:t>
-      </w:r>
-    </w:p>
-    <w:p>
-      <w:pPr>
-        <w:pStyle w:val="NormalWeb"/>
-        <w:numPr>
-          <w:ilvl w:val="0"/>
-          <w:numId w:val="1"/>
-        </w:numPr>
-      </w:pPr>
-      <w:proofErr w:type="gramStart"/>
-      <w:r>
-        <w:t>dans</w:t>
-      </w:r>
-      <w:proofErr w:type="gramEnd"/>
-      <w:r>
-        <w:t xml:space="preserve"> les </w:t>
-      </w:r>
-      <w:proofErr w:type="spellStart"/>
-      <w:r>
-        <w:t>depenses</w:t>
-      </w:r>
-      <w:proofErr w:type="spellEnd"/>
-      <w:r>
-        <w:t xml:space="preserve"> à générer, je voulais avoir la possibilité de choisir les </w:t>
-      </w:r>
-      <w:proofErr w:type="spellStart"/>
-      <w:r>
-        <w:t>periodes</w:t>
-      </w:r>
-      <w:proofErr w:type="spellEnd"/>
-      <w:r>
-        <w:t xml:space="preserve"> parce que la </w:t>
-      </w:r>
-      <w:proofErr w:type="spellStart"/>
-      <w:r>
-        <w:t>depense</w:t>
-      </w:r>
-      <w:proofErr w:type="spellEnd"/>
-      <w:r>
-        <w:t xml:space="preserve"> </w:t>
-      </w:r>
-      <w:proofErr w:type="spellStart"/>
-      <w:r>
-        <w:t>encienne</w:t>
-      </w:r>
-      <w:proofErr w:type="spellEnd"/>
-      <w:r>
-        <w:t xml:space="preserve"> ne dois pas </w:t>
-      </w:r>
-      <w:proofErr w:type="gramStart"/>
-      <w:r>
-        <w:t>figuré</w:t>
-      </w:r>
-      <w:proofErr w:type="gramEnd"/>
-      <w:r>
-        <w:t xml:space="preserve"> dans le rapport du mois </w:t>
-      </w:r>
-      <w:proofErr w:type="spellStart"/>
-      <w:r>
-        <w:t>present</w:t>
-      </w:r>
-      <w:proofErr w:type="spellEnd"/>
-      <w:r>
-        <w:t>.</w:t>
-      </w:r>
-    </w:p>
-    <w:p>
-      <w:pPr>
-        <w:pStyle w:val="NormalWeb"/>
-        <w:numPr>
-          <w:ilvl w:val="0"/>
-          <w:numId w:val="1"/>
-        </w:numPr>
-        <w:rPr>
-          <w:color w:val="EE0000"/>
-          <w:highlight w:val="black"/>
-        </w:rPr>
-      </w:pPr>
-      <w:r>
-        <w:rPr>
-          <w:b/>
-          <w:bCs/>
-          <w:color w:val="EE0000"/>
-          <w:highlight w:val="black"/>
-        </w:rPr>
-        <w:t xml:space="preserve">Conflit </w:t>
-      </w:r>
-      <w:proofErr w:type="spellStart"/>
-      <w:r>
-        <w:rPr>
-          <w:b/>
-          <w:bCs/>
-          <w:color w:val="EE0000"/>
-          <w:highlight w:val="black"/>
-        </w:rPr>
-        <w:t>detecte</w:t>
-      </w:r>
-      <w:proofErr w:type="spellEnd"/>
-      <w:r>
-        <w:rPr>
-          <w:b/>
-          <w:bCs/>
-          <w:color w:val="EE0000"/>
-          <w:highlight w:val="black"/>
-        </w:rPr>
-        <w:t xml:space="preserve"> : le cloud et ce poste ont tous les deux des changements non synchronises.</w:t>
+          <w:highlight w:val="yellow"/>
+        </w:rPr>
+      </w:pPr>
+      <w:r>
+        <w:rPr>
+          <w:highlight w:val="yellow"/>
+        </w:rPr>
+        <w:t>dans les depenses à générer, je voulais avoir la possibilité de choisir les periodes parce que la depense encienne ne dois pas figuré dans le rapport du mois present.</w:t>
       </w:r>
     </w:p>
     <w:p>
@@ -1750,6 +787,7 @@
           <w:kern w:val="0"/>
           <w:sz w:val="24"/>
           <w:szCs w:val="24"/>
+          <w:highlight w:val="yellow"/>
           <w:lang w:eastAsia="fr-FR"/>
           <w14:ligatures w14:val="none"/>
         </w:rPr>
@@ -1760,6 +798,7 @@
           <w:kern w:val="0"/>
           <w:sz w:val="24"/>
           <w:szCs w:val="24"/>
+          <w:highlight w:val="yellow"/>
           <w:lang w:eastAsia="fr-FR"/>
           <w14:ligatures w14:val="none"/>
         </w:rPr>
@@ -1771,6 +810,7 @@
           <w:kern w:val="0"/>
           <w:sz w:val="24"/>
           <w:szCs w:val="24"/>
+          <w:highlight w:val="yellow"/>
           <w:lang w:eastAsia="fr-FR"/>
           <w14:ligatures w14:val="none"/>
         </w:rPr>
@@ -1789,6 +829,7 @@
           <w:kern w:val="0"/>
           <w:sz w:val="24"/>
           <w:szCs w:val="24"/>
+          <w:highlight w:val="yellow"/>
           <w:lang w:eastAsia="fr-FR"/>
           <w14:ligatures w14:val="none"/>
         </w:rPr>
@@ -1799,6 +840,7 @@
           <w:kern w:val="0"/>
           <w:sz w:val="24"/>
           <w:szCs w:val="24"/>
+          <w:highlight w:val="yellow"/>
           <w:lang w:eastAsia="fr-FR"/>
           <w14:ligatures w14:val="none"/>
         </w:rPr>
@@ -1810,6 +852,7 @@
           <w:kern w:val="0"/>
           <w:sz w:val="24"/>
           <w:szCs w:val="24"/>
+          <w:highlight w:val="yellow"/>
           <w:lang w:eastAsia="fr-FR"/>
           <w14:ligatures w14:val="none"/>
         </w:rPr>
@@ -1821,6 +864,7 @@
           <w:kern w:val="0"/>
           <w:sz w:val="20"/>
           <w:szCs w:val="20"/>
+          <w:highlight w:val="yellow"/>
           <w:lang w:eastAsia="fr-FR"/>
           <w14:ligatures w14:val="none"/>
         </w:rPr>
@@ -1832,6 +876,7 @@
           <w:kern w:val="0"/>
           <w:sz w:val="24"/>
           <w:szCs w:val="24"/>
+          <w:highlight w:val="yellow"/>
           <w:lang w:eastAsia="fr-FR"/>
           <w14:ligatures w14:val="none"/>
         </w:rPr>
@@ -1850,6 +895,7 @@
           <w:kern w:val="0"/>
           <w:sz w:val="24"/>
           <w:szCs w:val="24"/>
+          <w:highlight w:val="yellow"/>
           <w:lang w:eastAsia="fr-FR"/>
           <w14:ligatures w14:val="none"/>
         </w:rPr>
@@ -1860,6 +906,7 @@
           <w:kern w:val="0"/>
           <w:sz w:val="24"/>
           <w:szCs w:val="24"/>
+          <w:highlight w:val="yellow"/>
           <w:lang w:eastAsia="fr-FR"/>
           <w14:ligatures w14:val="none"/>
         </w:rPr>
@@ -1871,6 +918,7 @@
           <w:kern w:val="0"/>
           <w:sz w:val="24"/>
           <w:szCs w:val="24"/>
+          <w:highlight w:val="yellow"/>
           <w:lang w:eastAsia="fr-FR"/>
           <w14:ligatures w14:val="none"/>
         </w:rPr>
@@ -1882,6 +930,7 @@
           <w:kern w:val="0"/>
           <w:sz w:val="20"/>
           <w:szCs w:val="20"/>
+          <w:highlight w:val="yellow"/>
           <w:lang w:eastAsia="fr-FR"/>
           <w14:ligatures w14:val="none"/>
         </w:rPr>
@@ -1893,6 +942,7 @@
           <w:kern w:val="0"/>
           <w:sz w:val="24"/>
           <w:szCs w:val="24"/>
+          <w:highlight w:val="yellow"/>
           <w:lang w:eastAsia="fr-FR"/>
           <w14:ligatures w14:val="none"/>
         </w:rPr>
@@ -1911,6 +961,7 @@
           <w:kern w:val="0"/>
           <w:sz w:val="24"/>
           <w:szCs w:val="24"/>
+          <w:highlight w:val="yellow"/>
           <w:lang w:eastAsia="fr-FR"/>
           <w14:ligatures w14:val="none"/>
         </w:rPr>
@@ -1921,6 +972,7 @@
           <w:kern w:val="0"/>
           <w:sz w:val="24"/>
           <w:szCs w:val="24"/>
+          <w:highlight w:val="yellow"/>
           <w:lang w:eastAsia="fr-FR"/>
           <w14:ligatures w14:val="none"/>
         </w:rPr>
@@ -1932,6 +984,7 @@
           <w:kern w:val="0"/>
           <w:sz w:val="24"/>
           <w:szCs w:val="24"/>
+          <w:highlight w:val="yellow"/>
           <w:lang w:eastAsia="fr-FR"/>
           <w14:ligatures w14:val="none"/>
         </w:rPr>
@@ -1943,6 +996,7 @@
           <w:kern w:val="0"/>
           <w:sz w:val="20"/>
           <w:szCs w:val="20"/>
+          <w:highlight w:val="yellow"/>
           <w:lang w:eastAsia="fr-FR"/>
           <w14:ligatures w14:val="none"/>
         </w:rPr>
@@ -1961,6 +1015,7 @@
           <w:kern w:val="0"/>
           <w:sz w:val="24"/>
           <w:szCs w:val="24"/>
+          <w:highlight w:val="yellow"/>
           <w:lang w:eastAsia="fr-FR"/>
           <w14:ligatures w14:val="none"/>
         </w:rPr>
@@ -1971,6 +1026,7 @@
           <w:kern w:val="0"/>
           <w:sz w:val="24"/>
           <w:szCs w:val="24"/>
+          <w:highlight w:val="yellow"/>
           <w:lang w:eastAsia="fr-FR"/>
           <w14:ligatures w14:val="none"/>
         </w:rPr>
@@ -1982,6 +1038,7 @@
           <w:kern w:val="0"/>
           <w:sz w:val="24"/>
           <w:szCs w:val="24"/>
+          <w:highlight w:val="yellow"/>
           <w:lang w:eastAsia="fr-FR"/>
           <w14:ligatures w14:val="none"/>
         </w:rPr>
@@ -1993,6 +1050,7 @@
           <w:kern w:val="0"/>
           <w:sz w:val="20"/>
           <w:szCs w:val="20"/>
+          <w:highlight w:val="yellow"/>
           <w:lang w:eastAsia="fr-FR"/>
           <w14:ligatures w14:val="none"/>
         </w:rPr>
@@ -2004,6 +1062,7 @@
           <w:kern w:val="0"/>
           <w:sz w:val="24"/>
           <w:szCs w:val="24"/>
+          <w:highlight w:val="yellow"/>
           <w:lang w:eastAsia="fr-FR"/>
           <w14:ligatures w14:val="none"/>
         </w:rPr>
@@ -2012,15 +1071,7 @@
     </w:p>
     <w:p>
       <w:r>
-        <w:t xml:space="preserve">Affichage de </w:t>
-      </w:r>
-      <w:proofErr w:type="spellStart"/>
-      <w:r>
-        <w:t>fenetre</w:t>
-      </w:r>
-      <w:proofErr w:type="spellEnd"/>
-      <w:r>
-        <w:t xml:space="preserve"> par profil :</w:t>
+        <w:t>Affichage de fenetre par profil :</w:t>
       </w:r>
     </w:p>
     <w:p>
@@ -2061,54 +1112,35 @@
           <w:numId w:val="1"/>
         </w:numPr>
       </w:pPr>
-      <w:proofErr w:type="gramStart"/>
       <w:r>
         <w:t>La tablea</w:t>
       </w:r>
       <w:r>
-        <w:t>u</w:t>
-      </w:r>
-      <w:proofErr w:type="gramEnd"/>
-      <w:r>
-        <w:t xml:space="preserve"> qui montre les </w:t>
-      </w:r>
-      <w:proofErr w:type="spellStart"/>
-      <w:r>
-        <w:t>details</w:t>
-      </w:r>
-      <w:proofErr w:type="spellEnd"/>
-      <w:r>
-        <w:t xml:space="preserve"> de toutes les ventes et services fait durant une </w:t>
-      </w:r>
-      <w:proofErr w:type="spellStart"/>
-      <w:r>
-        <w:t>periode</w:t>
-      </w:r>
-      <w:proofErr w:type="spellEnd"/>
-      <w:r>
-        <w:t xml:space="preserve">, les </w:t>
-      </w:r>
-      <w:proofErr w:type="spellStart"/>
-      <w:r>
-        <w:t>grafiques</w:t>
-      </w:r>
-      <w:proofErr w:type="spellEnd"/>
-      <w:r>
-        <w:t>, les montants donc tous</w:t>
+        <w:t>u qui montre les details de toutes les ventes et services fait durant une periode</w:t>
+      </w:r>
+      <w:r>
+        <w:t>, les grafiques, les montants donc tous</w:t>
       </w:r>
       <w:r>
         <w:t>,</w:t>
       </w:r>
       <w:r>
-        <w:t xml:space="preserve"> ce qu’un simple </w:t>
-      </w:r>
-      <w:proofErr w:type="spellStart"/>
-      <w:r>
-        <w:t>Admnistrateur</w:t>
-      </w:r>
-      <w:proofErr w:type="spellEnd"/>
-      <w:r>
-        <w:t xml:space="preserve"> ne peut pas voir. </w:t>
+        <w:t xml:space="preserve"> ce qu’un simple Admnistrateur ne peut pas voir. </w:t>
+      </w:r>
+    </w:p>
+    <w:p>
+      <w:pPr>
+        <w:pStyle w:val="Paragraphedeliste"/>
+        <w:numPr>
+          <w:ilvl w:val="0"/>
+          <w:numId w:val="1"/>
+        </w:numPr>
+      </w:pPr>
+      <w:r>
+        <w:t xml:space="preserve">Met une possibilité de </w:t>
+      </w:r>
+      <w:r>
+        <w:t>visualiser le mot de passe à la page de connexion pour voir aumoins ce qu’on a saisi</w:t>
       </w:r>
     </w:p>
     <w:p/>
@@ -2122,21 +1154,8 @@
         </w:numPr>
       </w:pPr>
       <w:r>
-        <w:t xml:space="preserve">A la fin </w:t>
-      </w:r>
-      <w:proofErr w:type="spellStart"/>
-      <w:r>
-        <w:t>Deployer</w:t>
-      </w:r>
-      <w:proofErr w:type="spellEnd"/>
-      <w:r>
-        <w:t xml:space="preserve"> sur </w:t>
-      </w:r>
-      <w:proofErr w:type="spellStart"/>
-      <w:r>
-        <w:t>Netlify</w:t>
-      </w:r>
-      <w:proofErr w:type="spellEnd"/>
+        <w:t>A la fin Deployer sur Netlify</w:t>
+      </w:r>
     </w:p>
     <w:p>
       <w:pPr>
@@ -2162,45 +1181,8 @@
         </w:numPr>
         <w:shd w:val="clear" w:color="auto" w:fill="B4C6E7" w:themeFill="accent1" w:themeFillTint="66"/>
       </w:pPr>
-      <w:proofErr w:type="spellStart"/>
-      <w:r>
-        <w:t>supabase-schema.sql</w:t>
-      </w:r>
-      <w:proofErr w:type="spellEnd"/>
-      <w:r>
-        <w:t xml:space="preserve">, </w:t>
-      </w:r>
-      <w:proofErr w:type="spellStart"/>
-      <w:r>
-        <w:t>supabase-auth-migration.sql</w:t>
-      </w:r>
-      <w:proofErr w:type="spellEnd"/>
-      <w:r>
-        <w:t xml:space="preserve">, </w:t>
-      </w:r>
-      <w:proofErr w:type="spellStart"/>
-      <w:r>
-        <w:t>supabase</w:t>
-      </w:r>
-      <w:proofErr w:type="spellEnd"/>
-      <w:r>
-        <w:t>-audit-</w:t>
-      </w:r>
-      <w:proofErr w:type="spellStart"/>
-      <w:r>
-        <w:t>traceability</w:t>
-      </w:r>
-      <w:proofErr w:type="spellEnd"/>
-      <w:r>
-        <w:t>-</w:t>
-      </w:r>
-      <w:proofErr w:type="spellStart"/>
-      <w:r>
-        <w:t>migration.sql</w:t>
-      </w:r>
-      <w:proofErr w:type="spellEnd"/>
-      <w:r>
-        <w:t xml:space="preserve"> exécutés</w:t>
+      <w:r>
+        <w:t>supabase-schema.sql, supabase-auth-migration.sql, supabase-audit-traceability-migration.sql exécutés</w:t>
       </w:r>
     </w:p>
     <w:p>
@@ -2211,63 +1193,8 @@
         </w:numPr>
         <w:shd w:val="clear" w:color="auto" w:fill="B4C6E7" w:themeFill="accent1" w:themeFillTint="66"/>
       </w:pPr>
-      <w:proofErr w:type="gramStart"/>
-      <w:r>
-        <w:t>la</w:t>
-      </w:r>
-      <w:proofErr w:type="gramEnd"/>
-      <w:r>
-        <w:t xml:space="preserve"> fonction </w:t>
-      </w:r>
-      <w:proofErr w:type="spellStart"/>
-      <w:r>
-        <w:t>touch_last_</w:t>
-      </w:r>
-      <w:proofErr w:type="gramStart"/>
-      <w:r>
-        <w:t>login</w:t>
-      </w:r>
-      <w:proofErr w:type="spellEnd"/>
-      <w:r>
-        <w:t>(</w:t>
-      </w:r>
-      <w:proofErr w:type="gramEnd"/>
-      <w:r>
-        <w:t xml:space="preserve">) corrigée contient bien </w:t>
-      </w:r>
-      <w:proofErr w:type="spellStart"/>
-      <w:r>
-        <w:t>where</w:t>
-      </w:r>
-      <w:proofErr w:type="spellEnd"/>
-      <w:r>
-        <w:t xml:space="preserve"> </w:t>
-      </w:r>
-      <w:proofErr w:type="spellStart"/>
-      <w:proofErr w:type="gramStart"/>
-      <w:r>
-        <w:t>public.users</w:t>
-      </w:r>
-      <w:proofErr w:type="gramEnd"/>
-      <w:r>
-        <w:t>.auth_user_id</w:t>
-      </w:r>
-      <w:proofErr w:type="spellEnd"/>
-      <w:r>
-        <w:t xml:space="preserve"> = </w:t>
-      </w:r>
-      <w:proofErr w:type="spellStart"/>
-      <w:proofErr w:type="gramStart"/>
-      <w:r>
-        <w:t>auth.uid</w:t>
-      </w:r>
-      <w:proofErr w:type="spellEnd"/>
-      <w:r>
-        <w:t>(</w:t>
-      </w:r>
-      <w:proofErr w:type="gramEnd"/>
-      <w:r>
-        <w:t>)</w:t>
+      <w:r>
+        <w:t>la fonction touch_last_login() corrigée contient bien where public.users.auth_user_id = auth.uid()</w:t>
       </w:r>
     </w:p>
     <w:p>
@@ -2278,37 +1205,9 @@
         </w:numPr>
         <w:shd w:val="clear" w:color="auto" w:fill="B4C6E7" w:themeFill="accent1" w:themeFillTint="66"/>
       </w:pPr>
-      <w:proofErr w:type="gramStart"/>
-      <w:r>
-        <w:t>la</w:t>
-      </w:r>
-      <w:proofErr w:type="gramEnd"/>
-      <w:r>
-        <w:t xml:space="preserve"> table </w:t>
-      </w:r>
-      <w:proofErr w:type="spellStart"/>
-      <w:proofErr w:type="gramStart"/>
-      <w:r>
-        <w:t>public.users</w:t>
-      </w:r>
-      <w:proofErr w:type="spellEnd"/>
-      <w:proofErr w:type="gramEnd"/>
-      <w:r>
-        <w:t xml:space="preserve"> contient ton utilisateur avec le même e-mail que dans </w:t>
-      </w:r>
-      <w:proofErr w:type="spellStart"/>
-      <w:r>
-        <w:t>Authentication</w:t>
-      </w:r>
-      <w:proofErr w:type="spellEnd"/>
-      <w:r>
-        <w:t xml:space="preserve"> &gt; </w:t>
-      </w:r>
-      <w:proofErr w:type="spellStart"/>
-      <w:r>
-        <w:t>Users</w:t>
-      </w:r>
-      <w:proofErr w:type="spellEnd"/>
+      <w:r>
+        <w:t>la table public.users contient ton utilisateur avec le même e-mail que dans Authentication &gt; Users</w:t>
+      </w:r>
     </w:p>
     <w:p>
       <w:pPr>
@@ -2318,38 +1217,18 @@
         </w:numPr>
         <w:shd w:val="clear" w:color="auto" w:fill="B4C6E7" w:themeFill="accent1" w:themeFillTint="66"/>
       </w:pPr>
-      <w:proofErr w:type="gramStart"/>
       <w:r>
         <w:lastRenderedPageBreak/>
-        <w:t>ton</w:t>
-      </w:r>
-      <w:proofErr w:type="gramEnd"/>
-      <w:r>
-        <w:t xml:space="preserve"> utilisateur a </w:t>
-      </w:r>
-      <w:proofErr w:type="spellStart"/>
-      <w:r>
-        <w:t>role</w:t>
-      </w:r>
-      <w:proofErr w:type="spellEnd"/>
-      <w:r>
-        <w:t xml:space="preserve"> = 'Super admin' et active = </w:t>
-      </w:r>
-      <w:proofErr w:type="spellStart"/>
-      <w:r>
-        <w:t>true</w:t>
-      </w:r>
-      <w:proofErr w:type="spellEnd"/>
+        <w:t>ton utilisateur a role = 'Super admin' et active = true</w:t>
+      </w:r>
     </w:p>
     <w:p>
       <w:pPr>
         <w:shd w:val="clear" w:color="auto" w:fill="B4C6E7" w:themeFill="accent1" w:themeFillTint="66"/>
       </w:pPr>
-      <w:proofErr w:type="spellStart"/>
       <w:r>
         <w:t>Netlify</w:t>
       </w:r>
-      <w:proofErr w:type="spellEnd"/>
     </w:p>
     <w:p>
       <w:pPr>
@@ -2359,21 +1238,8 @@
         </w:numPr>
         <w:shd w:val="clear" w:color="auto" w:fill="B4C6E7" w:themeFill="accent1" w:themeFillTint="66"/>
       </w:pPr>
-      <w:proofErr w:type="gramStart"/>
-      <w:r>
-        <w:t>le</w:t>
-      </w:r>
-      <w:proofErr w:type="gramEnd"/>
-      <w:r>
-        <w:t xml:space="preserve"> dernier commit </w:t>
-      </w:r>
-      <w:proofErr w:type="gramStart"/>
-      <w:r>
-        <w:t>poussé</w:t>
-      </w:r>
-      <w:proofErr w:type="gramEnd"/>
-      <w:r>
-        <w:t xml:space="preserve"> sur main apparaît bien sur GitHub</w:t>
+      <w:r>
+        <w:t>le dernier commit poussé sur main apparaît bien sur GitHub</w:t>
       </w:r>
     </w:p>
     <w:p>
@@ -2384,27 +1250,9 @@
         </w:numPr>
         <w:shd w:val="clear" w:color="auto" w:fill="B4C6E7" w:themeFill="accent1" w:themeFillTint="66"/>
       </w:pPr>
-      <w:proofErr w:type="gramStart"/>
-      <w:r>
-        <w:t>le</w:t>
-      </w:r>
-      <w:proofErr w:type="gramEnd"/>
-      <w:r>
-        <w:t xml:space="preserve"> déploiement </w:t>
-      </w:r>
-      <w:proofErr w:type="spellStart"/>
-      <w:r>
-        <w:t>Netlify</w:t>
-      </w:r>
-      <w:proofErr w:type="spellEnd"/>
-      <w:r>
-        <w:t xml:space="preserve"> est passé en </w:t>
-      </w:r>
-      <w:proofErr w:type="spellStart"/>
-      <w:r>
-        <w:t>Published</w:t>
-      </w:r>
-      <w:proofErr w:type="spellEnd"/>
+      <w:r>
+        <w:t>le déploiement Netlify est passé en Published</w:t>
+      </w:r>
     </w:p>
     <w:p>
       <w:pPr>
@@ -2414,13 +1262,8 @@
         </w:numPr>
         <w:shd w:val="clear" w:color="auto" w:fill="B4C6E7" w:themeFill="accent1" w:themeFillTint="66"/>
       </w:pPr>
-      <w:proofErr w:type="gramStart"/>
-      <w:r>
-        <w:t>les</w:t>
-      </w:r>
-      <w:proofErr w:type="gramEnd"/>
-      <w:r>
-        <w:t xml:space="preserve"> variables VITE_SUPABASE_URL et VITE_SUPABASE_ANON_KEY sont bien configurées</w:t>
+      <w:r>
+        <w:t>les variables VITE_SUPABASE_URL et VITE_SUPABASE_ANON_KEY sont bien configurées</w:t>
       </w:r>
     </w:p>
     <w:p>
@@ -2431,31 +1274,16 @@
         </w:numPr>
         <w:shd w:val="clear" w:color="auto" w:fill="B4C6E7" w:themeFill="accent1" w:themeFillTint="66"/>
       </w:pPr>
-      <w:proofErr w:type="gramStart"/>
-      <w:r>
-        <w:t>la</w:t>
-      </w:r>
-      <w:proofErr w:type="gramEnd"/>
-      <w:r>
-        <w:t xml:space="preserve"> connexion web fonctionne avec ton compte </w:t>
-      </w:r>
-      <w:proofErr w:type="spellStart"/>
-      <w:r>
-        <w:t>Supabase</w:t>
-      </w:r>
-      <w:proofErr w:type="spellEnd"/>
+      <w:r>
+        <w:t>la connexion web fonctionne avec ton compte Supabase</w:t>
+      </w:r>
     </w:p>
     <w:p>
       <w:pPr>
         <w:shd w:val="clear" w:color="auto" w:fill="B4C6E7" w:themeFill="accent1" w:themeFillTint="66"/>
       </w:pPr>
-      <w:proofErr w:type="gramStart"/>
-      <w:r>
-        <w:t>desktop</w:t>
-      </w:r>
-      <w:proofErr w:type="gramEnd"/>
-      <w:r>
-        <w:t xml:space="preserve"> .exe</w:t>
+      <w:r>
+        <w:t>desktop .exe</w:t>
       </w:r>
     </w:p>
     <w:p>
@@ -2466,13 +1294,8 @@
         </w:numPr>
         <w:shd w:val="clear" w:color="auto" w:fill="B4C6E7" w:themeFill="accent1" w:themeFillTint="66"/>
       </w:pPr>
-      <w:proofErr w:type="gramStart"/>
-      <w:r>
-        <w:t>un</w:t>
-      </w:r>
-      <w:proofErr w:type="gramEnd"/>
-      <w:r>
-        <w:t xml:space="preserve"> nouvel .exe a été reconstruit après les changements</w:t>
+      <w:r>
+        <w:t>un nouvel .exe a été reconstruit après les changements</w:t>
       </w:r>
     </w:p>
     <w:p>
@@ -2483,19 +1306,9 @@
         </w:numPr>
         <w:shd w:val="clear" w:color="auto" w:fill="B4C6E7" w:themeFill="accent1" w:themeFillTint="66"/>
       </w:pPr>
-      <w:proofErr w:type="gramStart"/>
-      <w:r>
-        <w:t>avec</w:t>
-      </w:r>
-      <w:proofErr w:type="gramEnd"/>
-      <w:r>
-        <w:t xml:space="preserve"> internet, la connexion desktop fonctionne avec le compte </w:t>
-      </w:r>
-      <w:proofErr w:type="spellStart"/>
-      <w:r>
-        <w:t>Supabase</w:t>
-      </w:r>
-      <w:proofErr w:type="spellEnd"/>
+      <w:r>
+        <w:t>avec internet, la connexion desktop fonctionne avec le compte Supabase</w:t>
+      </w:r>
     </w:p>
     <w:p>
       <w:pPr>
@@ -2505,13 +1318,8 @@
         </w:numPr>
         <w:shd w:val="clear" w:color="auto" w:fill="B4C6E7" w:themeFill="accent1" w:themeFillTint="66"/>
       </w:pPr>
-      <w:proofErr w:type="gramStart"/>
-      <w:r>
-        <w:t>après</w:t>
-      </w:r>
-      <w:proofErr w:type="gramEnd"/>
-      <w:r>
-        <w:t xml:space="preserve"> cette première connexion, le même compte peut se reconnecter hors ligne</w:t>
+      <w:r>
+        <w:t>après cette première connexion, le même compte peut se reconnecter hors ligne</w:t>
       </w:r>
     </w:p>
     <w:p>
@@ -2522,21 +1330,8 @@
         </w:numPr>
         <w:shd w:val="clear" w:color="auto" w:fill="B4C6E7" w:themeFill="accent1" w:themeFillTint="66"/>
       </w:pPr>
-      <w:proofErr w:type="gramStart"/>
-      <w:r>
-        <w:t>la</w:t>
-      </w:r>
-      <w:proofErr w:type="gramEnd"/>
-      <w:r>
-        <w:t xml:space="preserve"> synchronisation desktop → </w:t>
-      </w:r>
-      <w:proofErr w:type="spellStart"/>
-      <w:r>
-        <w:t>Supabase</w:t>
-      </w:r>
-      <w:proofErr w:type="spellEnd"/>
-      <w:r>
-        <w:t xml:space="preserve"> fonctionne quand la connexion revient</w:t>
+      <w:r>
+        <w:t>la synchronisation desktop → Supabase fonctionne quand la connexion revient</w:t>
       </w:r>
     </w:p>
     <w:p>
@@ -2550,36 +1345,12 @@
     <w:p/>
     <w:p>
       <w:r>
-        <w:t xml:space="preserve">Alors la prochaine étape est </w:t>
-      </w:r>
-      <w:proofErr w:type="gramStart"/>
-      <w:r>
-        <w:t>simple:</w:t>
-      </w:r>
-      <w:proofErr w:type="gramEnd"/>
-      <w:r>
-        <w:t xml:space="preserve"> connecter ton dépôt GitHub à </w:t>
-      </w:r>
-      <w:proofErr w:type="spellStart"/>
-      <w:r>
-        <w:t>Netlify</w:t>
-      </w:r>
-      <w:proofErr w:type="spellEnd"/>
-      <w:r>
-        <w:t>.</w:t>
-      </w:r>
-    </w:p>
-    <w:p>
-      <w:r>
-        <w:t xml:space="preserve">Fais ceci dans </w:t>
-      </w:r>
-      <w:proofErr w:type="spellStart"/>
-      <w:r>
-        <w:t>Netlify</w:t>
-      </w:r>
-      <w:proofErr w:type="spellEnd"/>
-      <w:r>
-        <w:t xml:space="preserve"> :</w:t>
+        <w:t>Alors la prochaine étape est simple: connecter ton dépôt GitHub à Netlify.</w:t>
+      </w:r>
+    </w:p>
+    <w:p>
+      <w:r>
+        <w:t>Fais ceci dans Netlify :</w:t>
       </w:r>
     </w:p>
     <w:p>
@@ -2601,21 +1372,8 @@
         </w:numPr>
       </w:pPr>
       <w:r>
-        <w:t xml:space="preserve">Import an </w:t>
-      </w:r>
-      <w:proofErr w:type="spellStart"/>
-      <w:r>
-        <w:t>existing</w:t>
-      </w:r>
-      <w:proofErr w:type="spellEnd"/>
-      <w:r>
-        <w:t xml:space="preserve"> </w:t>
-      </w:r>
-      <w:proofErr w:type="spellStart"/>
-      <w:r>
-        <w:t>project</w:t>
-      </w:r>
-      <w:proofErr w:type="spellEnd"/>
+        <w:t>Import an existing project</w:t>
+      </w:r>
     </w:p>
     <w:p>
       <w:pPr>
@@ -2624,13 +1382,8 @@
           <w:numId w:val="5"/>
         </w:numPr>
       </w:pPr>
-      <w:proofErr w:type="gramStart"/>
-      <w:r>
-        <w:t>connecte</w:t>
-      </w:r>
-      <w:proofErr w:type="gramEnd"/>
-      <w:r>
-        <w:t xml:space="preserve"> GitHub</w:t>
+      <w:r>
+        <w:t>connecte GitHub</w:t>
       </w:r>
     </w:p>
     <w:p>
@@ -2640,21 +1393,8 @@
           <w:numId w:val="5"/>
         </w:numPr>
       </w:pPr>
-      <w:proofErr w:type="gramStart"/>
-      <w:r>
-        <w:t>choisis</w:t>
-      </w:r>
-      <w:proofErr w:type="gramEnd"/>
-      <w:r>
-        <w:t xml:space="preserve"> le dépôt </w:t>
-      </w:r>
-      <w:proofErr w:type="spellStart"/>
-      <w:r>
-        <w:t>walikaletoworldrt</w:t>
-      </w:r>
-      <w:proofErr w:type="spellEnd"/>
-      <w:r>
-        <w:t>-hue/Gestion-papeterie</w:t>
+      <w:r>
+        <w:t>choisis le dépôt walikaletoworldrt-hue/Gestion-papeterie</w:t>
       </w:r>
     </w:p>
     <w:p>
@@ -2664,13 +1404,8 @@
           <w:numId w:val="5"/>
         </w:numPr>
       </w:pPr>
-      <w:proofErr w:type="gramStart"/>
-      <w:r>
-        <w:t>vérifie</w:t>
-      </w:r>
-      <w:proofErr w:type="gramEnd"/>
-      <w:r>
-        <w:t xml:space="preserve"> les réglages :</w:t>
+      <w:r>
+        <w:t>vérifie les réglages :</w:t>
       </w:r>
     </w:p>
     <w:p>
@@ -2687,46 +1422,8 @@
         <w:rPr>
           <w:lang w:val="en-US"/>
         </w:rPr>
-        <w:t xml:space="preserve">Build </w:t>
-      </w:r>
-      <w:proofErr w:type="gramStart"/>
-      <w:r>
-        <w:rPr>
-          <w:lang w:val="en-US"/>
-        </w:rPr>
-        <w:t>command :</w:t>
-      </w:r>
-      <w:proofErr w:type="gramEnd"/>
-      <w:r>
-        <w:rPr>
-          <w:lang w:val="en-US"/>
-        </w:rPr>
-        <w:t xml:space="preserve"> </w:t>
-      </w:r>
-      <w:proofErr w:type="spellStart"/>
-      <w:r>
-        <w:rPr>
-          <w:lang w:val="en-US"/>
-        </w:rPr>
-        <w:t>npm</w:t>
-      </w:r>
-      <w:proofErr w:type="spellEnd"/>
-      <w:r>
-        <w:rPr>
-          <w:lang w:val="en-US"/>
-        </w:rPr>
-        <w:t xml:space="preserve"> run </w:t>
-      </w:r>
-      <w:proofErr w:type="spellStart"/>
-      <w:proofErr w:type="gramStart"/>
-      <w:r>
-        <w:rPr>
-          <w:lang w:val="en-US"/>
-        </w:rPr>
-        <w:t>build:renderer</w:t>
-      </w:r>
-      <w:proofErr w:type="spellEnd"/>
-      <w:proofErr w:type="gramEnd"/>
+        <w:t>Build command : npm run build:renderer</w:t>
+      </w:r>
     </w:p>
     <w:p>
       <w:pPr>
@@ -2735,19 +1432,9 @@
           <w:numId w:val="5"/>
         </w:numPr>
       </w:pPr>
-      <w:proofErr w:type="spellStart"/>
-      <w:r>
-        <w:t>Publish</w:t>
-      </w:r>
-      <w:proofErr w:type="spellEnd"/>
-      <w:r>
-        <w:t xml:space="preserve"> directory : </w:t>
-      </w:r>
-      <w:proofErr w:type="spellStart"/>
-      <w:r>
-        <w:t>dist</w:t>
-      </w:r>
-      <w:proofErr w:type="spellEnd"/>
+      <w:r>
+        <w:t>Publish directory : dist</w:t>
+      </w:r>
     </w:p>
     <w:p>
       <w:pPr>
@@ -2767,13 +1454,8 @@
           <w:numId w:val="5"/>
         </w:numPr>
       </w:pPr>
-      <w:proofErr w:type="gramStart"/>
-      <w:r>
-        <w:t>ajoute</w:t>
-      </w:r>
-      <w:proofErr w:type="gramEnd"/>
-      <w:r>
-        <w:t xml:space="preserve"> les variables d’environnement :</w:t>
+      <w:r>
+        <w:t>ajoute les variables d’environnement :</w:t>
       </w:r>
     </w:p>
     <w:p>
@@ -2805,13 +1487,8 @@
           <w:numId w:val="5"/>
         </w:numPr>
       </w:pPr>
-      <w:proofErr w:type="gramStart"/>
-      <w:r>
-        <w:t>lance</w:t>
-      </w:r>
-      <w:proofErr w:type="gramEnd"/>
-      <w:r>
-        <w:t xml:space="preserve"> le déploiement</w:t>
+      <w:r>
+        <w:t>lance le déploiement</w:t>
       </w:r>
     </w:p>
     <w:p>
@@ -2820,133 +1497,11 @@
           <w:lang w:val="en-US"/>
         </w:rPr>
       </w:pPr>
-      <w:proofErr w:type="spellStart"/>
       <w:r>
         <w:rPr>
           <w:lang w:val="en-US"/>
         </w:rPr>
-        <w:t>Ces</w:t>
-      </w:r>
-      <w:proofErr w:type="spellEnd"/>
-      <w:r>
-        <w:rPr>
-          <w:lang w:val="en-US"/>
-        </w:rPr>
-        <w:t xml:space="preserve"> </w:t>
-      </w:r>
-      <w:proofErr w:type="spellStart"/>
-      <w:r>
-        <w:rPr>
-          <w:lang w:val="en-US"/>
-        </w:rPr>
-        <w:t>réglages</w:t>
-      </w:r>
-      <w:proofErr w:type="spellEnd"/>
-      <w:r>
-        <w:rPr>
-          <w:lang w:val="en-US"/>
-        </w:rPr>
-        <w:t xml:space="preserve"> </w:t>
-      </w:r>
-      <w:proofErr w:type="spellStart"/>
-      <w:r>
-        <w:rPr>
-          <w:lang w:val="en-US"/>
-        </w:rPr>
-        <w:t>sont</w:t>
-      </w:r>
-      <w:proofErr w:type="spellEnd"/>
-      <w:r>
-        <w:rPr>
-          <w:lang w:val="en-US"/>
-        </w:rPr>
-        <w:t xml:space="preserve"> déjà </w:t>
-      </w:r>
-      <w:proofErr w:type="spellStart"/>
-      <w:r>
-        <w:rPr>
-          <w:lang w:val="en-US"/>
-        </w:rPr>
-        <w:t>cohérents</w:t>
-      </w:r>
-      <w:proofErr w:type="spellEnd"/>
-      <w:r>
-        <w:rPr>
-          <w:lang w:val="en-US"/>
-        </w:rPr>
-        <w:t xml:space="preserve"> avec [</w:t>
-      </w:r>
-      <w:proofErr w:type="spellStart"/>
-      <w:proofErr w:type="gramStart"/>
-      <w:r>
-        <w:rPr>
-          <w:lang w:val="en-US"/>
-        </w:rPr>
-        <w:t>netlify.toml</w:t>
-      </w:r>
-      <w:proofErr w:type="spellEnd"/>
-      <w:proofErr w:type="gramEnd"/>
-      <w:r>
-        <w:rPr>
-          <w:lang w:val="en-US"/>
-        </w:rPr>
-        <w:t xml:space="preserve"> (line 1</w:t>
-      </w:r>
-      <w:proofErr w:type="gramStart"/>
-      <w:r>
-        <w:rPr>
-          <w:lang w:val="en-US"/>
-        </w:rPr>
-        <w:t>)](</w:t>
-      </w:r>
-      <w:proofErr w:type="gramEnd"/>
-      <w:r>
-        <w:rPr>
-          <w:lang w:val="en-US"/>
-        </w:rPr>
-        <w:t>C:/Users/User/OneDrive/Projet Code/</w:t>
-      </w:r>
-      <w:proofErr w:type="spellStart"/>
-      <w:r>
-        <w:rPr>
-          <w:lang w:val="en-US"/>
-        </w:rPr>
-        <w:t>Walikale</w:t>
-      </w:r>
-      <w:proofErr w:type="spellEnd"/>
-      <w:r>
-        <w:rPr>
-          <w:lang w:val="en-US"/>
-        </w:rPr>
-        <w:t xml:space="preserve"> to world App/netlify.toml:1) et [NETLIFY_DEPLOYMENT.md (line 1</w:t>
-      </w:r>
-      <w:proofErr w:type="gramStart"/>
-      <w:r>
-        <w:rPr>
-          <w:lang w:val="en-US"/>
-        </w:rPr>
-        <w:t>)](</w:t>
-      </w:r>
-      <w:proofErr w:type="gramEnd"/>
-      <w:r>
-        <w:rPr>
-          <w:lang w:val="en-US"/>
-        </w:rPr>
-        <w:t>C:/Users/User/OneDrive/Projet Code/</w:t>
-      </w:r>
-      <w:proofErr w:type="spellStart"/>
-      <w:r>
-        <w:rPr>
-          <w:lang w:val="en-US"/>
-        </w:rPr>
-        <w:t>Walikale</w:t>
-      </w:r>
-      <w:proofErr w:type="spellEnd"/>
-      <w:r>
-        <w:rPr>
-          <w:lang w:val="en-US"/>
-        </w:rPr>
-        <w:t xml:space="preserve"> to world App/NETLIFY_DEPLOYMENT.md:1).</w:t>
+        <w:t>Ces réglages sont déjà cohérents avec [netlify.toml (line 1)](C:/Users/User/OneDrive/Projet Code/Walikale to world App/netlify.toml:1) et [NETLIFY_DEPLOYMENT.md (line 1)](C:/Users/User/OneDrive/Projet Code/Walikale to world App/NETLIFY_DEPLOYMENT.md:1).</w:t>
       </w:r>
     </w:p>
     <w:p>
@@ -2961,21 +1516,8 @@
           <w:numId w:val="6"/>
         </w:numPr>
       </w:pPr>
-      <w:proofErr w:type="gramStart"/>
-      <w:r>
-        <w:t>sur</w:t>
-      </w:r>
-      <w:proofErr w:type="gramEnd"/>
-      <w:r>
-        <w:t xml:space="preserve"> </w:t>
-      </w:r>
-      <w:proofErr w:type="spellStart"/>
-      <w:r>
-        <w:t>Netlify</w:t>
-      </w:r>
-      <w:proofErr w:type="spellEnd"/>
-      <w:r>
-        <w:t>, utilise bien les noms VITE_SUPABASE_URL et VITE_SUPABASE_ANON_KEY</w:t>
+      <w:r>
+        <w:t>sur Netlify, utilise bien les noms VITE_SUPABASE_URL et VITE_SUPABASE_ANON_KEY</w:t>
       </w:r>
     </w:p>
     <w:p>
@@ -2985,14 +1527,9 @@
           <w:numId w:val="6"/>
         </w:numPr>
       </w:pPr>
-      <w:proofErr w:type="gramStart"/>
       <w:r>
         <w:lastRenderedPageBreak/>
-        <w:t>pas</w:t>
-      </w:r>
-      <w:proofErr w:type="gramEnd"/>
-      <w:r>
-        <w:t xml:space="preserve"> NEXT_PUBLIC_*, car ton app est en Vite</w:t>
+        <w:t>pas NEXT_PUBLIC_*, car ton app est en Vite</w:t>
       </w:r>
     </w:p>
     <w:p>
@@ -3007,27 +1544,9 @@
           <w:numId w:val="7"/>
         </w:numPr>
       </w:pPr>
-      <w:proofErr w:type="gramStart"/>
-      <w:r>
-        <w:t>l’état</w:t>
-      </w:r>
-      <w:proofErr w:type="gramEnd"/>
-      <w:r>
-        <w:t xml:space="preserve"> du </w:t>
-      </w:r>
-      <w:proofErr w:type="spellStart"/>
-      <w:r>
-        <w:t>build</w:t>
-      </w:r>
-      <w:proofErr w:type="spellEnd"/>
-      <w:r>
-        <w:t xml:space="preserve"> </w:t>
-      </w:r>
-      <w:proofErr w:type="spellStart"/>
-      <w:r>
-        <w:t>Netlify</w:t>
-      </w:r>
-      <w:proofErr w:type="spellEnd"/>
+      <w:r>
+        <w:t>l’état du build Netlify</w:t>
+      </w:r>
     </w:p>
     <w:p>
       <w:pPr>
@@ -3036,13 +1555,8 @@
           <w:numId w:val="7"/>
         </w:numPr>
       </w:pPr>
-      <w:proofErr w:type="gramStart"/>
-      <w:r>
-        <w:t>et</w:t>
-      </w:r>
-      <w:proofErr w:type="gramEnd"/>
-      <w:r>
-        <w:t xml:space="preserve"> si tu veux, l’URL du site déployé</w:t>
+      <w:r>
+        <w:t>et si tu veux, l’URL du site déployé</w:t>
       </w:r>
     </w:p>
     <w:p>

</xml_diff>